<commit_message>
Adaptação da ResNet ao projeto principal e documentação de experimentos
</commit_message>
<xml_diff>
--- a/Documentation/Experimentos com ResNet-50.docx
+++ b/Documentation/Experimentos com ResNet-50.docx
@@ -121,6 +121,67 @@
       <w:pPr>
         <w:pStyle w:val="PargrafodaLista"/>
         <w:jc w:val="both"/>
+        <w:rPr>
+          <w:u w:val="single"/>
+        </w:rPr>
+      </w:pPr>
+      <w:r>
+        <w:rPr>
+          <w:b/>
+          <w:bCs/>
+          <w:u w:val="single"/>
+        </w:rPr>
+        <w:t xml:space="preserve">OBSERVAÇÃO: </w:t>
+      </w:r>
+      <w:r>
+        <w:rPr>
+          <w:u w:val="single"/>
+        </w:rPr>
+        <w:t xml:space="preserve">Este documento foi elaborado após a realização dos testes iniciais com a arquitetura </w:t>
+      </w:r>
+      <w:proofErr w:type="spellStart"/>
+      <w:r>
+        <w:rPr>
+          <w:u w:val="single"/>
+        </w:rPr>
+        <w:t>ViT.</w:t>
+      </w:r>
+      <w:proofErr w:type="spellEnd"/>
+      <w:r>
+        <w:rPr>
+          <w:u w:val="single"/>
+        </w:rPr>
+        <w:t xml:space="preserve"> Dessa forma, as técnicas e os conceitos previamente empregados são detalhados no documento </w:t>
+      </w:r>
+      <w:r>
+        <w:rPr>
+          <w:i/>
+          <w:iCs/>
+          <w:u w:val="single"/>
+        </w:rPr>
+        <w:t>“Experimentos com Vision Transformer.docx”</w:t>
+      </w:r>
+      <w:r>
+        <w:rPr>
+          <w:u w:val="single"/>
+        </w:rPr>
+        <w:t>, sendo apresentados aqui apenas por meio de citações.</w:t>
+      </w:r>
+    </w:p>
+    <w:p>
+      <w:pPr>
+        <w:pStyle w:val="PargrafodaLista"/>
+        <w:jc w:val="both"/>
+        <w:rPr>
+          <w:b/>
+          <w:bCs/>
+        </w:rPr>
+      </w:pPr>
+    </w:p>
+    <w:p>
+      <w:pPr>
+        <w:pStyle w:val="PargrafodaLista"/>
+        <w:jc w:val="both"/>
       </w:pPr>
       <w:r>
         <w:t>Conforme</w:t>
@@ -137,10 +198,7 @@
         <w:t xml:space="preserve">, </w:t>
       </w:r>
       <w:r>
-        <w:t>não</w:t>
-      </w:r>
-      <w:r>
-        <w:t xml:space="preserve"> vale a pena</w:t>
+        <w:t>não vale a pena</w:t>
       </w:r>
       <w:r>
         <w:rPr>
@@ -163,10 +221,7 @@
         <w:t xml:space="preserve">validação da </w:t>
       </w:r>
       <w:r>
-        <w:t>implementação sem que haja o cenário ideal para replicar os resultados.</w:t>
-      </w:r>
-      <w:r>
-        <w:t xml:space="preserve"> Como existem limitações atuais com o hardware utilizado, será conduzida apenas um teste de sanidade da implementação feita para a ResNet-50. Importante destacar que a construção da arquitetura buscou seguir fielmente às etapas descritas pelo artigo </w:t>
+        <w:t xml:space="preserve">implementação sem que haja o cenário ideal para replicar os resultados. Como existem limitações atuais com o hardware utilizado, será conduzida apenas um teste de sanidade da implementação feita para a ResNet-50. Importante destacar que a construção da arquitetura buscou seguir fielmente às etapas descritas pelo artigo </w:t>
       </w:r>
       <w:proofErr w:type="spellStart"/>
       <w:r>
@@ -301,10 +356,7 @@
         </w:rPr>
       </w:pPr>
       <w:r>
-        <w:t>O prazo está relativamente curto e se faz necessário otimizar o protocolo de experimentação para permitir a condução de novos testes e avaliações sem margem para perda de tempo</w:t>
-      </w:r>
-      <w:r>
-        <w:t>.</w:t>
+        <w:t>O prazo está relativamente curto e se faz necessário otimizar o protocolo de experimentação para permitir a condução de novos testes e avaliações sem margem para perda de tempo.</w:t>
       </w:r>
     </w:p>
     <w:p>
@@ -381,6 +433,43 @@
     <w:p>
       <w:pPr>
         <w:pStyle w:val="PargrafodaLista"/>
+        <w:numPr>
+          <w:ilvl w:val="1"/>
+          <w:numId w:val="2"/>
+        </w:numPr>
+        <w:jc w:val="both"/>
+        <w:rPr>
+          <w:b/>
+          <w:bCs/>
+        </w:rPr>
+      </w:pPr>
+      <w:r>
+        <w:rPr>
+          <w:color w:val="000000" w:themeColor="text1"/>
+        </w:rPr>
+        <w:t xml:space="preserve">O </w:t>
+      </w:r>
+      <w:r>
+        <w:rPr>
+          <w:color w:val="000000" w:themeColor="text1"/>
+        </w:rPr>
+        <w:t>Esse tipo de teste tem como finalidade verificar se a arquitetura, o pipeline de dados, o processo de otimização e o cálculo das métricas estão funcionando corretamente, sem erros numéricos, instabilidades ou inconsistências conceituais. Nesse contexto, métricas baixas são esperadas e não indicam falha.</w:t>
+      </w:r>
+    </w:p>
+    <w:p>
+      <w:pPr>
+        <w:pStyle w:val="PargrafodaLista"/>
+        <w:ind w:left="2160"/>
+        <w:jc w:val="both"/>
+        <w:rPr>
+          <w:b/>
+          <w:bCs/>
+        </w:rPr>
+      </w:pPr>
+    </w:p>
+    <w:p>
+      <w:pPr>
+        <w:pStyle w:val="PargrafodaLista"/>
         <w:ind w:left="1440"/>
         <w:jc w:val="both"/>
       </w:pPr>
@@ -413,7 +502,19 @@
         <w:t xml:space="preserve">STEP_PER_EPOCH = </w:t>
       </w:r>
       <w:r>
-        <w:t>(...) e EPOCHS = (...)</w:t>
+        <w:t>(</w:t>
+      </w:r>
+      <w:r>
+        <w:t>347</w:t>
+      </w:r>
+      <w:r>
+        <w:t>) e EPOCHS = (</w:t>
+      </w:r>
+      <w:r>
+        <w:t>5</w:t>
+      </w:r>
+      <w:r>
+        <w:t>)</w:t>
       </w:r>
     </w:p>
     <w:p>
@@ -461,11 +562,32 @@
         <w:pStyle w:val="PargrafodaLista"/>
         <w:ind w:left="1440"/>
         <w:jc w:val="both"/>
-        <w:rPr>
-          <w:b/>
-          <w:bCs/>
-        </w:rPr>
-      </w:pPr>
+      </w:pPr>
+    </w:p>
+    <w:p>
+      <w:pPr>
+        <w:pStyle w:val="PargrafodaLista"/>
+        <w:ind w:left="1440"/>
+        <w:jc w:val="both"/>
+      </w:pPr>
+      <w:r>
+        <w:rPr>
+          <w:b/>
+          <w:bCs/>
+        </w:rPr>
+        <w:t>OBSERVAÇÃO:</w:t>
+      </w:r>
+      <w:r>
+        <w:t xml:space="preserve"> A condução do teste de sanidade para esta arquitetura segue os mesmos moldes e protocolos adotados para a Vision </w:t>
+      </w:r>
+      <w:proofErr w:type="spellStart"/>
+      <w:r>
+        <w:t>Transformer</w:t>
+      </w:r>
+      <w:proofErr w:type="spellEnd"/>
+      <w:r>
+        <w:t>.</w:t>
+      </w:r>
     </w:p>
     <w:p>
       <w:pPr>
@@ -478,6 +600,7 @@
           <w:sz w:val="18"/>
           <w:szCs w:val="18"/>
         </w:rPr>
+        <w:lastRenderedPageBreak/>
         <w:t>Figura</w:t>
       </w:r>
       <w:r>
@@ -509,6 +632,9 @@
         <w:jc w:val="both"/>
       </w:pPr>
       <w:r>
+        <w:rPr>
+          <w:noProof/>
+        </w:rPr>
         <w:drawing>
           <wp:inline distT="0" distB="0" distL="0" distR="0" wp14:anchorId="3951E6C0" wp14:editId="2139D90A">
             <wp:extent cx="4099560" cy="2226219"/>
@@ -551,6 +677,13 @@
         <w:pStyle w:val="PargrafodaLista"/>
         <w:ind w:left="1440"/>
         <w:jc w:val="both"/>
+      </w:pPr>
+    </w:p>
+    <w:p>
+      <w:pPr>
+        <w:pStyle w:val="PargrafodaLista"/>
+        <w:ind w:left="1440"/>
+        <w:jc w:val="both"/>
         <w:rPr>
           <w:i/>
           <w:iCs/>
@@ -562,7 +695,6 @@
           <w:b/>
           <w:bCs/>
         </w:rPr>
-        <w:lastRenderedPageBreak/>
         <w:t>→ Resultados:</w:t>
       </w:r>
       <w:r>
@@ -647,7 +779,7 @@
           <w:iCs/>
           <w:color w:val="000000" w:themeColor="text1"/>
         </w:rPr>
-        <w:t>ResNet</w:t>
+        <w:t>Validation</w:t>
       </w:r>
       <w:proofErr w:type="spellEnd"/>
       <w:r>
@@ -665,7 +797,7 @@
           <w:iCs/>
           <w:color w:val="000000" w:themeColor="text1"/>
         </w:rPr>
-        <w:t>Sanity</w:t>
+        <w:t>ResNet</w:t>
       </w:r>
       <w:proofErr w:type="spellEnd"/>
       <w:r>
@@ -683,7 +815,7 @@
           <w:iCs/>
           <w:color w:val="000000" w:themeColor="text1"/>
         </w:rPr>
-        <w:t>Check</w:t>
+        <w:t>Sanity</w:t>
       </w:r>
       <w:proofErr w:type="spellEnd"/>
       <w:r>
@@ -692,7 +824,33 @@
           <w:iCs/>
           <w:color w:val="000000" w:themeColor="text1"/>
         </w:rPr>
-        <w:t xml:space="preserve"> - LOG.txt"</w:t>
+        <w:t xml:space="preserve"> </w:t>
+      </w:r>
+      <w:proofErr w:type="spellStart"/>
+      <w:r>
+        <w:rPr>
+          <w:i/>
+          <w:iCs/>
+          <w:color w:val="000000" w:themeColor="text1"/>
+        </w:rPr>
+        <w:t>Check</w:t>
+      </w:r>
+      <w:proofErr w:type="spellEnd"/>
+      <w:r>
+        <w:rPr>
+          <w:i/>
+          <w:iCs/>
+          <w:color w:val="000000" w:themeColor="text1"/>
+        </w:rPr>
+        <w:t xml:space="preserve"> - LOG</w:t>
+      </w:r>
+      <w:r>
+        <w:rPr>
+          <w:i/>
+          <w:iCs/>
+          <w:color w:val="000000" w:themeColor="text1"/>
+        </w:rPr>
+        <w:t>.txt"</w:t>
       </w:r>
     </w:p>
     <w:p>
@@ -701,8 +859,85 @@
         <w:ind w:left="1440"/>
         <w:jc w:val="both"/>
         <w:rPr>
-          <w:b/>
-          <w:bCs/>
+          <w:i/>
+          <w:iCs/>
+          <w:color w:val="000000" w:themeColor="text1"/>
+        </w:rPr>
+      </w:pPr>
+    </w:p>
+    <w:p>
+      <w:pPr>
+        <w:pStyle w:val="PargrafodaLista"/>
+        <w:ind w:left="1416"/>
+        <w:jc w:val="both"/>
+        <w:rPr>
+          <w:i/>
+          <w:iCs/>
+          <w:color w:val="000000" w:themeColor="text1"/>
+        </w:rPr>
+      </w:pPr>
+      <w:r>
+        <w:rPr>
+          <w:i/>
+          <w:iCs/>
+          <w:noProof/>
+          <w:color w:val="000000" w:themeColor="text1"/>
+        </w:rPr>
+        <w:drawing>
+          <wp:inline distT="0" distB="0" distL="0" distR="0" wp14:anchorId="4F0C7F41" wp14:editId="200DA3D6">
+            <wp:extent cx="4949648" cy="1211580"/>
+            <wp:effectExtent l="0" t="0" r="3810" b="7620"/>
+            <wp:docPr id="1696859281" name="Imagem 1"/>
+            <wp:cNvGraphicFramePr>
+              <a:graphicFrameLocks xmlns:a="http://schemas.openxmlformats.org/drawingml/2006/main" noChangeAspect="1"/>
+            </wp:cNvGraphicFramePr>
+            <a:graphic xmlns:a="http://schemas.openxmlformats.org/drawingml/2006/main">
+              <a:graphicData uri="http://schemas.openxmlformats.org/drawingml/2006/picture">
+                <pic:pic xmlns:pic="http://schemas.openxmlformats.org/drawingml/2006/picture">
+                  <pic:nvPicPr>
+                    <pic:cNvPr id="1696859281" name=""/>
+                    <pic:cNvPicPr/>
+                  </pic:nvPicPr>
+                  <pic:blipFill rotWithShape="1">
+                    <a:blip r:embed="rId7"/>
+                    <a:srcRect r="40671"/>
+                    <a:stretch>
+                      <a:fillRect/>
+                    </a:stretch>
+                  </pic:blipFill>
+                  <pic:spPr bwMode="auto">
+                    <a:xfrm>
+                      <a:off x="0" y="0"/>
+                      <a:ext cx="5009834" cy="1226312"/>
+                    </a:xfrm>
+                    <a:prstGeom prst="rect">
+                      <a:avLst/>
+                    </a:prstGeom>
+                    <a:ln>
+                      <a:noFill/>
+                    </a:ln>
+                    <a:extLst>
+                      <a:ext uri="{53640926-AAD7-44D8-BBD7-CCE9431645EC}">
+                        <a14:shadowObscured xmlns:a14="http://schemas.microsoft.com/office/drawing/2010/main"/>
+                      </a:ext>
+                    </a:extLst>
+                  </pic:spPr>
+                </pic:pic>
+              </a:graphicData>
+            </a:graphic>
+          </wp:inline>
+        </w:drawing>
+      </w:r>
+    </w:p>
+    <w:p>
+      <w:pPr>
+        <w:pStyle w:val="PargrafodaLista"/>
+        <w:ind w:left="1440"/>
+        <w:jc w:val="both"/>
+        <w:rPr>
+          <w:i/>
+          <w:iCs/>
+          <w:color w:val="000000" w:themeColor="text1"/>
         </w:rPr>
       </w:pPr>
     </w:p>
@@ -710,8 +945,8 @@
       <w:pPr>
         <w:pStyle w:val="PargrafodaLista"/>
         <w:numPr>
-          <w:ilvl w:val="1"/>
-          <w:numId w:val="2"/>
+          <w:ilvl w:val="0"/>
+          <w:numId w:val="18"/>
         </w:numPr>
         <w:jc w:val="both"/>
         <w:rPr>
@@ -722,7 +957,41 @@
         <w:rPr>
           <w:color w:val="000000" w:themeColor="text1"/>
         </w:rPr>
-        <w:t>O teste de</w:t>
+        <w:t>Na</w:t>
+      </w:r>
+      <w:r>
+        <w:rPr>
+          <w:color w:val="000000" w:themeColor="text1"/>
+        </w:rPr>
+        <w:t xml:space="preserve"> primeira época, a </w:t>
+      </w:r>
+      <w:proofErr w:type="spellStart"/>
+      <w:r>
+        <w:rPr>
+          <w:i/>
+          <w:iCs/>
+          <w:color w:val="000000" w:themeColor="text1"/>
+        </w:rPr>
+        <w:t>loss</w:t>
+      </w:r>
+      <w:proofErr w:type="spellEnd"/>
+      <w:r>
+        <w:rPr>
+          <w:color w:val="000000" w:themeColor="text1"/>
+        </w:rPr>
+        <w:t xml:space="preserve"> apresenta valor aproximado de 6.99, estabilizando em torno de 6.87 nas épocas s</w:t>
+      </w:r>
+      <w:r>
+        <w:rPr>
+          <w:color w:val="000000" w:themeColor="text1"/>
+        </w:rPr>
+        <w:t>eguintes</w:t>
+      </w:r>
+      <w:r>
+        <w:rPr>
+          <w:color w:val="000000" w:themeColor="text1"/>
+        </w:rPr>
+        <w:t>. Para um problema de classificação com 1000 classes, a perda teórica associada a uma predição aleatória é dada por log(1000) ≈ 6.907</w:t>
       </w:r>
       <w:r>
         <w:rPr>
@@ -730,53 +999,55 @@
         </w:rPr>
         <w:t xml:space="preserve"> </w:t>
       </w:r>
+      <w:r>
+        <w:rPr>
+          <w:i/>
+          <w:iCs/>
+          <w:color w:val="000000" w:themeColor="text1"/>
+        </w:rPr>
+        <w:t xml:space="preserve">(Ver explicação mais detalhada no teste de sanidade conduzido para a </w:t>
+      </w:r>
       <w:proofErr w:type="spellStart"/>
       <w:r>
         <w:rPr>
-          <w:color w:val="000000" w:themeColor="text1"/>
-        </w:rPr>
-        <w:t>sanity</w:t>
+          <w:i/>
+          <w:iCs/>
+          <w:color w:val="000000" w:themeColor="text1"/>
+        </w:rPr>
+        <w:t>ViT</w:t>
       </w:r>
       <w:proofErr w:type="spellEnd"/>
       <w:r>
         <w:rPr>
-          <w:color w:val="000000" w:themeColor="text1"/>
-        </w:rPr>
-        <w:t xml:space="preserve"> </w:t>
-      </w:r>
-      <w:proofErr w:type="spellStart"/>
-      <w:r>
-        <w:rPr>
-          <w:color w:val="000000" w:themeColor="text1"/>
-        </w:rPr>
-        <w:t>check</w:t>
-      </w:r>
-      <w:proofErr w:type="spellEnd"/>
-      <w:r>
-        <w:rPr>
-          <w:color w:val="000000" w:themeColor="text1"/>
-        </w:rPr>
-        <w:t xml:space="preserve"> serve para verificar</w:t>
-      </w:r>
-      <w:r>
-        <w:rPr>
-          <w:color w:val="000000" w:themeColor="text1"/>
-        </w:rPr>
-        <w:t xml:space="preserve"> e garantir o comportamento esperado do treinamento. No teste conduzido, os resultados estão em conformidade com o seguinte checklist</w:t>
-      </w:r>
-      <w:r>
-        <w:rPr>
-          <w:color w:val="000000" w:themeColor="text1"/>
-        </w:rPr>
-        <w:t>:</w:t>
-      </w:r>
+          <w:i/>
+          <w:iCs/>
+          <w:color w:val="000000" w:themeColor="text1"/>
+        </w:rPr>
+        <w:t>)</w:t>
+      </w:r>
+      <w:r>
+        <w:rPr>
+          <w:color w:val="000000" w:themeColor="text1"/>
+        </w:rPr>
+        <w:t>. Portanto, os valores observados estão extremamente próximos do comportamento esperado para um modelo inicialmente não treinado, com uma leve redução ao longo das épocas.</w:t>
+      </w:r>
+    </w:p>
+    <w:p>
+      <w:pPr>
+        <w:pStyle w:val="PargrafodaLista"/>
+        <w:ind w:left="2160"/>
+        <w:jc w:val="both"/>
+        <w:rPr>
+          <w:color w:val="000000" w:themeColor="text1"/>
+        </w:rPr>
+      </w:pPr>
     </w:p>
     <w:p>
       <w:pPr>
         <w:pStyle w:val="PargrafodaLista"/>
         <w:numPr>
-          <w:ilvl w:val="1"/>
-          <w:numId w:val="14"/>
+          <w:ilvl w:val="0"/>
+          <w:numId w:val="18"/>
         </w:numPr>
         <w:jc w:val="both"/>
         <w:rPr>
@@ -787,45 +1058,134 @@
         <w:rPr>
           <w:color w:val="000000" w:themeColor="text1"/>
         </w:rPr>
-        <w:t>O loop de treino funciona</w:t>
-      </w:r>
-      <w:r>
-        <w:rPr>
-          <w:color w:val="000000" w:themeColor="text1"/>
-        </w:rPr>
-        <w:t xml:space="preserve">, ou seja, </w:t>
-      </w:r>
-      <w:r>
-        <w:rPr>
-          <w:color w:val="000000" w:themeColor="text1"/>
-        </w:rPr>
-        <w:t>não</w:t>
-      </w:r>
-      <w:r>
-        <w:rPr>
-          <w:color w:val="000000" w:themeColor="text1"/>
-        </w:rPr>
-        <w:t xml:space="preserve"> ocorreram</w:t>
-      </w:r>
-      <w:r>
-        <w:rPr>
-          <w:color w:val="000000" w:themeColor="text1"/>
-        </w:rPr>
-        <w:t xml:space="preserve"> </w:t>
-      </w:r>
-      <w:r>
-        <w:rPr>
-          <w:color w:val="000000" w:themeColor="text1"/>
-        </w:rPr>
-        <w:t>quebras na execução durante os diferentes steps ou épocas, mesmo quando existe uma etapa intermediária de validação;</w:t>
-      </w:r>
+        <w:t xml:space="preserve">Durante o treinamento, a acurácia Top-1 permanece próxima de </w:t>
+      </w:r>
+      <w:r>
+        <w:rPr>
+          <w:b/>
+          <w:bCs/>
+          <w:color w:val="000000" w:themeColor="text1"/>
+        </w:rPr>
+        <w:t>0.1%</w:t>
+      </w:r>
+      <w:r>
+        <w:rPr>
+          <w:color w:val="000000" w:themeColor="text1"/>
+        </w:rPr>
+        <w:t xml:space="preserve">, enquanto a Top-5 fica em torno de </w:t>
+      </w:r>
+      <w:r>
+        <w:rPr>
+          <w:b/>
+          <w:bCs/>
+          <w:color w:val="000000" w:themeColor="text1"/>
+        </w:rPr>
+        <w:t>0.5% a 0.56%</w:t>
+      </w:r>
+      <w:r>
+        <w:rPr>
+          <w:color w:val="000000" w:themeColor="text1"/>
+        </w:rPr>
+        <w:t>. Esses valores coincidem exatamente com as probabilidades esperadas de um classificador aleatório em um problema com 1000 classes, onde a chance de acerto Top-1 é 1/1000 (0.1%) e a de Top-5 é aproximadamente 5/1000 (0.5%). O fato de essas métricas estarem alinhadas com o acaso confirma que os rótulos estão corretos e que não há vazamento de informação ou erro de indexação de classes.</w:t>
+      </w:r>
+    </w:p>
+    <w:p>
+      <w:pPr>
+        <w:pStyle w:val="PargrafodaLista"/>
+        <w:rPr>
+          <w:color w:val="000000" w:themeColor="text1"/>
+        </w:rPr>
+      </w:pPr>
+    </w:p>
+    <w:p>
+      <w:pPr>
+        <w:pStyle w:val="PargrafodaLista"/>
+        <w:ind w:left="2160"/>
+        <w:jc w:val="both"/>
+        <w:rPr>
+          <w:color w:val="000000" w:themeColor="text1"/>
+        </w:rPr>
+      </w:pPr>
+    </w:p>
+    <w:p>
+      <w:pPr>
+        <w:pStyle w:val="PargrafodaLista"/>
+        <w:ind w:left="1800"/>
+        <w:jc w:val="center"/>
+        <w:rPr>
+          <w:color w:val="000000" w:themeColor="text1"/>
+        </w:rPr>
+      </w:pPr>
+      <w:r>
+        <w:rPr>
+          <w:i/>
+          <w:iCs/>
+          <w:noProof/>
+          <w:color w:val="000000" w:themeColor="text1"/>
+        </w:rPr>
+        <w:lastRenderedPageBreak/>
+        <w:drawing>
+          <wp:inline distT="0" distB="0" distL="0" distR="0" wp14:anchorId="6EBC854C" wp14:editId="09A00790">
+            <wp:extent cx="3139440" cy="1125249"/>
+            <wp:effectExtent l="0" t="0" r="3810" b="0"/>
+            <wp:docPr id="499251609" name="Imagem 1"/>
+            <wp:cNvGraphicFramePr>
+              <a:graphicFrameLocks xmlns:a="http://schemas.openxmlformats.org/drawingml/2006/main" noChangeAspect="1"/>
+            </wp:cNvGraphicFramePr>
+            <a:graphic xmlns:a="http://schemas.openxmlformats.org/drawingml/2006/main">
+              <a:graphicData uri="http://schemas.openxmlformats.org/drawingml/2006/picture">
+                <pic:pic xmlns:pic="http://schemas.openxmlformats.org/drawingml/2006/picture">
+                  <pic:nvPicPr>
+                    <pic:cNvPr id="1696859281" name=""/>
+                    <pic:cNvPicPr/>
+                  </pic:nvPicPr>
+                  <pic:blipFill rotWithShape="1">
+                    <a:blip r:embed="rId7"/>
+                    <a:srcRect l="59482"/>
+                    <a:stretch>
+                      <a:fillRect/>
+                    </a:stretch>
+                  </pic:blipFill>
+                  <pic:spPr bwMode="auto">
+                    <a:xfrm>
+                      <a:off x="0" y="0"/>
+                      <a:ext cx="3164818" cy="1134345"/>
+                    </a:xfrm>
+                    <a:prstGeom prst="rect">
+                      <a:avLst/>
+                    </a:prstGeom>
+                    <a:ln>
+                      <a:noFill/>
+                    </a:ln>
+                    <a:extLst>
+                      <a:ext uri="{53640926-AAD7-44D8-BBD7-CCE9431645EC}">
+                        <a14:shadowObscured xmlns:a14="http://schemas.microsoft.com/office/drawing/2010/main"/>
+                      </a:ext>
+                    </a:extLst>
+                  </pic:spPr>
+                </pic:pic>
+              </a:graphicData>
+            </a:graphic>
+          </wp:inline>
+        </w:drawing>
+      </w:r>
+    </w:p>
+    <w:p>
+      <w:pPr>
+        <w:pStyle w:val="PargrafodaLista"/>
+        <w:ind w:left="2160"/>
+        <w:jc w:val="both"/>
+        <w:rPr>
+          <w:color w:val="000000" w:themeColor="text1"/>
+        </w:rPr>
+      </w:pPr>
     </w:p>
     <w:p>
       <w:pPr>
         <w:pStyle w:val="PargrafodaLista"/>
         <w:numPr>
-          <w:ilvl w:val="1"/>
-          <w:numId w:val="14"/>
+          <w:ilvl w:val="0"/>
+          <w:numId w:val="18"/>
         </w:numPr>
         <w:jc w:val="both"/>
         <w:rPr>
@@ -836,69 +1196,39 @@
         <w:rPr>
           <w:color w:val="000000" w:themeColor="text1"/>
         </w:rPr>
-        <w:t xml:space="preserve">A </w:t>
-      </w:r>
-      <w:r>
-        <w:rPr>
-          <w:color w:val="000000" w:themeColor="text1"/>
-        </w:rPr>
-        <w:t>perda</w:t>
-      </w:r>
-      <w:r>
-        <w:rPr>
-          <w:color w:val="000000" w:themeColor="text1"/>
-        </w:rPr>
-        <w:t xml:space="preserve"> não explode</w:t>
-      </w:r>
-      <w:r>
-        <w:rPr>
-          <w:color w:val="000000" w:themeColor="text1"/>
-        </w:rPr>
-        <w:t xml:space="preserve">, </w:t>
-      </w:r>
-      <w:r>
-        <w:rPr>
-          <w:color w:val="000000" w:themeColor="text1"/>
-        </w:rPr>
-        <w:t>indica</w:t>
-      </w:r>
-      <w:r>
-        <w:rPr>
-          <w:color w:val="000000" w:themeColor="text1"/>
-        </w:rPr>
-        <w:t>ndo</w:t>
-      </w:r>
-      <w:r>
-        <w:rPr>
-          <w:color w:val="000000" w:themeColor="text1"/>
-        </w:rPr>
-        <w:t xml:space="preserve"> </w:t>
-      </w:r>
-      <w:r>
-        <w:rPr>
-          <w:color w:val="000000" w:themeColor="text1"/>
-        </w:rPr>
-        <w:t>convergência</w:t>
-      </w:r>
-      <w:r>
-        <w:rPr>
-          <w:color w:val="000000" w:themeColor="text1"/>
-        </w:rPr>
-        <w:t xml:space="preserve"> para uma solução ideal</w:t>
-      </w:r>
-      <w:r>
-        <w:rPr>
-          <w:color w:val="000000" w:themeColor="text1"/>
-        </w:rPr>
-        <w:t>;</w:t>
-      </w:r>
+        <w:t xml:space="preserve">No conjunto de validação, tanto a acurácia Top-1 quanto a Top-5 permanecem zeradas ao longo das cinco épocas. Esse comportamento, embora à primeira vista possa parecer preocupante, é esperado nesse estágio inicial do treinamento. A ResNet-50 treinada do zero no </w:t>
+      </w:r>
+      <w:proofErr w:type="spellStart"/>
+      <w:r>
+        <w:rPr>
+          <w:i/>
+          <w:iCs/>
+          <w:color w:val="000000" w:themeColor="text1"/>
+        </w:rPr>
+        <w:t>ImageNet</w:t>
+      </w:r>
+      <w:proofErr w:type="spellEnd"/>
+      <w:r>
+        <w:rPr>
+          <w:color w:val="000000" w:themeColor="text1"/>
+        </w:rPr>
+        <w:t xml:space="preserve"> normalmente não apresenta ganhos mensuráveis em validação nas primeiras épocas, especialmente quando se utiliza um learning rate inicial alto (0.1), conforme descrito no artigo original.</w:t>
+      </w:r>
+    </w:p>
+    <w:p>
+      <w:pPr>
+        <w:pStyle w:val="PargrafodaLista"/>
+        <w:rPr>
+          <w:color w:val="000000" w:themeColor="text1"/>
+        </w:rPr>
+      </w:pPr>
     </w:p>
     <w:p>
       <w:pPr>
         <w:pStyle w:val="PargrafodaLista"/>
         <w:numPr>
-          <w:ilvl w:val="1"/>
-          <w:numId w:val="14"/>
+          <w:ilvl w:val="0"/>
+          <w:numId w:val="18"/>
         </w:numPr>
         <w:jc w:val="both"/>
         <w:rPr>
@@ -909,89 +1239,186 @@
         <w:rPr>
           <w:color w:val="000000" w:themeColor="text1"/>
         </w:rPr>
-        <w:t xml:space="preserve">A </w:t>
-      </w:r>
-      <w:r>
-        <w:rPr>
-          <w:color w:val="000000" w:themeColor="text1"/>
-        </w:rPr>
-        <w:t>perda</w:t>
-      </w:r>
-      <w:r>
-        <w:rPr>
-          <w:color w:val="000000" w:themeColor="text1"/>
-        </w:rPr>
-        <w:t xml:space="preserve"> diminui minimamente</w:t>
-      </w:r>
-      <w:r>
-        <w:rPr>
-          <w:color w:val="000000" w:themeColor="text1"/>
-        </w:rPr>
-        <w:t>, indicando aprendizado;</w:t>
-      </w:r>
-    </w:p>
-    <w:p>
-      <w:pPr>
-        <w:pStyle w:val="PargrafodaLista"/>
-        <w:numPr>
-          <w:ilvl w:val="1"/>
-          <w:numId w:val="14"/>
-        </w:numPr>
+        <w:t>O tempo de execução por época,</w:t>
+      </w:r>
+      <w:r>
+        <w:rPr>
+          <w:color w:val="000000" w:themeColor="text1"/>
+        </w:rPr>
+        <w:t xml:space="preserve"> foi</w:t>
+      </w:r>
+      <w:r>
+        <w:rPr>
+          <w:color w:val="000000" w:themeColor="text1"/>
+        </w:rPr>
+        <w:t xml:space="preserve"> aproximadamente </w:t>
+      </w:r>
+      <w:r>
+        <w:rPr>
+          <w:b/>
+          <w:bCs/>
+          <w:color w:val="000000" w:themeColor="text1"/>
+        </w:rPr>
+        <w:t>5000 segundos (cerca de 1h23min)</w:t>
+      </w:r>
+      <w:r>
+        <w:rPr>
+          <w:color w:val="000000" w:themeColor="text1"/>
+        </w:rPr>
+        <w:t xml:space="preserve">, </w:t>
+      </w:r>
+      <w:r>
+        <w:rPr>
+          <w:color w:val="000000" w:themeColor="text1"/>
+        </w:rPr>
+        <w:t xml:space="preserve">o </w:t>
+      </w:r>
+      <w:r>
+        <w:rPr>
+          <w:color w:val="000000" w:themeColor="text1"/>
+        </w:rPr>
+        <w:t xml:space="preserve">qual </w:t>
+      </w:r>
+      <w:r>
+        <w:rPr>
+          <w:color w:val="000000" w:themeColor="text1"/>
+        </w:rPr>
+        <w:t xml:space="preserve">não sugere gargalos anormais nem problemas de desempenho inesperados, </w:t>
+      </w:r>
+      <w:r>
+        <w:rPr>
+          <w:color w:val="000000" w:themeColor="text1"/>
+        </w:rPr>
+        <w:t xml:space="preserve">tendo em vista a limitação descrita: </w:t>
+      </w:r>
+      <w:r>
+        <w:rPr>
+          <w:color w:val="000000" w:themeColor="text1"/>
+        </w:rPr>
+        <w:t xml:space="preserve">única GPU, </w:t>
+      </w:r>
+      <w:r>
+        <w:rPr>
+          <w:i/>
+          <w:iCs/>
+          <w:color w:val="000000" w:themeColor="text1"/>
+        </w:rPr>
+        <w:t xml:space="preserve">batch </w:t>
+      </w:r>
+      <w:proofErr w:type="spellStart"/>
+      <w:r>
+        <w:rPr>
+          <w:i/>
+          <w:iCs/>
+          <w:color w:val="000000" w:themeColor="text1"/>
+        </w:rPr>
+        <w:t>size</w:t>
+      </w:r>
+      <w:proofErr w:type="spellEnd"/>
+      <w:r>
+        <w:rPr>
+          <w:color w:val="000000" w:themeColor="text1"/>
+        </w:rPr>
+        <w:t xml:space="preserve"> reduzido e </w:t>
+      </w:r>
+      <w:r>
+        <w:rPr>
+          <w:color w:val="000000" w:themeColor="text1"/>
+        </w:rPr>
+        <w:t>falta de</w:t>
+      </w:r>
+      <w:r>
+        <w:rPr>
+          <w:color w:val="000000" w:themeColor="text1"/>
+        </w:rPr>
+        <w:t xml:space="preserve"> paralelismo de dados. </w:t>
+      </w:r>
+    </w:p>
+    <w:p>
+      <w:pPr>
+        <w:pStyle w:val="PargrafodaLista"/>
+        <w:ind w:left="2160"/>
         <w:jc w:val="both"/>
         <w:rPr>
           <w:color w:val="000000" w:themeColor="text1"/>
         </w:rPr>
       </w:pPr>
-      <w:r>
-        <w:rPr>
-          <w:color w:val="000000" w:themeColor="text1"/>
-        </w:rPr>
-        <w:t xml:space="preserve">O modelo não </w:t>
-      </w:r>
-      <w:r>
-        <w:rPr>
-          <w:color w:val="000000" w:themeColor="text1"/>
-        </w:rPr>
-        <w:t>fica</w:t>
-      </w:r>
-      <w:r>
-        <w:rPr>
-          <w:color w:val="000000" w:themeColor="text1"/>
-        </w:rPr>
-        <w:t xml:space="preserve"> completamente travado</w:t>
-      </w:r>
-      <w:r>
-        <w:rPr>
-          <w:color w:val="000000" w:themeColor="text1"/>
-        </w:rPr>
-        <w:t xml:space="preserve"> e</w:t>
-      </w:r>
-      <w:r>
-        <w:rPr>
-          <w:color w:val="000000" w:themeColor="text1"/>
-        </w:rPr>
-        <w:t xml:space="preserve"> pipeline de dados, </w:t>
-      </w:r>
-      <w:proofErr w:type="spellStart"/>
-      <w:r>
-        <w:rPr>
-          <w:color w:val="000000" w:themeColor="text1"/>
-        </w:rPr>
-        <w:t>labels</w:t>
-      </w:r>
-      <w:proofErr w:type="spellEnd"/>
-      <w:r>
-        <w:rPr>
-          <w:color w:val="000000" w:themeColor="text1"/>
-        </w:rPr>
-        <w:t xml:space="preserve"> e gradientes está correto</w:t>
-      </w:r>
-      <w:r>
-        <w:rPr>
-          <w:color w:val="000000" w:themeColor="text1"/>
-        </w:rPr>
-        <w:t>.</w:t>
-      </w:r>
+    </w:p>
+    <w:p>
+      <w:pPr>
+        <w:ind w:left="1416"/>
+        <w:jc w:val="both"/>
+        <w:rPr>
+          <w:color w:val="000000" w:themeColor="text1"/>
+        </w:rPr>
+      </w:pPr>
+      <w:r>
+        <w:rPr>
+          <w:b/>
+          <w:bCs/>
+        </w:rPr>
+        <w:t>→</w:t>
+      </w:r>
+      <w:r>
+        <w:rPr>
+          <w:b/>
+          <w:bCs/>
+        </w:rPr>
+        <w:t xml:space="preserve"> Conclusões: </w:t>
+      </w:r>
+      <w:r>
+        <w:rPr>
+          <w:color w:val="000000" w:themeColor="text1"/>
+        </w:rPr>
+        <w:t>O</w:t>
+      </w:r>
+      <w:r>
+        <w:rPr>
+          <w:color w:val="000000" w:themeColor="text1"/>
+        </w:rPr>
+        <w:t xml:space="preserve">s resultados obtidos são esperados para um </w:t>
+      </w:r>
+      <w:r>
+        <w:rPr>
+          <w:color w:val="000000" w:themeColor="text1"/>
+        </w:rPr>
+        <w:t>teste de sanidade</w:t>
+      </w:r>
+      <w:r>
+        <w:rPr>
+          <w:color w:val="000000" w:themeColor="text1"/>
+        </w:rPr>
+        <w:t xml:space="preserve"> curto e não revelam qualquer indício de erro conceitual</w:t>
+      </w:r>
+      <w:r>
+        <w:rPr>
+          <w:color w:val="000000" w:themeColor="text1"/>
+        </w:rPr>
+        <w:t xml:space="preserve"> </w:t>
+      </w:r>
+      <w:r>
+        <w:rPr>
+          <w:color w:val="000000" w:themeColor="text1"/>
+        </w:rPr>
+        <w:t xml:space="preserve">ou de implementação. A partir desse ponto, </w:t>
+      </w:r>
+      <w:r>
+        <w:rPr>
+          <w:color w:val="000000" w:themeColor="text1"/>
+        </w:rPr>
+        <w:t>a próxima etapa é adequar esta implementação ao projeto principal, permitindo a condução de testes com a base de dados dos camundongos. Quando houver disponibilidade de hardware mais robusto, testes estendidos para a validação podem ser conduzidos para garantir a confiabilidade total da implementação atual.</w:t>
+      </w:r>
+    </w:p>
+    <w:p>
+      <w:pPr>
+        <w:pStyle w:val="PargrafodaLista"/>
+        <w:ind w:left="1440"/>
+        <w:jc w:val="both"/>
+        <w:rPr>
+          <w:b/>
+          <w:bCs/>
+        </w:rPr>
+      </w:pPr>
     </w:p>
     <w:p>
       <w:pPr>
@@ -1109,28 +1536,1168 @@
     </w:p>
     <w:p>
       <w:pPr>
+        <w:ind w:left="360"/>
+      </w:pPr>
+    </w:p>
+    <w:p>
+      <w:pPr>
+        <w:pStyle w:val="PargrafodaLista"/>
+        <w:numPr>
+          <w:ilvl w:val="0"/>
+          <w:numId w:val="1"/>
+        </w:numPr>
         <w:jc w:val="both"/>
-      </w:pPr>
-    </w:p>
-    <w:p>
-      <w:pPr>
-        <w:ind w:left="360"/>
-        <w:rPr>
-          <w:b/>
-          <w:bCs/>
-        </w:rPr>
-      </w:pPr>
-    </w:p>
-    <w:p>
-      <w:pPr>
-        <w:rPr>
-          <w:b/>
-          <w:bCs/>
-        </w:rPr>
-      </w:pPr>
-      <w:r>
-        <w:t>O objetivo deste experimento foi tentar replicar os resultados obtidos pelo artigo utilizado como base (descrito no arquivo “protocolo para garantia de confiabilidade.docx” deste repositório). Para isso, a construção do experimento busca seguir fielmente o que foi originalmente descrito pelos autores.</w:t>
-      </w:r>
+        <w:rPr>
+          <w:b/>
+          <w:bCs/>
+        </w:rPr>
+      </w:pPr>
+      <w:r>
+        <w:rPr>
+          <w:b/>
+          <w:bCs/>
+        </w:rPr>
+        <w:t>EXPERIMENTO I</w:t>
+      </w:r>
+      <w:r>
+        <w:rPr>
+          <w:b/>
+          <w:bCs/>
+        </w:rPr>
+        <w:t>I</w:t>
+      </w:r>
+      <w:r>
+        <w:rPr>
+          <w:b/>
+          <w:bCs/>
+        </w:rPr>
+        <w:t xml:space="preserve"> </w:t>
+      </w:r>
+      <w:r>
+        <w:rPr>
+          <w:b/>
+          <w:bCs/>
+        </w:rPr>
+        <w:t>–</w:t>
+      </w:r>
+      <w:bookmarkStart w:id="0" w:name="_Hlk218933372"/>
+      <w:r>
+        <w:rPr>
+          <w:b/>
+          <w:bCs/>
+        </w:rPr>
+        <w:t xml:space="preserve"> </w:t>
+      </w:r>
+      <w:r>
+        <w:rPr>
+          <w:b/>
+          <w:bCs/>
+        </w:rPr>
+        <w:t>Adequação da implementação de validação para o projeto principal</w:t>
+      </w:r>
+      <w:bookmarkEnd w:id="0"/>
+      <w:r>
+        <w:rPr>
+          <w:b/>
+          <w:bCs/>
+        </w:rPr>
+        <w:t>, seguido por novo teste de Sanidade (utilizando a base de dados dos camundongos)</w:t>
+      </w:r>
+      <w:r>
+        <w:rPr>
+          <w:b/>
+          <w:bCs/>
+        </w:rPr>
+        <w:t>:</w:t>
+      </w:r>
+      <w:r>
+        <w:rPr>
+          <w:b/>
+          <w:bCs/>
+        </w:rPr>
+        <w:t xml:space="preserve"> </w:t>
+      </w:r>
+      <w:r>
+        <w:t>O objetivo deste experimento foi</w:t>
+      </w:r>
+      <w:r>
+        <w:t xml:space="preserve"> adequar o código da ResNet-50 construído para a validação ao projeto principal, a principal modificação foi relacionada ao carregamento de dados. Os </w:t>
+      </w:r>
+      <w:proofErr w:type="spellStart"/>
+      <w:r>
+        <w:t>TFRecords</w:t>
+      </w:r>
+      <w:proofErr w:type="spellEnd"/>
+      <w:r>
+        <w:t xml:space="preserve"> não são mais utilizados, agora as imagens puras provenientes da base de dados servem como entrada.</w:t>
+      </w:r>
+    </w:p>
+    <w:p>
+      <w:pPr>
+        <w:pStyle w:val="PargrafodaLista"/>
+        <w:jc w:val="both"/>
+        <w:rPr>
+          <w:b/>
+          <w:bCs/>
+        </w:rPr>
+      </w:pPr>
+    </w:p>
+    <w:p>
+      <w:pPr>
+        <w:pStyle w:val="PargrafodaLista"/>
+        <w:jc w:val="both"/>
+        <w:rPr>
+          <w:u w:val="single"/>
+        </w:rPr>
+      </w:pPr>
+      <w:r>
+        <w:rPr>
+          <w:b/>
+          <w:bCs/>
+          <w:u w:val="single"/>
+        </w:rPr>
+        <w:t>OBSERVAÇÃO:</w:t>
+      </w:r>
+      <w:r>
+        <w:rPr>
+          <w:b/>
+          <w:bCs/>
+          <w:u w:val="single"/>
+        </w:rPr>
+        <w:t xml:space="preserve"> </w:t>
+      </w:r>
+      <w:r>
+        <w:rPr>
+          <w:u w:val="single"/>
+        </w:rPr>
+        <w:t>A</w:t>
+      </w:r>
+      <w:r>
+        <w:rPr>
+          <w:u w:val="single"/>
+        </w:rPr>
+        <w:t xml:space="preserve"> estrutura da rede e as configurações do Trainer não foram alteradas, isso pode ser feito futuramente para explorar o impacto de diferentes valores para os </w:t>
+      </w:r>
+      <w:proofErr w:type="spellStart"/>
+      <w:r>
+        <w:rPr>
+          <w:u w:val="single"/>
+        </w:rPr>
+        <w:t>hiper-parâmetros</w:t>
+      </w:r>
+      <w:proofErr w:type="spellEnd"/>
+      <w:r>
+        <w:rPr>
+          <w:u w:val="single"/>
+        </w:rPr>
+        <w:t>, contudo, isso não foi o aplicado neste teste em específico.</w:t>
+      </w:r>
+    </w:p>
+    <w:p>
+      <w:pPr>
+        <w:pStyle w:val="PargrafodaLista"/>
+        <w:jc w:val="both"/>
+        <w:rPr>
+          <w:b/>
+          <w:bCs/>
+        </w:rPr>
+      </w:pPr>
+    </w:p>
+    <w:p>
+      <w:pPr>
+        <w:pStyle w:val="PargrafodaLista"/>
+        <w:jc w:val="both"/>
+        <w:rPr>
+          <w:b/>
+          <w:bCs/>
+        </w:rPr>
+      </w:pPr>
+    </w:p>
+    <w:p>
+      <w:pPr>
+        <w:pStyle w:val="PargrafodaLista"/>
+        <w:ind w:left="1440"/>
+        <w:jc w:val="both"/>
+      </w:pPr>
+      <w:r>
+        <w:lastRenderedPageBreak/>
+        <w:t>→</w:t>
+      </w:r>
+      <w:r>
+        <w:t xml:space="preserve"> </w:t>
+      </w:r>
+      <w:proofErr w:type="spellStart"/>
+      <w:r>
+        <w:t>Sanity</w:t>
+      </w:r>
+      <w:proofErr w:type="spellEnd"/>
+      <w:r>
+        <w:t xml:space="preserve"> </w:t>
+      </w:r>
+      <w:proofErr w:type="spellStart"/>
+      <w:r>
+        <w:t>Check</w:t>
+      </w:r>
+      <w:proofErr w:type="spellEnd"/>
+      <w:r>
+        <w:t xml:space="preserve"> Básico</w:t>
+      </w:r>
+      <w:r>
+        <w:t xml:space="preserve"> com </w:t>
+      </w:r>
+      <w:r>
+        <w:t xml:space="preserve">STEP_PER_EPOCH = </w:t>
+      </w:r>
+      <w:r>
+        <w:t>(</w:t>
+      </w:r>
+      <w:r>
+        <w:t>347</w:t>
+      </w:r>
+      <w:r>
+        <w:t>) e EPOCHS = (</w:t>
+      </w:r>
+      <w:r>
+        <w:t>5</w:t>
+      </w:r>
+      <w:r>
+        <w:t>)</w:t>
+      </w:r>
+    </w:p>
+    <w:p>
+      <w:pPr>
+        <w:pStyle w:val="PargrafodaLista"/>
+        <w:ind w:left="1440"/>
+        <w:jc w:val="both"/>
+      </w:pPr>
+      <w:r>
+        <w:t>→</w:t>
+      </w:r>
+      <w:r>
+        <w:t xml:space="preserve"> Rede treinada do zero com a base ImageNet1K</w:t>
+      </w:r>
+    </w:p>
+    <w:p>
+      <w:pPr>
+        <w:pStyle w:val="PargrafodaLista"/>
+        <w:ind w:left="1440"/>
+        <w:jc w:val="both"/>
+      </w:pPr>
+      <w:r>
+        <w:rPr>
+          <w:b/>
+          <w:bCs/>
+        </w:rPr>
+        <w:t>→ Parâmetros utilizados:</w:t>
+      </w:r>
+      <w:r>
+        <w:rPr>
+          <w:b/>
+          <w:bCs/>
+        </w:rPr>
+        <w:t xml:space="preserve"> </w:t>
+      </w:r>
+      <w:r>
+        <w:t xml:space="preserve">Tanto as configurações voltadas para o carregamento dos dados, quanto as configurações exigidas pela arquitetura Vision Transformers estão descritas na Figura </w:t>
+      </w:r>
+      <w:r>
+        <w:t>2</w:t>
+      </w:r>
+      <w:r>
+        <w:t>.</w:t>
+      </w:r>
+    </w:p>
+    <w:p>
+      <w:pPr>
+        <w:pStyle w:val="PargrafodaLista"/>
+        <w:ind w:left="1440"/>
+        <w:jc w:val="both"/>
+      </w:pPr>
+    </w:p>
+    <w:p>
+      <w:pPr>
+        <w:pStyle w:val="PargrafodaLista"/>
+        <w:ind w:left="1440"/>
+        <w:jc w:val="center"/>
+      </w:pPr>
+      <w:r>
+        <w:rPr>
+          <w:sz w:val="18"/>
+          <w:szCs w:val="18"/>
+        </w:rPr>
+        <w:t>Figura</w:t>
+      </w:r>
+      <w:r>
+        <w:rPr>
+          <w:sz w:val="18"/>
+          <w:szCs w:val="18"/>
+        </w:rPr>
+        <w:t xml:space="preserve"> 1</w:t>
+      </w:r>
+      <w:r>
+        <w:rPr>
+          <w:sz w:val="18"/>
+          <w:szCs w:val="18"/>
+        </w:rPr>
+        <w:t xml:space="preserve">: </w:t>
+      </w:r>
+      <w:r>
+        <w:rPr>
+          <w:sz w:val="18"/>
+          <w:szCs w:val="18"/>
+        </w:rPr>
+        <w:t xml:space="preserve">Parâmetros utilizados para o treinamento deste teste </w:t>
+      </w:r>
+    </w:p>
+    <w:p>
+      <w:pPr>
+        <w:pStyle w:val="PargrafodaLista"/>
+        <w:ind w:left="1440"/>
+        <w:jc w:val="center"/>
+      </w:pPr>
+      <w:r>
+        <w:drawing>
+          <wp:inline distT="0" distB="0" distL="0" distR="0" wp14:anchorId="512A0F19" wp14:editId="56A0A6F5">
+            <wp:extent cx="4062217" cy="2857500"/>
+            <wp:effectExtent l="0" t="0" r="0" b="0"/>
+            <wp:docPr id="727332644" name="Imagem 1"/>
+            <wp:cNvGraphicFramePr>
+              <a:graphicFrameLocks xmlns:a="http://schemas.openxmlformats.org/drawingml/2006/main" noChangeAspect="1"/>
+            </wp:cNvGraphicFramePr>
+            <a:graphic xmlns:a="http://schemas.openxmlformats.org/drawingml/2006/main">
+              <a:graphicData uri="http://schemas.openxmlformats.org/drawingml/2006/picture">
+                <pic:pic xmlns:pic="http://schemas.openxmlformats.org/drawingml/2006/picture">
+                  <pic:nvPicPr>
+                    <pic:cNvPr id="727332644" name=""/>
+                    <pic:cNvPicPr/>
+                  </pic:nvPicPr>
+                  <pic:blipFill>
+                    <a:blip r:embed="rId8"/>
+                    <a:stretch>
+                      <a:fillRect/>
+                    </a:stretch>
+                  </pic:blipFill>
+                  <pic:spPr>
+                    <a:xfrm>
+                      <a:off x="0" y="0"/>
+                      <a:ext cx="4071844" cy="2864272"/>
+                    </a:xfrm>
+                    <a:prstGeom prst="rect">
+                      <a:avLst/>
+                    </a:prstGeom>
+                  </pic:spPr>
+                </pic:pic>
+              </a:graphicData>
+            </a:graphic>
+          </wp:inline>
+        </w:drawing>
+      </w:r>
+    </w:p>
+    <w:p>
+      <w:pPr>
+        <w:pStyle w:val="PargrafodaLista"/>
+        <w:ind w:left="1440"/>
+        <w:jc w:val="center"/>
+      </w:pPr>
+    </w:p>
+    <w:p>
+      <w:pPr>
+        <w:pStyle w:val="PargrafodaLista"/>
+        <w:ind w:left="1440"/>
+        <w:jc w:val="both"/>
+        <w:rPr>
+          <w:i/>
+          <w:iCs/>
+          <w:color w:val="000000" w:themeColor="text1"/>
+        </w:rPr>
+      </w:pPr>
+      <w:r>
+        <w:rPr>
+          <w:b/>
+          <w:bCs/>
+        </w:rPr>
+        <w:t>→ Resultados:</w:t>
+      </w:r>
+      <w:r>
+        <w:rPr>
+          <w:b/>
+          <w:bCs/>
+        </w:rPr>
+        <w:t xml:space="preserve"> </w:t>
+      </w:r>
+      <w:r>
+        <w:t>Os</w:t>
+      </w:r>
+      <w:r>
+        <w:rPr>
+          <w:b/>
+          <w:bCs/>
+        </w:rPr>
+        <w:t xml:space="preserve"> </w:t>
+      </w:r>
+      <w:r>
+        <w:rPr>
+          <w:i/>
+          <w:iCs/>
+          <w:color w:val="000000" w:themeColor="text1"/>
+        </w:rPr>
+        <w:t xml:space="preserve">Logs do </w:t>
+      </w:r>
+      <w:proofErr w:type="spellStart"/>
+      <w:r>
+        <w:rPr>
+          <w:i/>
+          <w:iCs/>
+          <w:color w:val="000000" w:themeColor="text1"/>
+        </w:rPr>
+        <w:t>Pycharm</w:t>
+      </w:r>
+      <w:proofErr w:type="spellEnd"/>
+      <w:r>
+        <w:rPr>
+          <w:i/>
+          <w:iCs/>
+          <w:color w:val="000000" w:themeColor="text1"/>
+        </w:rPr>
+        <w:t xml:space="preserve"> </w:t>
+      </w:r>
+      <w:r>
+        <w:rPr>
+          <w:color w:val="000000" w:themeColor="text1"/>
+        </w:rPr>
+        <w:t xml:space="preserve">estão </w:t>
+      </w:r>
+      <w:r>
+        <w:rPr>
+          <w:i/>
+          <w:iCs/>
+          <w:color w:val="000000" w:themeColor="text1"/>
+        </w:rPr>
+        <w:t>localizados em "\Projeto-Classificadores\</w:t>
+      </w:r>
+      <w:proofErr w:type="spellStart"/>
+      <w:r>
+        <w:rPr>
+          <w:i/>
+          <w:iCs/>
+          <w:color w:val="000000" w:themeColor="text1"/>
+        </w:rPr>
+        <w:t>Documentation</w:t>
+      </w:r>
+      <w:proofErr w:type="spellEnd"/>
+      <w:r>
+        <w:rPr>
+          <w:i/>
+          <w:iCs/>
+          <w:color w:val="000000" w:themeColor="text1"/>
+        </w:rPr>
+        <w:t>\</w:t>
+      </w:r>
+      <w:proofErr w:type="spellStart"/>
+      <w:r>
+        <w:rPr>
+          <w:i/>
+          <w:iCs/>
+          <w:color w:val="000000" w:themeColor="text1"/>
+        </w:rPr>
+        <w:t>Main</w:t>
+      </w:r>
+      <w:proofErr w:type="spellEnd"/>
+      <w:r>
+        <w:rPr>
+          <w:i/>
+          <w:iCs/>
+          <w:color w:val="000000" w:themeColor="text1"/>
+        </w:rPr>
+        <w:t xml:space="preserve"> </w:t>
+      </w:r>
+      <w:proofErr w:type="spellStart"/>
+      <w:r>
+        <w:rPr>
+          <w:i/>
+          <w:iCs/>
+          <w:color w:val="000000" w:themeColor="text1"/>
+        </w:rPr>
+        <w:t>ResNet</w:t>
+      </w:r>
+      <w:proofErr w:type="spellEnd"/>
+      <w:r>
+        <w:rPr>
+          <w:i/>
+          <w:iCs/>
+          <w:color w:val="000000" w:themeColor="text1"/>
+        </w:rPr>
+        <w:t xml:space="preserve"> </w:t>
+      </w:r>
+      <w:proofErr w:type="spellStart"/>
+      <w:r>
+        <w:rPr>
+          <w:i/>
+          <w:iCs/>
+          <w:color w:val="000000" w:themeColor="text1"/>
+        </w:rPr>
+        <w:t>Sanity</w:t>
+      </w:r>
+      <w:proofErr w:type="spellEnd"/>
+      <w:r>
+        <w:rPr>
+          <w:i/>
+          <w:iCs/>
+          <w:color w:val="000000" w:themeColor="text1"/>
+        </w:rPr>
+        <w:t xml:space="preserve"> </w:t>
+      </w:r>
+      <w:proofErr w:type="spellStart"/>
+      <w:r>
+        <w:rPr>
+          <w:i/>
+          <w:iCs/>
+          <w:color w:val="000000" w:themeColor="text1"/>
+        </w:rPr>
+        <w:t>Check</w:t>
+      </w:r>
+      <w:proofErr w:type="spellEnd"/>
+      <w:r>
+        <w:rPr>
+          <w:i/>
+          <w:iCs/>
+          <w:color w:val="000000" w:themeColor="text1"/>
+        </w:rPr>
+        <w:t xml:space="preserve"> - LOG</w:t>
+      </w:r>
+      <w:r>
+        <w:rPr>
+          <w:i/>
+          <w:iCs/>
+          <w:color w:val="000000" w:themeColor="text1"/>
+        </w:rPr>
+        <w:t>.txt"</w:t>
+      </w:r>
+    </w:p>
+    <w:p>
+      <w:pPr>
+        <w:pStyle w:val="PargrafodaLista"/>
+        <w:ind w:left="1440"/>
+        <w:jc w:val="both"/>
+      </w:pPr>
+    </w:p>
+    <w:p>
+      <w:pPr>
+        <w:pStyle w:val="PargrafodaLista"/>
+        <w:ind w:left="1440"/>
+        <w:jc w:val="both"/>
+        <w:rPr>
+          <w:b/>
+          <w:bCs/>
+        </w:rPr>
+      </w:pPr>
+      <w:r>
+        <w:rPr>
+          <w:b/>
+          <w:bCs/>
+        </w:rPr>
+        <w:t>OBSERVAÇÃO:</w:t>
+      </w:r>
+      <w:r>
+        <w:rPr>
+          <w:b/>
+          <w:bCs/>
+        </w:rPr>
+        <w:t xml:space="preserve"> </w:t>
+      </w:r>
+      <w:r>
+        <w:t xml:space="preserve">Os </w:t>
+      </w:r>
+      <w:proofErr w:type="spellStart"/>
+      <w:r>
+        <w:t>warnings</w:t>
+      </w:r>
+      <w:proofErr w:type="spellEnd"/>
+      <w:r>
+        <w:t xml:space="preserve"> </w:t>
+      </w:r>
+      <w:r>
+        <w:t>extensos</w:t>
+      </w:r>
+      <w:r>
+        <w:t xml:space="preserve"> presentes no arquivo de log</w:t>
+      </w:r>
+      <w:r>
+        <w:t xml:space="preserve"> relacionados a </w:t>
+      </w:r>
+      <w:proofErr w:type="spellStart"/>
+      <w:r>
+        <w:rPr>
+          <w:i/>
+          <w:iCs/>
+        </w:rPr>
+        <w:t>while_loop</w:t>
+      </w:r>
+      <w:proofErr w:type="spellEnd"/>
+      <w:r>
+        <w:t xml:space="preserve">, </w:t>
+      </w:r>
+      <w:proofErr w:type="spellStart"/>
+      <w:r>
+        <w:rPr>
+          <w:i/>
+          <w:iCs/>
+        </w:rPr>
+        <w:t>StatelessRandomUniform</w:t>
+      </w:r>
+      <w:proofErr w:type="spellEnd"/>
+      <w:r>
+        <w:t xml:space="preserve">, </w:t>
+      </w:r>
+      <w:r>
+        <w:rPr>
+          <w:i/>
+          <w:iCs/>
+        </w:rPr>
+        <w:t>ImageProjectiveTransformV3</w:t>
+      </w:r>
+      <w:r>
+        <w:t xml:space="preserve"> e </w:t>
+      </w:r>
+      <w:r>
+        <w:rPr>
+          <w:i/>
+          <w:iCs/>
+        </w:rPr>
+        <w:t>AdjustContrastv2</w:t>
+      </w:r>
+      <w:r>
+        <w:t xml:space="preserve"> não </w:t>
+      </w:r>
+      <w:r>
+        <w:t>representam</w:t>
+      </w:r>
+      <w:r>
+        <w:t xml:space="preserve"> um problema funcional. Eles indicam apenas que o </w:t>
+      </w:r>
+      <w:proofErr w:type="spellStart"/>
+      <w:r>
+        <w:t>TensorFlow</w:t>
+      </w:r>
+      <w:proofErr w:type="spellEnd"/>
+      <w:r>
+        <w:t xml:space="preserve"> está encapsulando operações de data </w:t>
+      </w:r>
+      <w:proofErr w:type="spellStart"/>
+      <w:r>
+        <w:t>augmentation</w:t>
+      </w:r>
+      <w:proofErr w:type="spellEnd"/>
+      <w:r>
+        <w:t xml:space="preserve"> estocástico em laços internos por limitações do conversor de grafo. </w:t>
+      </w:r>
+    </w:p>
+    <w:p>
+      <w:pPr>
+        <w:pStyle w:val="PargrafodaLista"/>
+        <w:ind w:left="1440"/>
+        <w:jc w:val="both"/>
+      </w:pPr>
+    </w:p>
+    <w:p>
+      <w:pPr>
+        <w:pStyle w:val="PargrafodaLista"/>
+        <w:ind w:left="1800"/>
+        <w:jc w:val="center"/>
+      </w:pPr>
+      <w:r>
+        <w:drawing>
+          <wp:inline distT="0" distB="0" distL="0" distR="0" wp14:anchorId="6BADE346" wp14:editId="29F08715">
+            <wp:extent cx="3359150" cy="1168143"/>
+            <wp:effectExtent l="0" t="0" r="0" b="0"/>
+            <wp:docPr id="1027908099" name="Imagem 1"/>
+            <wp:cNvGraphicFramePr>
+              <a:graphicFrameLocks xmlns:a="http://schemas.openxmlformats.org/drawingml/2006/main" noChangeAspect="1"/>
+            </wp:cNvGraphicFramePr>
+            <a:graphic xmlns:a="http://schemas.openxmlformats.org/drawingml/2006/main">
+              <a:graphicData uri="http://schemas.openxmlformats.org/drawingml/2006/picture">
+                <pic:pic xmlns:pic="http://schemas.openxmlformats.org/drawingml/2006/picture">
+                  <pic:nvPicPr>
+                    <pic:cNvPr id="1027908099" name=""/>
+                    <pic:cNvPicPr/>
+                  </pic:nvPicPr>
+                  <pic:blipFill rotWithShape="1">
+                    <a:blip r:embed="rId9"/>
+                    <a:srcRect r="39910"/>
+                    <a:stretch>
+                      <a:fillRect/>
+                    </a:stretch>
+                  </pic:blipFill>
+                  <pic:spPr bwMode="auto">
+                    <a:xfrm>
+                      <a:off x="0" y="0"/>
+                      <a:ext cx="3363623" cy="1169699"/>
+                    </a:xfrm>
+                    <a:prstGeom prst="rect">
+                      <a:avLst/>
+                    </a:prstGeom>
+                    <a:ln>
+                      <a:noFill/>
+                    </a:ln>
+                    <a:extLst>
+                      <a:ext uri="{53640926-AAD7-44D8-BBD7-CCE9431645EC}">
+                        <a14:shadowObscured xmlns:a14="http://schemas.microsoft.com/office/drawing/2010/main"/>
+                      </a:ext>
+                    </a:extLst>
+                  </pic:spPr>
+                </pic:pic>
+              </a:graphicData>
+            </a:graphic>
+          </wp:inline>
+        </w:drawing>
+      </w:r>
+    </w:p>
+    <w:p>
+      <w:pPr>
+        <w:pStyle w:val="PargrafodaLista"/>
+        <w:ind w:left="1440"/>
+        <w:jc w:val="both"/>
+      </w:pPr>
+    </w:p>
+    <w:p>
+      <w:pPr>
+        <w:pStyle w:val="PargrafodaLista"/>
+        <w:numPr>
+          <w:ilvl w:val="0"/>
+          <w:numId w:val="19"/>
+        </w:numPr>
+        <w:jc w:val="both"/>
+        <w:rPr>
+          <w:b/>
+          <w:bCs/>
+        </w:rPr>
+      </w:pPr>
+      <w:r>
+        <w:t xml:space="preserve">Durante o treinamento, o comportamento das métricas de treino é </w:t>
+      </w:r>
+      <w:r>
+        <w:rPr>
+          <w:b/>
+          <w:bCs/>
+        </w:rPr>
+        <w:t xml:space="preserve">saudável e esperado para </w:t>
+      </w:r>
+      <w:r>
+        <w:rPr>
+          <w:b/>
+          <w:bCs/>
+        </w:rPr>
+        <w:t>este teste</w:t>
+      </w:r>
+      <w:r>
+        <w:t xml:space="preserve">. A </w:t>
+      </w:r>
+      <w:proofErr w:type="spellStart"/>
+      <w:r>
+        <w:t>loss</w:t>
+      </w:r>
+      <w:proofErr w:type="spellEnd"/>
+      <w:r>
+        <w:t xml:space="preserve"> cai progressivamente ao longo das cinco épocas, e a acurácia de treino se mantém na faixa de 43–44%. Isso indica que o modelo está aprendendo padrões. </w:t>
+      </w:r>
+      <w:r>
+        <w:t>A</w:t>
+      </w:r>
+      <w:r>
+        <w:t xml:space="preserve"> métrica </w:t>
+      </w:r>
+      <w:r>
+        <w:rPr>
+          <w:i/>
+          <w:iCs/>
+        </w:rPr>
+        <w:t>top-5</w:t>
+      </w:r>
+      <w:r>
+        <w:t xml:space="preserve"> permanecer </w:t>
+      </w:r>
+      <w:r>
+        <w:t xml:space="preserve">é inútil e deve ser retirada em testes futuros, uma vez que, para </w:t>
+      </w:r>
+      <w:r>
+        <w:t>três classes</w:t>
+      </w:r>
+      <w:r>
+        <w:t>,</w:t>
+      </w:r>
+      <w:r>
+        <w:t xml:space="preserve"> qualquer predição razoável tende a acertar no top-5 automaticamente. </w:t>
+      </w:r>
+    </w:p>
+    <w:p>
+      <w:pPr>
+        <w:ind w:left="1416"/>
+        <w:jc w:val="center"/>
+      </w:pPr>
+      <w:r>
+        <w:lastRenderedPageBreak/>
+        <w:drawing>
+          <wp:inline distT="0" distB="0" distL="0" distR="0" wp14:anchorId="3297722D" wp14:editId="6539574C">
+            <wp:extent cx="2306983" cy="1193800"/>
+            <wp:effectExtent l="0" t="0" r="0" b="6350"/>
+            <wp:docPr id="2079000841" name="Imagem 1"/>
+            <wp:cNvGraphicFramePr>
+              <a:graphicFrameLocks xmlns:a="http://schemas.openxmlformats.org/drawingml/2006/main" noChangeAspect="1"/>
+            </wp:cNvGraphicFramePr>
+            <a:graphic xmlns:a="http://schemas.openxmlformats.org/drawingml/2006/main">
+              <a:graphicData uri="http://schemas.openxmlformats.org/drawingml/2006/picture">
+                <pic:pic xmlns:pic="http://schemas.openxmlformats.org/drawingml/2006/picture">
+                  <pic:nvPicPr>
+                    <pic:cNvPr id="1027908099" name=""/>
+                    <pic:cNvPicPr/>
+                  </pic:nvPicPr>
+                  <pic:blipFill rotWithShape="1">
+                    <a:blip r:embed="rId9"/>
+                    <a:srcRect l="59619"/>
+                    <a:stretch>
+                      <a:fillRect/>
+                    </a:stretch>
+                  </pic:blipFill>
+                  <pic:spPr bwMode="auto">
+                    <a:xfrm>
+                      <a:off x="0" y="0"/>
+                      <a:ext cx="2307562" cy="1194100"/>
+                    </a:xfrm>
+                    <a:prstGeom prst="rect">
+                      <a:avLst/>
+                    </a:prstGeom>
+                    <a:ln>
+                      <a:noFill/>
+                    </a:ln>
+                    <a:extLst>
+                      <a:ext uri="{53640926-AAD7-44D8-BBD7-CCE9431645EC}">
+                        <a14:shadowObscured xmlns:a14="http://schemas.microsoft.com/office/drawing/2010/main"/>
+                      </a:ext>
+                    </a:extLst>
+                  </pic:spPr>
+                </pic:pic>
+              </a:graphicData>
+            </a:graphic>
+          </wp:inline>
+        </w:drawing>
+      </w:r>
+    </w:p>
+    <w:p>
+      <w:pPr>
+        <w:pStyle w:val="PargrafodaLista"/>
+        <w:numPr>
+          <w:ilvl w:val="0"/>
+          <w:numId w:val="19"/>
+        </w:numPr>
+        <w:jc w:val="both"/>
+      </w:pPr>
+      <w:r>
+        <w:t xml:space="preserve">Apesar de a </w:t>
+      </w:r>
+      <w:proofErr w:type="spellStart"/>
+      <w:r>
+        <w:t>loss</w:t>
+      </w:r>
+      <w:proofErr w:type="spellEnd"/>
+      <w:r>
+        <w:t xml:space="preserve"> de validação apresentar uma leve redução ao longo das épocas, a acurácia e o top-1 de validação permanecem em zero durante todo o treinamento.</w:t>
+      </w:r>
+      <w:r>
+        <w:t xml:space="preserve"> </w:t>
+      </w:r>
+      <w:r>
+        <w:rPr>
+          <w:color w:val="000000" w:themeColor="text1"/>
+        </w:rPr>
+        <w:t xml:space="preserve">A ResNet-50 treinada do zero no </w:t>
+      </w:r>
+      <w:proofErr w:type="spellStart"/>
+      <w:r>
+        <w:rPr>
+          <w:i/>
+          <w:iCs/>
+          <w:color w:val="000000" w:themeColor="text1"/>
+        </w:rPr>
+        <w:t>ImageNet</w:t>
+      </w:r>
+      <w:proofErr w:type="spellEnd"/>
+      <w:r>
+        <w:rPr>
+          <w:color w:val="000000" w:themeColor="text1"/>
+        </w:rPr>
+        <w:t xml:space="preserve"> normalmente não apresenta ganhos mensuráveis em validação nas primeiras épocas, especialmente quando se utiliza um learning rate inicial alto (0.1), conforme descrito no artigo original.</w:t>
+      </w:r>
+      <w:r>
+        <w:rPr>
+          <w:color w:val="000000" w:themeColor="text1"/>
+        </w:rPr>
+        <w:t xml:space="preserve"> Contudo, </w:t>
+      </w:r>
+      <w:r>
+        <w:t>pode</w:t>
+      </w:r>
+      <w:r>
+        <w:t xml:space="preserve"> indica</w:t>
+      </w:r>
+      <w:r>
+        <w:t xml:space="preserve">r </w:t>
+      </w:r>
+      <w:r>
+        <w:t>um problema de alinhamento entre rótulos e predições na validação.</w:t>
+      </w:r>
+      <w:r>
+        <w:t xml:space="preserve"> </w:t>
+      </w:r>
+      <w:r>
+        <w:rPr>
+          <w:b/>
+          <w:bCs/>
+        </w:rPr>
+        <w:t>Para os próximos testes, isso DEVE ser avaliado.</w:t>
+      </w:r>
+    </w:p>
+    <w:p>
+      <w:pPr>
+        <w:pStyle w:val="PargrafodaLista"/>
+        <w:ind w:left="2160"/>
+        <w:jc w:val="both"/>
+      </w:pPr>
+    </w:p>
+    <w:p>
+      <w:pPr>
+        <w:pStyle w:val="PargrafodaLista"/>
+      </w:pPr>
+    </w:p>
+    <w:p>
+      <w:pPr>
+        <w:pStyle w:val="PargrafodaLista"/>
+        <w:ind w:left="2160"/>
+        <w:jc w:val="both"/>
+      </w:pPr>
+    </w:p>
+    <w:p>
+      <w:pPr>
+        <w:pStyle w:val="PargrafodaLista"/>
+        <w:ind w:left="1416"/>
+        <w:jc w:val="both"/>
+        <w:rPr>
+          <w:color w:val="000000" w:themeColor="text1"/>
+        </w:rPr>
+      </w:pPr>
+      <w:r>
+        <w:rPr>
+          <w:b/>
+          <w:bCs/>
+        </w:rPr>
+        <w:t xml:space="preserve">→ Conclusões: </w:t>
+      </w:r>
+      <w:r>
+        <w:t xml:space="preserve">Do ponto de vista da dinâmica de otimização, o treinamento é estável. O learning rate inicial de 0.1 não causou divergência, a </w:t>
+      </w:r>
+      <w:proofErr w:type="spellStart"/>
+      <w:r>
+        <w:t>loss</w:t>
+      </w:r>
+      <w:proofErr w:type="spellEnd"/>
+      <w:r>
+        <w:t xml:space="preserve"> não apresentou explosões e não há sinais de instabilidade numérica, mesmo com </w:t>
+      </w:r>
+      <w:proofErr w:type="spellStart"/>
+      <w:r>
+        <w:t>mixed</w:t>
+      </w:r>
+      <w:proofErr w:type="spellEnd"/>
+      <w:r>
+        <w:t xml:space="preserve"> </w:t>
+      </w:r>
+      <w:proofErr w:type="spellStart"/>
+      <w:r>
+        <w:t>precision</w:t>
+      </w:r>
+      <w:proofErr w:type="spellEnd"/>
+      <w:r>
+        <w:t>.</w:t>
+      </w:r>
+      <w:r>
+        <w:t xml:space="preserve"> </w:t>
+      </w:r>
+      <w:r>
+        <w:rPr>
+          <w:color w:val="000000" w:themeColor="text1"/>
+        </w:rPr>
+        <w:t>Os resultados obtidos são esperados para um teste de sanidade curto</w:t>
+      </w:r>
+      <w:r>
+        <w:rPr>
+          <w:color w:val="000000" w:themeColor="text1"/>
+        </w:rPr>
+        <w:t xml:space="preserve">, mas existe um indicativo de erro quanto aos rótulos de validação. </w:t>
+      </w:r>
+      <w:r>
+        <w:rPr>
+          <w:color w:val="000000" w:themeColor="text1"/>
+        </w:rPr>
+        <w:t xml:space="preserve">A partir desse ponto, a próxima etapa é </w:t>
+      </w:r>
+      <w:r>
+        <w:rPr>
+          <w:color w:val="000000" w:themeColor="text1"/>
+        </w:rPr>
+        <w:t>avaliar a presença deste erro, corrigi-lo e conduzir um novo teste, apenas para analisar o comportamento da rede.</w:t>
+      </w:r>
+    </w:p>
+    <w:p>
+      <w:pPr>
+        <w:jc w:val="both"/>
+        <w:rPr>
+          <w:b/>
+          <w:bCs/>
+        </w:rPr>
+      </w:pPr>
+      <w:r>
+        <w:rPr>
+          <w:noProof/>
+        </w:rPr>
+        <mc:AlternateContent>
+          <mc:Choice Requires="wps">
+            <w:drawing>
+              <wp:anchor distT="0" distB="0" distL="114300" distR="114300" simplePos="0" relativeHeight="251661312" behindDoc="0" locked="0" layoutInCell="1" allowOverlap="1" wp14:anchorId="1950AF27" wp14:editId="01E0D645">
+                <wp:simplePos x="0" y="0"/>
+                <wp:positionH relativeFrom="margin">
+                  <wp:align>center</wp:align>
+                </wp:positionH>
+                <wp:positionV relativeFrom="paragraph">
+                  <wp:posOffset>160020</wp:posOffset>
+                </wp:positionV>
+                <wp:extent cx="7020000" cy="0"/>
+                <wp:effectExtent l="0" t="0" r="0" b="0"/>
+                <wp:wrapNone/>
+                <wp:docPr id="841168305" name="Conector reto 1"/>
+                <wp:cNvGraphicFramePr/>
+                <a:graphic xmlns:a="http://schemas.openxmlformats.org/drawingml/2006/main">
+                  <a:graphicData uri="http://schemas.microsoft.com/office/word/2010/wordprocessingShape">
+                    <wps:wsp>
+                      <wps:cNvCnPr/>
+                      <wps:spPr>
+                        <a:xfrm flipV="1">
+                          <a:off x="0" y="0"/>
+                          <a:ext cx="7020000" cy="0"/>
+                        </a:xfrm>
+                        <a:prstGeom prst="line">
+                          <a:avLst/>
+                        </a:prstGeom>
+                        <a:ln w="12700">
+                          <a:solidFill>
+                            <a:schemeClr val="tx1"/>
+                          </a:solidFill>
+                          <a:prstDash val="solid"/>
+                        </a:ln>
+                      </wps:spPr>
+                      <wps:style>
+                        <a:lnRef idx="1">
+                          <a:schemeClr val="accent1"/>
+                        </a:lnRef>
+                        <a:fillRef idx="0">
+                          <a:schemeClr val="accent1"/>
+                        </a:fillRef>
+                        <a:effectRef idx="0">
+                          <a:schemeClr val="accent1"/>
+                        </a:effectRef>
+                        <a:fontRef idx="minor">
+                          <a:schemeClr val="tx1"/>
+                        </a:fontRef>
+                      </wps:style>
+                      <wps:bodyPr/>
+                    </wps:wsp>
+                  </a:graphicData>
+                </a:graphic>
+                <wp14:sizeRelH relativeFrom="margin">
+                  <wp14:pctWidth>0</wp14:pctWidth>
+                </wp14:sizeRelH>
+                <wp14:sizeRelV relativeFrom="margin">
+                  <wp14:pctHeight>0</wp14:pctHeight>
+                </wp14:sizeRelV>
+              </wp:anchor>
+            </w:drawing>
+          </mc:Choice>
+          <mc:Fallback>
+            <w:pict>
+              <v:line w14:anchorId="537CEFCE" id="Conector reto 1" o:spid="_x0000_s1026" style="position:absolute;flip:y;z-index:251661312;visibility:visible;mso-wrap-style:square;mso-width-percent:0;mso-height-percent:0;mso-wrap-distance-left:9pt;mso-wrap-distance-top:0;mso-wrap-distance-right:9pt;mso-wrap-distance-bottom:0;mso-position-horizontal:center;mso-position-horizontal-relative:margin;mso-position-vertical:absolute;mso-position-vertical-relative:text;mso-width-percent:0;mso-height-percent:0;mso-width-relative:margin;mso-height-relative:margin" from="0,12.6pt" to="552.75pt,12.6pt" o:gfxdata="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" strokecolor="black [3213]" strokeweight="1pt">
+                <v:stroke joinstyle="miter"/>
+                <w10:wrap anchorx="margin"/>
+              </v:line>
+            </w:pict>
+          </mc:Fallback>
+        </mc:AlternateContent>
+      </w:r>
+    </w:p>
+    <w:p>
+      <w:pPr>
+        <w:pStyle w:val="PargrafodaLista"/>
+        <w:rPr>
+          <w:b/>
+          <w:bCs/>
+        </w:rPr>
+      </w:pPr>
+    </w:p>
+    <w:p>
+      <w:pPr>
+        <w:pStyle w:val="PargrafodaLista"/>
+        <w:rPr>
+          <w:b/>
+          <w:bCs/>
+        </w:rPr>
+      </w:pPr>
+    </w:p>
+    <w:p>
+      <w:pPr>
+        <w:pStyle w:val="PargrafodaLista"/>
+        <w:numPr>
+          <w:ilvl w:val="0"/>
+          <w:numId w:val="1"/>
+        </w:numPr>
+        <w:rPr>
+          <w:b/>
+          <w:bCs/>
+        </w:rPr>
+      </w:pPr>
+      <w:r>
+        <w:rPr>
+          <w:b/>
+          <w:bCs/>
+        </w:rPr>
+        <w:t xml:space="preserve">CORREÇÃO DO </w:t>
+      </w:r>
+      <w:r>
+        <w:rPr>
+          <w:b/>
+          <w:bCs/>
+        </w:rPr>
+        <w:t>EX</w:t>
+      </w:r>
+      <w:r>
+        <w:rPr>
+          <w:b/>
+          <w:bCs/>
+        </w:rPr>
+        <w:t xml:space="preserve">PERIMENTO </w:t>
+      </w:r>
+      <w:r>
+        <w:rPr>
+          <w:b/>
+          <w:bCs/>
+        </w:rPr>
+        <w:t xml:space="preserve">II – ANÁLISE DOS RÓTULOS DE VALIDAÇÃO: </w:t>
+      </w:r>
+    </w:p>
+    <w:p>
+      <w:pPr>
+        <w:pStyle w:val="PargrafodaLista"/>
+        <w:rPr>
+          <w:b/>
+          <w:bCs/>
+        </w:rPr>
+      </w:pPr>
     </w:p>
     <w:sectPr>
       <w:pgSz w:w="11906" w:h="16838"/>
@@ -1895,6 +3462,119 @@
     </w:lvl>
   </w:abstractNum>
   <w:abstractNum w:abstractNumId="6" w15:restartNumberingAfterBreak="0">
+    <w:nsid w:val="283E7EDD"/>
+    <w:multiLevelType w:val="hybridMultilevel"/>
+    <w:tmpl w:val="B8DEC0E6"/>
+    <w:lvl w:ilvl="0" w:tplc="0416000B">
+      <w:start w:val="1"/>
+      <w:numFmt w:val="bullet"/>
+      <w:lvlText w:val=""/>
+      <w:lvlJc w:val="left"/>
+      <w:pPr>
+        <w:ind w:left="2160" w:hanging="360"/>
+      </w:pPr>
+      <w:rPr>
+        <w:rFonts w:ascii="Wingdings" w:hAnsi="Wingdings" w:hint="default"/>
+      </w:rPr>
+    </w:lvl>
+    <w:lvl w:ilvl="1" w:tplc="04160003" w:tentative="1">
+      <w:start w:val="1"/>
+      <w:numFmt w:val="bullet"/>
+      <w:lvlText w:val="o"/>
+      <w:lvlJc w:val="left"/>
+      <w:pPr>
+        <w:ind w:left="2880" w:hanging="360"/>
+      </w:pPr>
+      <w:rPr>
+        <w:rFonts w:ascii="Courier New" w:hAnsi="Courier New" w:cs="Courier New" w:hint="default"/>
+      </w:rPr>
+    </w:lvl>
+    <w:lvl w:ilvl="2" w:tplc="04160005" w:tentative="1">
+      <w:start w:val="1"/>
+      <w:numFmt w:val="bullet"/>
+      <w:lvlText w:val=""/>
+      <w:lvlJc w:val="left"/>
+      <w:pPr>
+        <w:ind w:left="3600" w:hanging="360"/>
+      </w:pPr>
+      <w:rPr>
+        <w:rFonts w:ascii="Wingdings" w:hAnsi="Wingdings" w:hint="default"/>
+      </w:rPr>
+    </w:lvl>
+    <w:lvl w:ilvl="3" w:tplc="04160001" w:tentative="1">
+      <w:start w:val="1"/>
+      <w:numFmt w:val="bullet"/>
+      <w:lvlText w:val=""/>
+      <w:lvlJc w:val="left"/>
+      <w:pPr>
+        <w:ind w:left="4320" w:hanging="360"/>
+      </w:pPr>
+      <w:rPr>
+        <w:rFonts w:ascii="Symbol" w:hAnsi="Symbol" w:hint="default"/>
+      </w:rPr>
+    </w:lvl>
+    <w:lvl w:ilvl="4" w:tplc="04160003" w:tentative="1">
+      <w:start w:val="1"/>
+      <w:numFmt w:val="bullet"/>
+      <w:lvlText w:val="o"/>
+      <w:lvlJc w:val="left"/>
+      <w:pPr>
+        <w:ind w:left="5040" w:hanging="360"/>
+      </w:pPr>
+      <w:rPr>
+        <w:rFonts w:ascii="Courier New" w:hAnsi="Courier New" w:cs="Courier New" w:hint="default"/>
+      </w:rPr>
+    </w:lvl>
+    <w:lvl w:ilvl="5" w:tplc="04160005" w:tentative="1">
+      <w:start w:val="1"/>
+      <w:numFmt w:val="bullet"/>
+      <w:lvlText w:val=""/>
+      <w:lvlJc w:val="left"/>
+      <w:pPr>
+        <w:ind w:left="5760" w:hanging="360"/>
+      </w:pPr>
+      <w:rPr>
+        <w:rFonts w:ascii="Wingdings" w:hAnsi="Wingdings" w:hint="default"/>
+      </w:rPr>
+    </w:lvl>
+    <w:lvl w:ilvl="6" w:tplc="04160001" w:tentative="1">
+      <w:start w:val="1"/>
+      <w:numFmt w:val="bullet"/>
+      <w:lvlText w:val=""/>
+      <w:lvlJc w:val="left"/>
+      <w:pPr>
+        <w:ind w:left="6480" w:hanging="360"/>
+      </w:pPr>
+      <w:rPr>
+        <w:rFonts w:ascii="Symbol" w:hAnsi="Symbol" w:hint="default"/>
+      </w:rPr>
+    </w:lvl>
+    <w:lvl w:ilvl="7" w:tplc="04160003" w:tentative="1">
+      <w:start w:val="1"/>
+      <w:numFmt w:val="bullet"/>
+      <w:lvlText w:val="o"/>
+      <w:lvlJc w:val="left"/>
+      <w:pPr>
+        <w:ind w:left="7200" w:hanging="360"/>
+      </w:pPr>
+      <w:rPr>
+        <w:rFonts w:ascii="Courier New" w:hAnsi="Courier New" w:cs="Courier New" w:hint="default"/>
+      </w:rPr>
+    </w:lvl>
+    <w:lvl w:ilvl="8" w:tplc="04160005" w:tentative="1">
+      <w:start w:val="1"/>
+      <w:numFmt w:val="bullet"/>
+      <w:lvlText w:val=""/>
+      <w:lvlJc w:val="left"/>
+      <w:pPr>
+        <w:ind w:left="7920" w:hanging="360"/>
+      </w:pPr>
+      <w:rPr>
+        <w:rFonts w:ascii="Wingdings" w:hAnsi="Wingdings" w:hint="default"/>
+      </w:rPr>
+    </w:lvl>
+  </w:abstractNum>
+  <w:abstractNum w:abstractNumId="7" w15:restartNumberingAfterBreak="0">
     <w:nsid w:val="2B7D0660"/>
     <w:multiLevelType w:val="hybridMultilevel"/>
     <w:tmpl w:val="7264EF5C"/>
@@ -2007,7 +3687,7 @@
       </w:rPr>
     </w:lvl>
   </w:abstractNum>
-  <w:abstractNum w:abstractNumId="7" w15:restartNumberingAfterBreak="0">
+  <w:abstractNum w:abstractNumId="8" w15:restartNumberingAfterBreak="0">
     <w:nsid w:val="3B8A6728"/>
     <w:multiLevelType w:val="multilevel"/>
     <w:tmpl w:val="7512D090"/>
@@ -2156,7 +3836,7 @@
       </w:rPr>
     </w:lvl>
   </w:abstractNum>
-  <w:abstractNum w:abstractNumId="8" w15:restartNumberingAfterBreak="0">
+  <w:abstractNum w:abstractNumId="9" w15:restartNumberingAfterBreak="0">
     <w:nsid w:val="3E130E0A"/>
     <w:multiLevelType w:val="hybridMultilevel"/>
     <w:tmpl w:val="9B626D74"/>
@@ -2269,7 +3949,7 @@
       </w:rPr>
     </w:lvl>
   </w:abstractNum>
-  <w:abstractNum w:abstractNumId="9" w15:restartNumberingAfterBreak="0">
+  <w:abstractNum w:abstractNumId="10" w15:restartNumberingAfterBreak="0">
     <w:nsid w:val="44BB04AA"/>
     <w:multiLevelType w:val="hybridMultilevel"/>
     <w:tmpl w:val="47922734"/>
@@ -2382,7 +4062,7 @@
       </w:rPr>
     </w:lvl>
   </w:abstractNum>
-  <w:abstractNum w:abstractNumId="10" w15:restartNumberingAfterBreak="0">
+  <w:abstractNum w:abstractNumId="11" w15:restartNumberingAfterBreak="0">
     <w:nsid w:val="47F12BC3"/>
     <w:multiLevelType w:val="hybridMultilevel"/>
     <w:tmpl w:val="0FA6ACEE"/>
@@ -2495,7 +4175,7 @@
       </w:rPr>
     </w:lvl>
   </w:abstractNum>
-  <w:abstractNum w:abstractNumId="11" w15:restartNumberingAfterBreak="0">
+  <w:abstractNum w:abstractNumId="12" w15:restartNumberingAfterBreak="0">
     <w:nsid w:val="5115667A"/>
     <w:multiLevelType w:val="hybridMultilevel"/>
     <w:tmpl w:val="8A3C7FB8"/>
@@ -2608,10 +4288,10 @@
       </w:rPr>
     </w:lvl>
   </w:abstractNum>
-  <w:abstractNum w:abstractNumId="12" w15:restartNumberingAfterBreak="0">
+  <w:abstractNum w:abstractNumId="13" w15:restartNumberingAfterBreak="0">
     <w:nsid w:val="5796665F"/>
     <w:multiLevelType w:val="hybridMultilevel"/>
-    <w:tmpl w:val="106A1E76"/>
+    <w:tmpl w:val="28F0045E"/>
     <w:lvl w:ilvl="0" w:tplc="0416000F">
       <w:start w:val="1"/>
       <w:numFmt w:val="decimal"/>
@@ -2697,7 +4377,7 @@
       </w:pPr>
     </w:lvl>
   </w:abstractNum>
-  <w:abstractNum w:abstractNumId="13" w15:restartNumberingAfterBreak="0">
+  <w:abstractNum w:abstractNumId="14" w15:restartNumberingAfterBreak="0">
     <w:nsid w:val="5A33296D"/>
     <w:multiLevelType w:val="multilevel"/>
     <w:tmpl w:val="F6EEC362"/>
@@ -2846,7 +4526,120 @@
       </w:rPr>
     </w:lvl>
   </w:abstractNum>
-  <w:abstractNum w:abstractNumId="14" w15:restartNumberingAfterBreak="0">
+  <w:abstractNum w:abstractNumId="15" w15:restartNumberingAfterBreak="0">
+    <w:nsid w:val="5FFF078E"/>
+    <w:multiLevelType w:val="hybridMultilevel"/>
+    <w:tmpl w:val="0CBE2522"/>
+    <w:lvl w:ilvl="0" w:tplc="0416000B">
+      <w:start w:val="1"/>
+      <w:numFmt w:val="bullet"/>
+      <w:lvlText w:val=""/>
+      <w:lvlJc w:val="left"/>
+      <w:pPr>
+        <w:ind w:left="2160" w:hanging="360"/>
+      </w:pPr>
+      <w:rPr>
+        <w:rFonts w:ascii="Wingdings" w:hAnsi="Wingdings" w:hint="default"/>
+      </w:rPr>
+    </w:lvl>
+    <w:lvl w:ilvl="1" w:tplc="04160003" w:tentative="1">
+      <w:start w:val="1"/>
+      <w:numFmt w:val="bullet"/>
+      <w:lvlText w:val="o"/>
+      <w:lvlJc w:val="left"/>
+      <w:pPr>
+        <w:ind w:left="2880" w:hanging="360"/>
+      </w:pPr>
+      <w:rPr>
+        <w:rFonts w:ascii="Courier New" w:hAnsi="Courier New" w:cs="Courier New" w:hint="default"/>
+      </w:rPr>
+    </w:lvl>
+    <w:lvl w:ilvl="2" w:tplc="04160005" w:tentative="1">
+      <w:start w:val="1"/>
+      <w:numFmt w:val="bullet"/>
+      <w:lvlText w:val=""/>
+      <w:lvlJc w:val="left"/>
+      <w:pPr>
+        <w:ind w:left="3600" w:hanging="360"/>
+      </w:pPr>
+      <w:rPr>
+        <w:rFonts w:ascii="Wingdings" w:hAnsi="Wingdings" w:hint="default"/>
+      </w:rPr>
+    </w:lvl>
+    <w:lvl w:ilvl="3" w:tplc="04160001" w:tentative="1">
+      <w:start w:val="1"/>
+      <w:numFmt w:val="bullet"/>
+      <w:lvlText w:val=""/>
+      <w:lvlJc w:val="left"/>
+      <w:pPr>
+        <w:ind w:left="4320" w:hanging="360"/>
+      </w:pPr>
+      <w:rPr>
+        <w:rFonts w:ascii="Symbol" w:hAnsi="Symbol" w:hint="default"/>
+      </w:rPr>
+    </w:lvl>
+    <w:lvl w:ilvl="4" w:tplc="04160003" w:tentative="1">
+      <w:start w:val="1"/>
+      <w:numFmt w:val="bullet"/>
+      <w:lvlText w:val="o"/>
+      <w:lvlJc w:val="left"/>
+      <w:pPr>
+        <w:ind w:left="5040" w:hanging="360"/>
+      </w:pPr>
+      <w:rPr>
+        <w:rFonts w:ascii="Courier New" w:hAnsi="Courier New" w:cs="Courier New" w:hint="default"/>
+      </w:rPr>
+    </w:lvl>
+    <w:lvl w:ilvl="5" w:tplc="04160005" w:tentative="1">
+      <w:start w:val="1"/>
+      <w:numFmt w:val="bullet"/>
+      <w:lvlText w:val=""/>
+      <w:lvlJc w:val="left"/>
+      <w:pPr>
+        <w:ind w:left="5760" w:hanging="360"/>
+      </w:pPr>
+      <w:rPr>
+        <w:rFonts w:ascii="Wingdings" w:hAnsi="Wingdings" w:hint="default"/>
+      </w:rPr>
+    </w:lvl>
+    <w:lvl w:ilvl="6" w:tplc="04160001" w:tentative="1">
+      <w:start w:val="1"/>
+      <w:numFmt w:val="bullet"/>
+      <w:lvlText w:val=""/>
+      <w:lvlJc w:val="left"/>
+      <w:pPr>
+        <w:ind w:left="6480" w:hanging="360"/>
+      </w:pPr>
+      <w:rPr>
+        <w:rFonts w:ascii="Symbol" w:hAnsi="Symbol" w:hint="default"/>
+      </w:rPr>
+    </w:lvl>
+    <w:lvl w:ilvl="7" w:tplc="04160003" w:tentative="1">
+      <w:start w:val="1"/>
+      <w:numFmt w:val="bullet"/>
+      <w:lvlText w:val="o"/>
+      <w:lvlJc w:val="left"/>
+      <w:pPr>
+        <w:ind w:left="7200" w:hanging="360"/>
+      </w:pPr>
+      <w:rPr>
+        <w:rFonts w:ascii="Courier New" w:hAnsi="Courier New" w:cs="Courier New" w:hint="default"/>
+      </w:rPr>
+    </w:lvl>
+    <w:lvl w:ilvl="8" w:tplc="04160005" w:tentative="1">
+      <w:start w:val="1"/>
+      <w:numFmt w:val="bullet"/>
+      <w:lvlText w:val=""/>
+      <w:lvlJc w:val="left"/>
+      <w:pPr>
+        <w:ind w:left="7920" w:hanging="360"/>
+      </w:pPr>
+      <w:rPr>
+        <w:rFonts w:ascii="Wingdings" w:hAnsi="Wingdings" w:hint="default"/>
+      </w:rPr>
+    </w:lvl>
+  </w:abstractNum>
+  <w:abstractNum w:abstractNumId="16" w15:restartNumberingAfterBreak="0">
     <w:nsid w:val="7CB32D06"/>
     <w:multiLevelType w:val="hybridMultilevel"/>
     <w:tmpl w:val="06D44BFE"/>
@@ -2959,7 +4752,7 @@
       </w:rPr>
     </w:lvl>
   </w:abstractNum>
-  <w:abstractNum w:abstractNumId="15" w15:restartNumberingAfterBreak="0">
+  <w:abstractNum w:abstractNumId="17" w15:restartNumberingAfterBreak="0">
     <w:nsid w:val="7D075251"/>
     <w:multiLevelType w:val="hybridMultilevel"/>
     <w:tmpl w:val="DE3E8316"/>
@@ -3072,7 +4865,7 @@
       </w:rPr>
     </w:lvl>
   </w:abstractNum>
-  <w:abstractNum w:abstractNumId="16" w15:restartNumberingAfterBreak="0">
+  <w:abstractNum w:abstractNumId="18" w15:restartNumberingAfterBreak="0">
     <w:nsid w:val="7FB7601E"/>
     <w:multiLevelType w:val="hybridMultilevel"/>
     <w:tmpl w:val="70887F96"/>
@@ -3186,16 +4979,16 @@
     </w:lvl>
   </w:abstractNum>
   <w:num w:numId="1" w16cid:durableId="1615208601">
-    <w:abstractNumId w:val="12"/>
+    <w:abstractNumId w:val="13"/>
   </w:num>
   <w:num w:numId="2" w16cid:durableId="1097402540">
-    <w:abstractNumId w:val="11"/>
+    <w:abstractNumId w:val="12"/>
   </w:num>
   <w:num w:numId="3" w16cid:durableId="170608834">
     <w:abstractNumId w:val="1"/>
   </w:num>
   <w:num w:numId="4" w16cid:durableId="1548687179">
-    <w:abstractNumId w:val="10"/>
+    <w:abstractNumId w:val="11"/>
   </w:num>
   <w:num w:numId="5" w16cid:durableId="1836650803">
     <w:abstractNumId w:val="0"/>
@@ -3204,7 +4997,7 @@
     <w:abstractNumId w:val="5"/>
   </w:num>
   <w:num w:numId="7" w16cid:durableId="731393186">
-    <w:abstractNumId w:val="14"/>
+    <w:abstractNumId w:val="16"/>
   </w:num>
   <w:num w:numId="8" w16cid:durableId="105393592">
     <w:abstractNumId w:val="4"/>
@@ -3213,28 +5006,34 @@
     <w:abstractNumId w:val="2"/>
   </w:num>
   <w:num w:numId="10" w16cid:durableId="2124222485">
-    <w:abstractNumId w:val="6"/>
+    <w:abstractNumId w:val="7"/>
   </w:num>
   <w:num w:numId="11" w16cid:durableId="1832524834">
-    <w:abstractNumId w:val="15"/>
+    <w:abstractNumId w:val="17"/>
   </w:num>
   <w:num w:numId="12" w16cid:durableId="1891188526">
-    <w:abstractNumId w:val="16"/>
+    <w:abstractNumId w:val="18"/>
   </w:num>
   <w:num w:numId="13" w16cid:durableId="838423982">
-    <w:abstractNumId w:val="8"/>
+    <w:abstractNumId w:val="9"/>
   </w:num>
   <w:num w:numId="14" w16cid:durableId="2133136465">
     <w:abstractNumId w:val="3"/>
   </w:num>
   <w:num w:numId="15" w16cid:durableId="1916890474">
-    <w:abstractNumId w:val="9"/>
+    <w:abstractNumId w:val="10"/>
   </w:num>
   <w:num w:numId="16" w16cid:durableId="1868639224">
-    <w:abstractNumId w:val="7"/>
+    <w:abstractNumId w:val="8"/>
   </w:num>
   <w:num w:numId="17" w16cid:durableId="2074740691">
-    <w:abstractNumId w:val="13"/>
+    <w:abstractNumId w:val="14"/>
+  </w:num>
+  <w:num w:numId="18" w16cid:durableId="1530340441">
+    <w:abstractNumId w:val="6"/>
+  </w:num>
+  <w:num w:numId="19" w16cid:durableId="738989656">
+    <w:abstractNumId w:val="15"/>
   </w:num>
 </w:numbering>
 </file>
@@ -3842,7 +5641,6 @@
   <w:style w:type="character" w:default="1" w:styleId="Fontepargpadro">
     <w:name w:val="Default Paragraph Font"/>
     <w:uiPriority w:val="1"/>
-    <w:semiHidden/>
     <w:unhideWhenUsed/>
   </w:style>
   <w:style w:type="table" w:default="1" w:styleId="Tabelanormal">

</xml_diff>

<commit_message>
Correção e atualização do loader
</commit_message>
<xml_diff>
--- a/Documentation/Experimentos com ResNet-50.docx
+++ b/Documentation/Experimentos com ResNet-50.docx
@@ -779,6 +779,24 @@
           <w:iCs/>
           <w:color w:val="000000" w:themeColor="text1"/>
         </w:rPr>
+        <w:t>Pycharm</w:t>
+      </w:r>
+      <w:proofErr w:type="spellEnd"/>
+      <w:r>
+        <w:rPr>
+          <w:i/>
+          <w:iCs/>
+          <w:color w:val="000000" w:themeColor="text1"/>
+        </w:rPr>
+        <w:t xml:space="preserve"> LOGS\</w:t>
+      </w:r>
+      <w:proofErr w:type="spellStart"/>
+      <w:r>
+        <w:rPr>
+          <w:i/>
+          <w:iCs/>
+          <w:color w:val="000000" w:themeColor="text1"/>
+        </w:rPr>
         <w:t>Validation</w:t>
       </w:r>
       <w:proofErr w:type="spellEnd"/>
@@ -864,6 +882,73 @@
           <w:color w:val="000000" w:themeColor="text1"/>
         </w:rPr>
       </w:pPr>
+    </w:p>
+    <w:p>
+      <w:pPr>
+        <w:pStyle w:val="PargrafodaLista"/>
+        <w:ind w:left="1440"/>
+        <w:jc w:val="center"/>
+      </w:pPr>
+      <w:r>
+        <w:rPr>
+          <w:sz w:val="18"/>
+          <w:szCs w:val="18"/>
+        </w:rPr>
+        <w:t>Figura</w:t>
+      </w:r>
+      <w:r>
+        <w:rPr>
+          <w:sz w:val="18"/>
+          <w:szCs w:val="18"/>
+        </w:rPr>
+        <w:t xml:space="preserve"> </w:t>
+      </w:r>
+      <w:r>
+        <w:rPr>
+          <w:sz w:val="18"/>
+          <w:szCs w:val="18"/>
+        </w:rPr>
+        <w:t>2</w:t>
+      </w:r>
+      <w:r>
+        <w:rPr>
+          <w:sz w:val="18"/>
+          <w:szCs w:val="18"/>
+        </w:rPr>
+        <w:t xml:space="preserve">: </w:t>
+      </w:r>
+      <w:r>
+        <w:rPr>
+          <w:sz w:val="18"/>
+          <w:szCs w:val="18"/>
+        </w:rPr>
+        <w:t xml:space="preserve">Resultados obtidos do treinamento no teste de </w:t>
+      </w:r>
+      <w:proofErr w:type="spellStart"/>
+      <w:r>
+        <w:rPr>
+          <w:sz w:val="18"/>
+          <w:szCs w:val="18"/>
+        </w:rPr>
+        <w:t>Sanity</w:t>
+      </w:r>
+      <w:proofErr w:type="spellEnd"/>
+      <w:r>
+        <w:rPr>
+          <w:sz w:val="18"/>
+          <w:szCs w:val="18"/>
+        </w:rPr>
+        <w:t xml:space="preserve"> </w:t>
+      </w:r>
+      <w:proofErr w:type="spellStart"/>
+      <w:r>
+        <w:rPr>
+          <w:sz w:val="18"/>
+          <w:szCs w:val="18"/>
+        </w:rPr>
+        <w:t>Check</w:t>
+      </w:r>
+      <w:proofErr w:type="spellEnd"/>
     </w:p>
     <w:p>
       <w:pPr>
@@ -991,7 +1076,21 @@
         <w:rPr>
           <w:color w:val="000000" w:themeColor="text1"/>
         </w:rPr>
-        <w:t>. Para um problema de classificação com 1000 classes, a perda teórica associada a uma predição aleatória é dada por log(1000) ≈ 6.907</w:t>
+        <w:t xml:space="preserve">. Para um problema de classificação com 1000 classes, a perda teórica associada a uma predição aleatória é dada por </w:t>
+      </w:r>
+      <w:proofErr w:type="gramStart"/>
+      <w:r>
+        <w:rPr>
+          <w:color w:val="000000" w:themeColor="text1"/>
+        </w:rPr>
+        <w:t>log(</w:t>
+      </w:r>
+      <w:proofErr w:type="gramEnd"/>
+      <w:r>
+        <w:rPr>
+          <w:color w:val="000000" w:themeColor="text1"/>
+        </w:rPr>
+        <w:t>1000) ≈ 6.907</w:t>
       </w:r>
       <w:r>
         <w:rPr>
@@ -1091,7 +1190,15 @@
     </w:p>
     <w:p>
       <w:pPr>
-        <w:pStyle w:val="PargrafodaLista"/>
+        <w:jc w:val="both"/>
+        <w:rPr>
+          <w:color w:val="000000" w:themeColor="text1"/>
+        </w:rPr>
+      </w:pPr>
+    </w:p>
+    <w:p>
+      <w:pPr>
+        <w:jc w:val="both"/>
         <w:rPr>
           <w:color w:val="000000" w:themeColor="text1"/>
         </w:rPr>
@@ -1106,6 +1213,88 @@
           <w:color w:val="000000" w:themeColor="text1"/>
         </w:rPr>
       </w:pPr>
+    </w:p>
+    <w:p>
+      <w:pPr>
+        <w:pStyle w:val="PargrafodaLista"/>
+        <w:ind w:left="1440"/>
+        <w:jc w:val="center"/>
+      </w:pPr>
+      <w:r>
+        <w:rPr>
+          <w:sz w:val="18"/>
+          <w:szCs w:val="18"/>
+        </w:rPr>
+        <w:lastRenderedPageBreak/>
+        <w:t>Figura</w:t>
+      </w:r>
+      <w:r>
+        <w:rPr>
+          <w:sz w:val="18"/>
+          <w:szCs w:val="18"/>
+        </w:rPr>
+        <w:t xml:space="preserve"> </w:t>
+      </w:r>
+      <w:r>
+        <w:rPr>
+          <w:sz w:val="18"/>
+          <w:szCs w:val="18"/>
+        </w:rPr>
+        <w:t>3</w:t>
+      </w:r>
+      <w:r>
+        <w:rPr>
+          <w:sz w:val="18"/>
+          <w:szCs w:val="18"/>
+        </w:rPr>
+        <w:t xml:space="preserve">: </w:t>
+      </w:r>
+      <w:r>
+        <w:rPr>
+          <w:sz w:val="18"/>
+          <w:szCs w:val="18"/>
+        </w:rPr>
+        <w:t>Resultados obtidos d</w:t>
+      </w:r>
+      <w:r>
+        <w:rPr>
+          <w:sz w:val="18"/>
+          <w:szCs w:val="18"/>
+        </w:rPr>
+        <w:t>a validação no teste de</w:t>
+      </w:r>
+      <w:r>
+        <w:rPr>
+          <w:sz w:val="18"/>
+          <w:szCs w:val="18"/>
+        </w:rPr>
+        <w:t xml:space="preserve"> </w:t>
+      </w:r>
+      <w:proofErr w:type="spellStart"/>
+      <w:r>
+        <w:rPr>
+          <w:sz w:val="18"/>
+          <w:szCs w:val="18"/>
+        </w:rPr>
+        <w:t>Sanity</w:t>
+      </w:r>
+      <w:proofErr w:type="spellEnd"/>
+      <w:r>
+        <w:rPr>
+          <w:sz w:val="18"/>
+          <w:szCs w:val="18"/>
+        </w:rPr>
+        <w:t xml:space="preserve"> </w:t>
+      </w:r>
+      <w:proofErr w:type="spellStart"/>
+      <w:r>
+        <w:rPr>
+          <w:sz w:val="18"/>
+          <w:szCs w:val="18"/>
+        </w:rPr>
+        <w:t>Check</w:t>
+      </w:r>
+      <w:proofErr w:type="spellEnd"/>
     </w:p>
     <w:p>
       <w:pPr>
@@ -1123,7 +1312,6 @@
           <w:noProof/>
           <w:color w:val="000000" w:themeColor="text1"/>
         </w:rPr>
-        <w:lastRenderedPageBreak/>
         <w:drawing>
           <wp:inline distT="0" distB="0" distL="0" distR="0" wp14:anchorId="6EBC854C" wp14:editId="09A00790">
             <wp:extent cx="3139440" cy="1125249"/>
@@ -1698,18 +1886,16 @@
         <w:pStyle w:val="PargrafodaLista"/>
         <w:jc w:val="both"/>
         <w:rPr>
-          <w:b/>
-          <w:bCs/>
-        </w:rPr>
-      </w:pPr>
-    </w:p>
-    <w:p>
-      <w:pPr>
-        <w:pStyle w:val="PargrafodaLista"/>
-        <w:jc w:val="both"/>
-        <w:rPr>
-          <w:b/>
-          <w:bCs/>
+          <w:u w:val="single"/>
+        </w:rPr>
+      </w:pPr>
+    </w:p>
+    <w:p>
+      <w:pPr>
+        <w:pStyle w:val="PargrafodaLista"/>
+        <w:jc w:val="both"/>
+        <w:rPr>
+          <w:u w:val="single"/>
         </w:rPr>
       </w:pPr>
     </w:p>
@@ -1749,19 +1935,7 @@
         <w:t xml:space="preserve">STEP_PER_EPOCH = </w:t>
       </w:r>
       <w:r>
-        <w:t>(</w:t>
-      </w:r>
-      <w:r>
-        <w:t>347</w:t>
-      </w:r>
-      <w:r>
-        <w:t>) e EPOCHS = (</w:t>
-      </w:r>
-      <w:r>
-        <w:t>5</w:t>
-      </w:r>
-      <w:r>
-        <w:t>)</w:t>
+        <w:t>(347) e EPOCHS = (5)</w:t>
       </w:r>
     </w:p>
     <w:p>
@@ -1798,13 +1972,7 @@
         <w:t xml:space="preserve"> </w:t>
       </w:r>
       <w:r>
-        <w:t xml:space="preserve">Tanto as configurações voltadas para o carregamento dos dados, quanto as configurações exigidas pela arquitetura Vision Transformers estão descritas na Figura </w:t>
-      </w:r>
-      <w:r>
-        <w:t>2</w:t>
-      </w:r>
-      <w:r>
-        <w:t>.</w:t>
+        <w:t>Tanto as configurações voltadas para o carregamento dos dados, quanto as configurações exigidas pela arquitetura Vision Transformers estão descritas na Figura 2.</w:t>
       </w:r>
     </w:p>
     <w:p>
@@ -1832,20 +2000,27 @@
           <w:sz w:val="18"/>
           <w:szCs w:val="18"/>
         </w:rPr>
-        <w:t xml:space="preserve"> 1</w:t>
+        <w:t xml:space="preserve"> </w:t>
       </w:r>
       <w:r>
         <w:rPr>
           <w:sz w:val="18"/>
           <w:szCs w:val="18"/>
         </w:rPr>
-        <w:t xml:space="preserve">: </w:t>
+        <w:t>4</w:t>
       </w:r>
       <w:r>
         <w:rPr>
           <w:sz w:val="18"/>
           <w:szCs w:val="18"/>
         </w:rPr>
+        <w:t xml:space="preserve">: </w:t>
+      </w:r>
+      <w:r>
+        <w:rPr>
+          <w:sz w:val="18"/>
+          <w:szCs w:val="18"/>
+        </w:rPr>
         <w:t xml:space="preserve">Parâmetros utilizados para o treinamento deste teste </w:t>
       </w:r>
     </w:p>
@@ -1856,9 +2031,12 @@
         <w:jc w:val="center"/>
       </w:pPr>
       <w:r>
+        <w:rPr>
+          <w:noProof/>
+        </w:rPr>
         <w:drawing>
-          <wp:inline distT="0" distB="0" distL="0" distR="0" wp14:anchorId="512A0F19" wp14:editId="56A0A6F5">
-            <wp:extent cx="4062217" cy="2857500"/>
+          <wp:inline distT="0" distB="0" distL="0" distR="0" wp14:anchorId="512A0F19" wp14:editId="64BAB583">
+            <wp:extent cx="3695700" cy="2599679"/>
             <wp:effectExtent l="0" t="0" r="0" b="0"/>
             <wp:docPr id="727332644" name="Imagem 1"/>
             <wp:cNvGraphicFramePr>
@@ -1880,7 +2058,7 @@
                   <pic:spPr>
                     <a:xfrm>
                       <a:off x="0" y="0"/>
-                      <a:ext cx="4071844" cy="2864272"/>
+                      <a:ext cx="3711131" cy="2610534"/>
                     </a:xfrm>
                     <a:prstGeom prst="rect">
                       <a:avLst/>
@@ -2000,6 +2178,24 @@
           <w:iCs/>
           <w:color w:val="000000" w:themeColor="text1"/>
         </w:rPr>
+        <w:t>Pycharm</w:t>
+      </w:r>
+      <w:proofErr w:type="spellEnd"/>
+      <w:r>
+        <w:rPr>
+          <w:i/>
+          <w:iCs/>
+          <w:color w:val="000000" w:themeColor="text1"/>
+        </w:rPr>
+        <w:t xml:space="preserve"> LOGS\</w:t>
+      </w:r>
+      <w:proofErr w:type="spellStart"/>
+      <w:r>
+        <w:rPr>
+          <w:i/>
+          <w:iCs/>
+          <w:color w:val="000000" w:themeColor="text1"/>
+        </w:rPr>
         <w:t>Main</w:t>
       </w:r>
       <w:proofErr w:type="spellEnd"/>
@@ -2086,10 +2282,6 @@
         <w:pStyle w:val="PargrafodaLista"/>
         <w:ind w:left="1440"/>
         <w:jc w:val="both"/>
-        <w:rPr>
-          <w:b/>
-          <w:bCs/>
-        </w:rPr>
       </w:pPr>
       <w:r>
         <w:rPr>
@@ -2197,7 +2389,92 @@
         <w:pStyle w:val="PargrafodaLista"/>
         <w:ind w:left="1440"/>
         <w:jc w:val="both"/>
-      </w:pPr>
+        <w:rPr>
+          <w:b/>
+          <w:bCs/>
+        </w:rPr>
+      </w:pPr>
+    </w:p>
+    <w:p>
+      <w:pPr>
+        <w:pStyle w:val="PargrafodaLista"/>
+        <w:ind w:left="1440"/>
+        <w:jc w:val="center"/>
+      </w:pPr>
+      <w:r>
+        <w:rPr>
+          <w:sz w:val="18"/>
+          <w:szCs w:val="18"/>
+        </w:rPr>
+        <w:t>Figura</w:t>
+      </w:r>
+      <w:r>
+        <w:rPr>
+          <w:sz w:val="18"/>
+          <w:szCs w:val="18"/>
+        </w:rPr>
+        <w:t xml:space="preserve"> </w:t>
+      </w:r>
+      <w:r>
+        <w:rPr>
+          <w:sz w:val="18"/>
+          <w:szCs w:val="18"/>
+        </w:rPr>
+        <w:t>5</w:t>
+      </w:r>
+      <w:r>
+        <w:rPr>
+          <w:sz w:val="18"/>
+          <w:szCs w:val="18"/>
+        </w:rPr>
+        <w:t xml:space="preserve">: </w:t>
+      </w:r>
+      <w:r>
+        <w:rPr>
+          <w:sz w:val="18"/>
+          <w:szCs w:val="18"/>
+        </w:rPr>
+        <w:t>Resultados obtidos d</w:t>
+      </w:r>
+      <w:r>
+        <w:rPr>
+          <w:sz w:val="18"/>
+          <w:szCs w:val="18"/>
+        </w:rPr>
+        <w:t xml:space="preserve">o treinamento </w:t>
+      </w:r>
+      <w:r>
+        <w:rPr>
+          <w:sz w:val="18"/>
+          <w:szCs w:val="18"/>
+        </w:rPr>
+        <w:t xml:space="preserve">no teste de </w:t>
+      </w:r>
+      <w:proofErr w:type="spellStart"/>
+      <w:r>
+        <w:rPr>
+          <w:sz w:val="18"/>
+          <w:szCs w:val="18"/>
+        </w:rPr>
+        <w:t>Sanity</w:t>
+      </w:r>
+      <w:proofErr w:type="spellEnd"/>
+      <w:r>
+        <w:rPr>
+          <w:sz w:val="18"/>
+          <w:szCs w:val="18"/>
+        </w:rPr>
+        <w:t xml:space="preserve"> </w:t>
+      </w:r>
+      <w:proofErr w:type="spellStart"/>
+      <w:r>
+        <w:rPr>
+          <w:sz w:val="18"/>
+          <w:szCs w:val="18"/>
+        </w:rPr>
+        <w:t>Check</w:t>
+      </w:r>
+      <w:proofErr w:type="spellEnd"/>
     </w:p>
     <w:p>
       <w:pPr>
@@ -2206,6 +2483,9 @@
         <w:jc w:val="center"/>
       </w:pPr>
       <w:r>
+        <w:rPr>
+          <w:noProof/>
+        </w:rPr>
         <w:drawing>
           <wp:inline distT="0" distB="0" distL="0" distR="0" wp14:anchorId="6BADE346" wp14:editId="29F08715">
             <wp:extent cx="3359150" cy="1168143"/>
@@ -2280,14 +2560,7 @@
           <w:b/>
           <w:bCs/>
         </w:rPr>
-        <w:t xml:space="preserve">saudável e esperado para </w:t>
-      </w:r>
-      <w:r>
-        <w:rPr>
-          <w:b/>
-          <w:bCs/>
-        </w:rPr>
-        <w:t>este teste</w:t>
+        <w:t>saudável e esperado para este teste</w:t>
       </w:r>
       <w:r>
         <w:t xml:space="preserve">. A </w:t>
@@ -2326,7 +2599,106 @@
         <w:t>,</w:t>
       </w:r>
       <w:r>
-        <w:t xml:space="preserve"> qualquer predição razoável tende a acertar no top-5 automaticamente. </w:t>
+        <w:t xml:space="preserve"> qualquer predição razoável tende a acertar no top-5 automaticament</w:t>
+      </w:r>
+      <w:r>
+        <w:t>e.</w:t>
+      </w:r>
+    </w:p>
+    <w:p>
+      <w:pPr>
+        <w:pStyle w:val="PargrafodaLista"/>
+        <w:ind w:left="2160"/>
+        <w:jc w:val="both"/>
+        <w:rPr>
+          <w:b/>
+          <w:bCs/>
+        </w:rPr>
+      </w:pPr>
+    </w:p>
+    <w:p>
+      <w:pPr>
+        <w:pStyle w:val="PargrafodaLista"/>
+        <w:ind w:left="1440"/>
+        <w:jc w:val="center"/>
+      </w:pPr>
+      <w:r>
+        <w:rPr>
+          <w:sz w:val="18"/>
+          <w:szCs w:val="18"/>
+        </w:rPr>
+        <w:lastRenderedPageBreak/>
+        <w:t>Figura</w:t>
+      </w:r>
+      <w:r>
+        <w:rPr>
+          <w:sz w:val="18"/>
+          <w:szCs w:val="18"/>
+        </w:rPr>
+        <w:t xml:space="preserve"> </w:t>
+      </w:r>
+      <w:r>
+        <w:rPr>
+          <w:sz w:val="18"/>
+          <w:szCs w:val="18"/>
+        </w:rPr>
+        <w:t>6</w:t>
+      </w:r>
+      <w:r>
+        <w:rPr>
+          <w:sz w:val="18"/>
+          <w:szCs w:val="18"/>
+        </w:rPr>
+        <w:t xml:space="preserve">: </w:t>
+      </w:r>
+      <w:r>
+        <w:rPr>
+          <w:sz w:val="18"/>
+          <w:szCs w:val="18"/>
+        </w:rPr>
+        <w:t>Resultados obtidos d</w:t>
+      </w:r>
+      <w:r>
+        <w:rPr>
+          <w:sz w:val="18"/>
+          <w:szCs w:val="18"/>
+        </w:rPr>
+        <w:t xml:space="preserve">a validação </w:t>
+      </w:r>
+      <w:r>
+        <w:rPr>
+          <w:sz w:val="18"/>
+          <w:szCs w:val="18"/>
+        </w:rPr>
+        <w:t xml:space="preserve">no teste de </w:t>
+      </w:r>
+      <w:proofErr w:type="spellStart"/>
+      <w:r>
+        <w:rPr>
+          <w:sz w:val="18"/>
+          <w:szCs w:val="18"/>
+        </w:rPr>
+        <w:t>Sanity</w:t>
+      </w:r>
+      <w:proofErr w:type="spellEnd"/>
+      <w:r>
+        <w:rPr>
+          <w:sz w:val="18"/>
+          <w:szCs w:val="18"/>
+        </w:rPr>
+        <w:t xml:space="preserve"> </w:t>
+      </w:r>
+      <w:proofErr w:type="spellStart"/>
+      <w:r>
+        <w:rPr>
+          <w:sz w:val="18"/>
+          <w:szCs w:val="18"/>
+        </w:rPr>
+        <w:t>Check</w:t>
+      </w:r>
+      <w:proofErr w:type="spellEnd"/>
+      <w:r>
+        <w:t xml:space="preserve"> </w:t>
       </w:r>
     </w:p>
     <w:p>
@@ -2335,7 +2707,9 @@
         <w:jc w:val="center"/>
       </w:pPr>
       <w:r>
-        <w:lastRenderedPageBreak/>
+        <w:rPr>
+          <w:noProof/>
+        </w:rPr>
         <w:drawing>
           <wp:inline distT="0" distB="0" distL="0" distR="0" wp14:anchorId="3297722D" wp14:editId="6539574C">
             <wp:extent cx="2306983" cy="1193800"/>
@@ -2455,18 +2829,6 @@
         </w:rPr>
         <w:t>Para os próximos testes, isso DEVE ser avaliado.</w:t>
       </w:r>
-    </w:p>
-    <w:p>
-      <w:pPr>
-        <w:pStyle w:val="PargrafodaLista"/>
-        <w:ind w:left="2160"/>
-        <w:jc w:val="both"/>
-      </w:pPr>
-    </w:p>
-    <w:p>
-      <w:pPr>
-        <w:pStyle w:val="PargrafodaLista"/>
-      </w:pPr>
     </w:p>
     <w:p>
       <w:pPr>
@@ -2643,15 +3005,6 @@
     <w:p>
       <w:pPr>
         <w:pStyle w:val="PargrafodaLista"/>
-        <w:rPr>
-          <w:b/>
-          <w:bCs/>
-        </w:rPr>
-      </w:pPr>
-    </w:p>
-    <w:p>
-      <w:pPr>
-        <w:pStyle w:val="PargrafodaLista"/>
         <w:numPr>
           <w:ilvl w:val="0"/>
           <w:numId w:val="1"/>
@@ -2687,17 +3040,1361 @@
           <w:b/>
           <w:bCs/>
         </w:rPr>
-        <w:t xml:space="preserve">II – ANÁLISE DOS RÓTULOS DE VALIDAÇÃO: </w:t>
-      </w:r>
-    </w:p>
-    <w:p>
-      <w:pPr>
-        <w:pStyle w:val="PargrafodaLista"/>
-        <w:rPr>
-          <w:b/>
-          <w:bCs/>
-        </w:rPr>
-      </w:pPr>
+        <w:t>II – ANÁLISE DOS RÓTULOS DE VALIDAÇÃO:</w:t>
+      </w:r>
+    </w:p>
+    <w:p>
+      <w:pPr>
+        <w:pStyle w:val="PargrafodaLista"/>
+        <w:rPr>
+          <w:b/>
+          <w:bCs/>
+        </w:rPr>
+      </w:pPr>
+    </w:p>
+    <w:p>
+      <w:pPr>
+        <w:pStyle w:val="PargrafodaLista"/>
+        <w:numPr>
+          <w:ilvl w:val="0"/>
+          <w:numId w:val="20"/>
+        </w:numPr>
+        <w:jc w:val="both"/>
+      </w:pPr>
+      <w:r>
+        <w:t xml:space="preserve">Do ponto de vista funcional, o </w:t>
+      </w:r>
+      <w:proofErr w:type="spellStart"/>
+      <w:r>
+        <w:rPr>
+          <w:i/>
+          <w:iCs/>
+        </w:rPr>
+        <w:t>DataLoader</w:t>
+      </w:r>
+      <w:proofErr w:type="spellEnd"/>
+      <w:r>
+        <w:t xml:space="preserve"> funciona: ele carrega imagens, cria splits treino/validação, aplica </w:t>
+      </w:r>
+      <w:proofErr w:type="spellStart"/>
+      <w:r>
+        <w:rPr>
+          <w:i/>
+          <w:iCs/>
+        </w:rPr>
+        <w:t>augmentations</w:t>
+      </w:r>
+      <w:proofErr w:type="spellEnd"/>
+      <w:r>
+        <w:t xml:space="preserve">, normaliza os pixels e entrega </w:t>
+      </w:r>
+      <w:proofErr w:type="spellStart"/>
+      <w:r>
+        <w:rPr>
+          <w:i/>
+          <w:iCs/>
+        </w:rPr>
+        <w:t>tf.</w:t>
+      </w:r>
+      <w:proofErr w:type="gramStart"/>
+      <w:r>
+        <w:rPr>
+          <w:i/>
+          <w:iCs/>
+        </w:rPr>
+        <w:t>data.Dataset</w:t>
+      </w:r>
+      <w:proofErr w:type="spellEnd"/>
+      <w:proofErr w:type="gramEnd"/>
+      <w:r>
+        <w:t xml:space="preserve"> válidos</w:t>
+      </w:r>
+      <w:r>
+        <w:t xml:space="preserve">. </w:t>
+      </w:r>
+      <w:r>
+        <w:t xml:space="preserve">No entanto, do ponto de vista metodológico e estatístico, esse </w:t>
+      </w:r>
+      <w:proofErr w:type="spellStart"/>
+      <w:r>
+        <w:rPr>
+          <w:i/>
+          <w:iCs/>
+        </w:rPr>
+        <w:t>loader</w:t>
+      </w:r>
+      <w:proofErr w:type="spellEnd"/>
+      <w:r>
+        <w:t xml:space="preserve"> não </w:t>
+      </w:r>
+      <w:r>
+        <w:t>era</w:t>
+      </w:r>
+      <w:r>
+        <w:t xml:space="preserve"> compatível com a forma </w:t>
+      </w:r>
+      <w:r>
+        <w:t>de implementação</w:t>
+      </w:r>
+      <w:r>
+        <w:t xml:space="preserve"> o trainer, nem com o que </w:t>
+      </w:r>
+      <w:r>
+        <w:t>era</w:t>
+      </w:r>
+      <w:r>
+        <w:t xml:space="preserve"> espera</w:t>
+      </w:r>
+      <w:r>
+        <w:t>do</w:t>
+      </w:r>
+      <w:r>
+        <w:t xml:space="preserve"> validar. </w:t>
+      </w:r>
+    </w:p>
+    <w:p>
+      <w:pPr>
+        <w:pStyle w:val="PargrafodaLista"/>
+        <w:ind w:left="2124"/>
+        <w:jc w:val="both"/>
+      </w:pPr>
+    </w:p>
+    <w:p>
+      <w:pPr>
+        <w:pStyle w:val="PargrafodaLista"/>
+        <w:numPr>
+          <w:ilvl w:val="0"/>
+          <w:numId w:val="21"/>
+        </w:numPr>
+        <w:ind w:left="1776"/>
+        <w:jc w:val="both"/>
+      </w:pPr>
+      <w:r>
+        <w:rPr>
+          <w:b/>
+          <w:bCs/>
+        </w:rPr>
+        <w:t>P</w:t>
+      </w:r>
+      <w:r>
+        <w:rPr>
+          <w:b/>
+          <w:bCs/>
+        </w:rPr>
+        <w:t>rimeiro ponto crítico</w:t>
+      </w:r>
+      <w:r>
+        <w:rPr>
+          <w:b/>
+          <w:bCs/>
+        </w:rPr>
+        <w:t>:</w:t>
+      </w:r>
+      <w:r>
+        <w:t xml:space="preserve"> </w:t>
+      </w:r>
+      <w:r>
+        <w:t xml:space="preserve">uso de </w:t>
+      </w:r>
+      <w:proofErr w:type="spellStart"/>
+      <w:r>
+        <w:rPr>
+          <w:i/>
+          <w:iCs/>
+        </w:rPr>
+        <w:t>image_dataset_from_directory</w:t>
+      </w:r>
+      <w:proofErr w:type="spellEnd"/>
+      <w:r>
+        <w:t xml:space="preserve"> com </w:t>
+      </w:r>
+      <w:proofErr w:type="spellStart"/>
+      <w:r>
+        <w:rPr>
+          <w:i/>
+          <w:iCs/>
+        </w:rPr>
+        <w:t>validation_split</w:t>
+      </w:r>
+      <w:proofErr w:type="spellEnd"/>
+      <w:r>
+        <w:t xml:space="preserve"> no mesmo diretório raiz. Esse método assume que todas as classes estão perfeitamente balanceadas e distribuídas de forma aleatória no </w:t>
+      </w:r>
+      <w:proofErr w:type="spellStart"/>
+      <w:r>
+        <w:t>filesystem</w:t>
+      </w:r>
+      <w:proofErr w:type="spellEnd"/>
+      <w:r>
+        <w:t xml:space="preserve">, o que raramente é verdade em </w:t>
+      </w:r>
+      <w:proofErr w:type="spellStart"/>
+      <w:r>
+        <w:t>datasets</w:t>
+      </w:r>
+      <w:proofErr w:type="spellEnd"/>
+      <w:r>
+        <w:t xml:space="preserve"> reais. O split é feito por ordem interna do </w:t>
+      </w:r>
+      <w:proofErr w:type="spellStart"/>
+      <w:r>
+        <w:t>loader</w:t>
+      </w:r>
+      <w:proofErr w:type="spellEnd"/>
+      <w:r>
+        <w:t>, não por semântica da classe.</w:t>
+      </w:r>
+    </w:p>
+    <w:p>
+      <w:pPr>
+        <w:pStyle w:val="PargrafodaLista"/>
+        <w:ind w:left="2412"/>
+        <w:jc w:val="both"/>
+      </w:pPr>
+    </w:p>
+    <w:p>
+      <w:pPr>
+        <w:pStyle w:val="PargrafodaLista"/>
+        <w:numPr>
+          <w:ilvl w:val="0"/>
+          <w:numId w:val="21"/>
+        </w:numPr>
+        <w:ind w:left="1776"/>
+        <w:jc w:val="both"/>
+      </w:pPr>
+      <w:r>
+        <w:rPr>
+          <w:b/>
+          <w:bCs/>
+        </w:rPr>
+        <w:t>S</w:t>
+      </w:r>
+      <w:r>
+        <w:rPr>
+          <w:b/>
+          <w:bCs/>
+        </w:rPr>
+        <w:t>egundo ponto</w:t>
+      </w:r>
+      <w:r>
+        <w:rPr>
+          <w:b/>
+          <w:bCs/>
+        </w:rPr>
+        <w:t xml:space="preserve"> crítico</w:t>
+      </w:r>
+      <w:r>
+        <w:t>:</w:t>
+      </w:r>
+      <w:r>
+        <w:t xml:space="preserve"> </w:t>
+      </w:r>
+      <w:r>
+        <w:t>aplicação de</w:t>
+      </w:r>
+      <w:r>
+        <w:t xml:space="preserve"> </w:t>
+      </w:r>
+      <w:proofErr w:type="spellStart"/>
+      <w:r>
+        <w:t>augmentations</w:t>
+      </w:r>
+      <w:proofErr w:type="spellEnd"/>
+      <w:r>
+        <w:t xml:space="preserve"> pesadas apenas no treino, </w:t>
+      </w:r>
+      <w:r>
+        <w:t>enquanto</w:t>
+      </w:r>
+      <w:r>
+        <w:t xml:space="preserve"> a validação recebe imagens apenas redimensionadas e normalizadas. Isso em si é correto, </w:t>
+      </w:r>
+      <w:r>
+        <w:rPr>
+          <w:i/>
+          <w:iCs/>
+        </w:rPr>
+        <w:t>desde que</w:t>
+      </w:r>
+      <w:r>
+        <w:t xml:space="preserve"> o pré-processamento geométrico de treino e validação seja compatível. Na prática</w:t>
+      </w:r>
+      <w:r>
+        <w:t xml:space="preserve">, </w:t>
+      </w:r>
+      <w:r>
+        <w:t xml:space="preserve">o modelo </w:t>
+      </w:r>
+      <w:proofErr w:type="spellStart"/>
+      <w:proofErr w:type="gramStart"/>
+      <w:r>
+        <w:t>analisa</w:t>
+      </w:r>
+      <w:r>
+        <w:t>,sub</w:t>
+      </w:r>
+      <w:proofErr w:type="spellEnd"/>
+      <w:proofErr w:type="gramEnd"/>
+      <w:r>
+        <w:t>-regiões aleatórias das imagens</w:t>
+      </w:r>
+      <w:r>
+        <w:t xml:space="preserve"> no treino</w:t>
+      </w:r>
+      <w:r>
+        <w:t xml:space="preserve">, enquanto na validação ele vê a imagem inteira redimensionada. </w:t>
+      </w:r>
+      <w:r>
+        <w:t>I</w:t>
+      </w:r>
+      <w:r>
+        <w:t xml:space="preserve">sso frequentemente gera quebra </w:t>
+      </w:r>
+      <w:r>
+        <w:lastRenderedPageBreak/>
+        <w:t xml:space="preserve">total de generalização, resultando exatamente no padrão que </w:t>
+      </w:r>
+      <w:r>
+        <w:t>foi</w:t>
+      </w:r>
+      <w:r>
+        <w:t xml:space="preserve"> observ</w:t>
+      </w:r>
+      <w:r>
+        <w:t>ado</w:t>
+      </w:r>
+      <w:r>
+        <w:t>: treino aprende algo, validação nunca acerta.</w:t>
+      </w:r>
+    </w:p>
+    <w:p>
+      <w:pPr>
+        <w:pStyle w:val="PargrafodaLista"/>
+        <w:ind w:left="1776"/>
+        <w:jc w:val="both"/>
+      </w:pPr>
+    </w:p>
+    <w:p>
+      <w:pPr>
+        <w:pStyle w:val="PargrafodaLista"/>
+        <w:numPr>
+          <w:ilvl w:val="0"/>
+          <w:numId w:val="21"/>
+        </w:numPr>
+        <w:ind w:left="1776"/>
+        <w:jc w:val="both"/>
+      </w:pPr>
+      <w:r>
+        <w:rPr>
+          <w:b/>
+          <w:bCs/>
+        </w:rPr>
+        <w:t>Terceiro</w:t>
+      </w:r>
+      <w:r>
+        <w:rPr>
+          <w:b/>
+          <w:bCs/>
+        </w:rPr>
+        <w:t xml:space="preserve"> ponto crítico</w:t>
+      </w:r>
+      <w:r>
+        <w:t>:</w:t>
+      </w:r>
+      <w:r>
+        <w:t xml:space="preserve"> </w:t>
+      </w:r>
+      <w:r>
+        <w:t>fixação de</w:t>
+      </w:r>
+      <w:r>
+        <w:t xml:space="preserve"> </w:t>
+      </w:r>
+      <w:proofErr w:type="spellStart"/>
+      <w:r>
+        <w:t>steps_per_epoch</w:t>
+      </w:r>
+      <w:proofErr w:type="spellEnd"/>
+      <w:r>
+        <w:t xml:space="preserve"> e </w:t>
+      </w:r>
+      <w:proofErr w:type="spellStart"/>
+      <w:r>
+        <w:t>validation_steps</w:t>
+      </w:r>
+      <w:proofErr w:type="spellEnd"/>
+      <w:r>
+        <w:t xml:space="preserve"> manualmente no trainer, enquanto o </w:t>
+      </w:r>
+      <w:proofErr w:type="spellStart"/>
+      <w:r>
+        <w:t>DataLoader</w:t>
+      </w:r>
+      <w:proofErr w:type="spellEnd"/>
+      <w:r>
+        <w:t xml:space="preserve"> já entrega </w:t>
+      </w:r>
+      <w:proofErr w:type="spellStart"/>
+      <w:r>
+        <w:t>datasets</w:t>
+      </w:r>
+      <w:proofErr w:type="spellEnd"/>
+      <w:r>
+        <w:t xml:space="preserve"> com cardinalidade definida. Isso cria uma situação em que o </w:t>
+      </w:r>
+      <w:proofErr w:type="spellStart"/>
+      <w:r>
+        <w:t>Keras</w:t>
+      </w:r>
+      <w:proofErr w:type="spellEnd"/>
+      <w:r>
+        <w:t xml:space="preserve"> não está necessariamente avaliando todas as amostras de validação, e pode estar avaliando batches repetidos ou truncados. Em </w:t>
+      </w:r>
+      <w:proofErr w:type="spellStart"/>
+      <w:r>
+        <w:t>datasets</w:t>
+      </w:r>
+      <w:proofErr w:type="spellEnd"/>
+      <w:r>
+        <w:t xml:space="preserve"> pequenos, isso é devastador</w:t>
+      </w:r>
+      <w:r>
+        <w:t>.</w:t>
+      </w:r>
+    </w:p>
+    <w:p>
+      <w:pPr>
+        <w:pStyle w:val="PargrafodaLista"/>
+        <w:rPr>
+          <w:b/>
+          <w:bCs/>
+        </w:rPr>
+      </w:pPr>
+    </w:p>
+    <w:p>
+      <w:pPr>
+        <w:pStyle w:val="PargrafodaLista"/>
+        <w:numPr>
+          <w:ilvl w:val="0"/>
+          <w:numId w:val="20"/>
+        </w:numPr>
+        <w:jc w:val="both"/>
+      </w:pPr>
+      <w:r>
+        <w:rPr>
+          <w:b/>
+          <w:bCs/>
+        </w:rPr>
+        <w:t>Correções</w:t>
+      </w:r>
+      <w:r>
+        <w:rPr>
+          <w:b/>
+          <w:bCs/>
+        </w:rPr>
+        <w:t xml:space="preserve">: </w:t>
+      </w:r>
+      <w:r>
+        <w:t xml:space="preserve">Os scripts de carregamento de dados foram reescritos, evitando os erros previamente discutidos. Adicionalmente, as funções definidas foram alocadas no arquivo ResNet50_Utils.py, separando-a do arquivo </w:t>
+      </w:r>
+      <w:proofErr w:type="spellStart"/>
+      <w:r>
+        <w:t>DataLoader</w:t>
+      </w:r>
+      <w:proofErr w:type="spellEnd"/>
+      <w:r>
+        <w:t xml:space="preserve"> original, o qual servia para carregar a base tanto para a ViT quanto para a </w:t>
+      </w:r>
+      <w:proofErr w:type="spellStart"/>
+      <w:r>
+        <w:t>ResNet</w:t>
+      </w:r>
+      <w:proofErr w:type="spellEnd"/>
+    </w:p>
+    <w:p>
+      <w:pPr>
+        <w:pStyle w:val="PargrafodaLista"/>
+        <w:ind w:left="1488"/>
+        <w:jc w:val="both"/>
+        <w:rPr>
+          <w:b/>
+          <w:bCs/>
+        </w:rPr>
+      </w:pPr>
+    </w:p>
+    <w:p>
+      <w:pPr>
+        <w:pStyle w:val="PargrafodaLista"/>
+        <w:ind w:left="1488"/>
+        <w:jc w:val="both"/>
+      </w:pPr>
+      <w:r>
+        <w:t xml:space="preserve">Também </w:t>
+      </w:r>
+      <w:r>
+        <w:t xml:space="preserve">foi criado uma função para dividir a base de dados antes do treinamento entre treino e validação, permitindo manter a base consistente entre os diferentes treinos conduzidos. Agora, a estrutura esperada segue conforme ilustrado pela figura </w:t>
+      </w:r>
+      <w:r>
+        <w:t>7.</w:t>
+      </w:r>
+    </w:p>
+    <w:p>
+      <w:pPr>
+        <w:pStyle w:val="PargrafodaLista"/>
+        <w:ind w:left="1488"/>
+        <w:jc w:val="both"/>
+      </w:pPr>
+    </w:p>
+    <w:p>
+      <w:pPr>
+        <w:pStyle w:val="PargrafodaLista"/>
+        <w:ind w:left="1440"/>
+        <w:jc w:val="center"/>
+      </w:pPr>
+      <w:r>
+        <w:rPr>
+          <w:sz w:val="18"/>
+          <w:szCs w:val="18"/>
+        </w:rPr>
+        <w:t>Figura</w:t>
+      </w:r>
+      <w:r>
+        <w:rPr>
+          <w:sz w:val="18"/>
+          <w:szCs w:val="18"/>
+        </w:rPr>
+        <w:t xml:space="preserve"> 7</w:t>
+      </w:r>
+      <w:r>
+        <w:rPr>
+          <w:sz w:val="18"/>
+          <w:szCs w:val="18"/>
+        </w:rPr>
+        <w:t xml:space="preserve">: </w:t>
+      </w:r>
+      <w:r>
+        <w:rPr>
+          <w:sz w:val="18"/>
+          <w:szCs w:val="18"/>
+        </w:rPr>
+        <w:t>Estrutura esperada para a base de dados</w:t>
+      </w:r>
+    </w:p>
+    <w:p>
+      <w:pPr>
+        <w:pStyle w:val="PargrafodaLista"/>
+        <w:ind w:left="1416"/>
+        <w:jc w:val="center"/>
+        <w:rPr>
+          <w:b/>
+          <w:bCs/>
+        </w:rPr>
+      </w:pPr>
+      <w:r>
+        <w:rPr>
+          <w:b/>
+          <w:bCs/>
+        </w:rPr>
+        <w:drawing>
+          <wp:inline distT="0" distB="0" distL="0" distR="0" wp14:anchorId="30426B2B" wp14:editId="3CA77113">
+            <wp:extent cx="4084320" cy="1749668"/>
+            <wp:effectExtent l="0" t="0" r="0" b="3175"/>
+            <wp:docPr id="2068883266" name="Imagem 1"/>
+            <wp:cNvGraphicFramePr>
+              <a:graphicFrameLocks xmlns:a="http://schemas.openxmlformats.org/drawingml/2006/main" noChangeAspect="1"/>
+            </wp:cNvGraphicFramePr>
+            <a:graphic xmlns:a="http://schemas.openxmlformats.org/drawingml/2006/main">
+              <a:graphicData uri="http://schemas.openxmlformats.org/drawingml/2006/picture">
+                <pic:pic xmlns:pic="http://schemas.openxmlformats.org/drawingml/2006/picture">
+                  <pic:nvPicPr>
+                    <pic:cNvPr id="2068883266" name=""/>
+                    <pic:cNvPicPr/>
+                  </pic:nvPicPr>
+                  <pic:blipFill>
+                    <a:blip r:embed="rId10"/>
+                    <a:stretch>
+                      <a:fillRect/>
+                    </a:stretch>
+                  </pic:blipFill>
+                  <pic:spPr>
+                    <a:xfrm>
+                      <a:off x="0" y="0"/>
+                      <a:ext cx="4101410" cy="1756989"/>
+                    </a:xfrm>
+                    <a:prstGeom prst="rect">
+                      <a:avLst/>
+                    </a:prstGeom>
+                  </pic:spPr>
+                </pic:pic>
+              </a:graphicData>
+            </a:graphic>
+          </wp:inline>
+        </w:drawing>
+      </w:r>
+    </w:p>
+    <w:p>
+      <w:pPr>
+        <w:pStyle w:val="PargrafodaLista"/>
+        <w:ind w:left="1416"/>
+        <w:jc w:val="center"/>
+        <w:rPr>
+          <w:b/>
+          <w:bCs/>
+        </w:rPr>
+      </w:pPr>
+    </w:p>
+    <w:p>
+      <w:pPr>
+        <w:pStyle w:val="PargrafodaLista"/>
+        <w:rPr>
+          <w:b/>
+          <w:bCs/>
+        </w:rPr>
+      </w:pPr>
+    </w:p>
+    <w:p>
+      <w:pPr>
+        <w:pStyle w:val="PargrafodaLista"/>
+        <w:numPr>
+          <w:ilvl w:val="0"/>
+          <w:numId w:val="20"/>
+        </w:numPr>
+        <w:jc w:val="both"/>
+      </w:pPr>
+      <w:r>
+        <w:rPr>
+          <w:b/>
+          <w:bCs/>
+        </w:rPr>
+        <w:t>Resultados</w:t>
+      </w:r>
+      <w:r>
+        <w:rPr>
+          <w:b/>
+          <w:bCs/>
+        </w:rPr>
+        <w:t>:</w:t>
+      </w:r>
+      <w:r>
+        <w:rPr>
+          <w:b/>
+          <w:bCs/>
+        </w:rPr>
+        <w:t xml:space="preserve"> </w:t>
+      </w:r>
+      <w:r>
+        <w:t>Os</w:t>
+      </w:r>
+      <w:r>
+        <w:rPr>
+          <w:b/>
+          <w:bCs/>
+        </w:rPr>
+        <w:t xml:space="preserve"> </w:t>
+      </w:r>
+      <w:r>
+        <w:rPr>
+          <w:i/>
+          <w:iCs/>
+          <w:color w:val="000000" w:themeColor="text1"/>
+        </w:rPr>
+        <w:t xml:space="preserve">Logs do </w:t>
+      </w:r>
+      <w:proofErr w:type="spellStart"/>
+      <w:r>
+        <w:rPr>
+          <w:i/>
+          <w:iCs/>
+          <w:color w:val="000000" w:themeColor="text1"/>
+        </w:rPr>
+        <w:t>Pycharm</w:t>
+      </w:r>
+      <w:proofErr w:type="spellEnd"/>
+      <w:r>
+        <w:rPr>
+          <w:i/>
+          <w:iCs/>
+          <w:color w:val="000000" w:themeColor="text1"/>
+        </w:rPr>
+        <w:t xml:space="preserve"> </w:t>
+      </w:r>
+      <w:r>
+        <w:rPr>
+          <w:color w:val="000000" w:themeColor="text1"/>
+        </w:rPr>
+        <w:t xml:space="preserve">estão </w:t>
+      </w:r>
+      <w:r>
+        <w:rPr>
+          <w:i/>
+          <w:iCs/>
+          <w:color w:val="000000" w:themeColor="text1"/>
+        </w:rPr>
+        <w:t>localizados em "\Projeto-Classificadores\</w:t>
+      </w:r>
+      <w:proofErr w:type="spellStart"/>
+      <w:r>
+        <w:rPr>
+          <w:i/>
+          <w:iCs/>
+          <w:color w:val="000000" w:themeColor="text1"/>
+        </w:rPr>
+        <w:t>Documentation</w:t>
+      </w:r>
+      <w:proofErr w:type="spellEnd"/>
+      <w:r>
+        <w:rPr>
+          <w:i/>
+          <w:iCs/>
+          <w:color w:val="000000" w:themeColor="text1"/>
+        </w:rPr>
+        <w:t>\</w:t>
+      </w:r>
+      <w:proofErr w:type="spellStart"/>
+      <w:r>
+        <w:rPr>
+          <w:i/>
+          <w:iCs/>
+          <w:color w:val="000000" w:themeColor="text1"/>
+        </w:rPr>
+        <w:t>Pycharm</w:t>
+      </w:r>
+      <w:proofErr w:type="spellEnd"/>
+      <w:r>
+        <w:rPr>
+          <w:i/>
+          <w:iCs/>
+          <w:color w:val="000000" w:themeColor="text1"/>
+        </w:rPr>
+        <w:t xml:space="preserve"> LOGS\</w:t>
+      </w:r>
+      <w:proofErr w:type="spellStart"/>
+      <w:r>
+        <w:rPr>
+          <w:i/>
+          <w:iCs/>
+          <w:color w:val="000000" w:themeColor="text1"/>
+        </w:rPr>
+        <w:t>Main</w:t>
+      </w:r>
+      <w:proofErr w:type="spellEnd"/>
+      <w:r>
+        <w:rPr>
+          <w:i/>
+          <w:iCs/>
+          <w:color w:val="000000" w:themeColor="text1"/>
+        </w:rPr>
+        <w:t xml:space="preserve"> </w:t>
+      </w:r>
+      <w:proofErr w:type="spellStart"/>
+      <w:r>
+        <w:rPr>
+          <w:i/>
+          <w:iCs/>
+          <w:color w:val="000000" w:themeColor="text1"/>
+        </w:rPr>
+        <w:t>ResNet</w:t>
+      </w:r>
+      <w:proofErr w:type="spellEnd"/>
+      <w:r>
+        <w:rPr>
+          <w:i/>
+          <w:iCs/>
+          <w:color w:val="000000" w:themeColor="text1"/>
+        </w:rPr>
+        <w:t xml:space="preserve"> </w:t>
+      </w:r>
+      <w:proofErr w:type="spellStart"/>
+      <w:r>
+        <w:rPr>
+          <w:i/>
+          <w:iCs/>
+          <w:color w:val="000000" w:themeColor="text1"/>
+        </w:rPr>
+        <w:t>Sanity</w:t>
+      </w:r>
+      <w:proofErr w:type="spellEnd"/>
+      <w:r>
+        <w:rPr>
+          <w:i/>
+          <w:iCs/>
+          <w:color w:val="000000" w:themeColor="text1"/>
+        </w:rPr>
+        <w:t xml:space="preserve"> </w:t>
+      </w:r>
+      <w:proofErr w:type="spellStart"/>
+      <w:r>
+        <w:rPr>
+          <w:i/>
+          <w:iCs/>
+          <w:color w:val="000000" w:themeColor="text1"/>
+        </w:rPr>
+        <w:t>Check</w:t>
+      </w:r>
+      <w:proofErr w:type="spellEnd"/>
+      <w:r>
+        <w:rPr>
+          <w:i/>
+          <w:iCs/>
+          <w:color w:val="000000" w:themeColor="text1"/>
+        </w:rPr>
+        <w:t xml:space="preserve"> 2</w:t>
+      </w:r>
+      <w:r>
+        <w:rPr>
+          <w:i/>
+          <w:iCs/>
+          <w:color w:val="000000" w:themeColor="text1"/>
+        </w:rPr>
+        <w:t xml:space="preserve"> - LOG</w:t>
+      </w:r>
+      <w:r>
+        <w:rPr>
+          <w:i/>
+          <w:iCs/>
+          <w:color w:val="000000" w:themeColor="text1"/>
+        </w:rPr>
+        <w:t>.txt"</w:t>
+      </w:r>
+    </w:p>
+    <w:p>
+      <w:pPr>
+        <w:pStyle w:val="PargrafodaLista"/>
+        <w:ind w:left="1488"/>
+        <w:jc w:val="both"/>
+        <w:rPr>
+          <w:b/>
+          <w:bCs/>
+        </w:rPr>
+      </w:pPr>
+    </w:p>
+    <w:p>
+      <w:pPr>
+        <w:pStyle w:val="PargrafodaLista"/>
+        <w:numPr>
+          <w:ilvl w:val="0"/>
+          <w:numId w:val="21"/>
+        </w:numPr>
+        <w:ind w:left="1776"/>
+        <w:jc w:val="both"/>
+      </w:pPr>
+      <w:r>
+        <w:t xml:space="preserve">O início do log confirma que </w:t>
+      </w:r>
+      <w:r>
+        <w:t xml:space="preserve">o </w:t>
+      </w:r>
+      <w:r>
+        <w:t xml:space="preserve">carregamento de dados está correto e consistente. O </w:t>
+      </w:r>
+      <w:proofErr w:type="spellStart"/>
+      <w:r>
+        <w:t>TensorFlow</w:t>
+      </w:r>
+      <w:proofErr w:type="spellEnd"/>
+      <w:r>
+        <w:t xml:space="preserve"> detectou 11.074 imagens para treino e 2.767 para validação, distribuídas em três classes bem definidas</w:t>
+      </w:r>
+      <w:r>
+        <w:t xml:space="preserve">. </w:t>
+      </w:r>
+      <w:r>
+        <w:t>O fato de as classes serem listadas explicitamente indica que a inferência de rótulos a partir da estrutura de diretórios está funcionando</w:t>
+      </w:r>
+      <w:r>
+        <w:t xml:space="preserve"> </w:t>
+      </w:r>
+      <w:r>
+        <w:t>sem ambiguidade ou vazamento entre treino e validação.</w:t>
+      </w:r>
+    </w:p>
+    <w:p>
+      <w:pPr>
+        <w:pStyle w:val="PargrafodaLista"/>
+        <w:ind w:left="1488"/>
+        <w:jc w:val="both"/>
+      </w:pPr>
+    </w:p>
+    <w:p>
+      <w:pPr>
+        <w:pStyle w:val="PargrafodaLista"/>
+        <w:ind w:left="1488"/>
+        <w:jc w:val="both"/>
+      </w:pPr>
+    </w:p>
+    <w:p>
+      <w:pPr>
+        <w:pStyle w:val="PargrafodaLista"/>
+        <w:ind w:left="1488"/>
+        <w:jc w:val="both"/>
+      </w:pPr>
+    </w:p>
+    <w:p>
+      <w:pPr>
+        <w:pStyle w:val="PargrafodaLista"/>
+        <w:ind w:left="1488"/>
+        <w:jc w:val="both"/>
+      </w:pPr>
+    </w:p>
+    <w:p>
+      <w:pPr>
+        <w:pStyle w:val="PargrafodaLista"/>
+        <w:ind w:left="1488"/>
+        <w:jc w:val="both"/>
+      </w:pPr>
+    </w:p>
+    <w:p>
+      <w:pPr>
+        <w:pStyle w:val="PargrafodaLista"/>
+        <w:ind w:left="1488"/>
+        <w:jc w:val="both"/>
+        <w:rPr>
+          <w:b/>
+          <w:bCs/>
+        </w:rPr>
+      </w:pPr>
+    </w:p>
+    <w:p>
+      <w:pPr>
+        <w:pStyle w:val="PargrafodaLista"/>
+        <w:ind w:left="1440"/>
+        <w:jc w:val="center"/>
+      </w:pPr>
+      <w:r>
+        <w:rPr>
+          <w:sz w:val="18"/>
+          <w:szCs w:val="18"/>
+        </w:rPr>
+        <w:t>Figura</w:t>
+      </w:r>
+      <w:r>
+        <w:rPr>
+          <w:sz w:val="18"/>
+          <w:szCs w:val="18"/>
+        </w:rPr>
+        <w:t xml:space="preserve"> </w:t>
+      </w:r>
+      <w:r>
+        <w:rPr>
+          <w:sz w:val="18"/>
+          <w:szCs w:val="18"/>
+        </w:rPr>
+        <w:t>8</w:t>
+      </w:r>
+      <w:r>
+        <w:rPr>
+          <w:sz w:val="18"/>
+          <w:szCs w:val="18"/>
+        </w:rPr>
+        <w:t xml:space="preserve">: </w:t>
+      </w:r>
+      <w:r>
+        <w:rPr>
+          <w:sz w:val="18"/>
+          <w:szCs w:val="18"/>
+        </w:rPr>
+        <w:t>Resultados de treinamento</w:t>
+      </w:r>
+    </w:p>
+    <w:p>
+      <w:pPr>
+        <w:pStyle w:val="PargrafodaLista"/>
+        <w:ind w:left="1488"/>
+        <w:jc w:val="both"/>
+      </w:pPr>
+      <w:r>
+        <w:drawing>
+          <wp:inline distT="0" distB="0" distL="0" distR="0" wp14:anchorId="56F6F10F" wp14:editId="4BD87613">
+            <wp:extent cx="4235778" cy="1363980"/>
+            <wp:effectExtent l="0" t="0" r="0" b="7620"/>
+            <wp:docPr id="1289902230" name="Imagem 1"/>
+            <wp:cNvGraphicFramePr>
+              <a:graphicFrameLocks xmlns:a="http://schemas.openxmlformats.org/drawingml/2006/main" noChangeAspect="1"/>
+            </wp:cNvGraphicFramePr>
+            <a:graphic xmlns:a="http://schemas.openxmlformats.org/drawingml/2006/main">
+              <a:graphicData uri="http://schemas.openxmlformats.org/drawingml/2006/picture">
+                <pic:pic xmlns:pic="http://schemas.openxmlformats.org/drawingml/2006/picture">
+                  <pic:nvPicPr>
+                    <pic:cNvPr id="1116867270" name=""/>
+                    <pic:cNvPicPr/>
+                  </pic:nvPicPr>
+                  <pic:blipFill rotWithShape="1">
+                    <a:blip r:embed="rId11"/>
+                    <a:srcRect l="424" t="4198" r="39575"/>
+                    <a:stretch>
+                      <a:fillRect/>
+                    </a:stretch>
+                  </pic:blipFill>
+                  <pic:spPr bwMode="auto">
+                    <a:xfrm>
+                      <a:off x="0" y="0"/>
+                      <a:ext cx="4243921" cy="1366602"/>
+                    </a:xfrm>
+                    <a:prstGeom prst="rect">
+                      <a:avLst/>
+                    </a:prstGeom>
+                    <a:ln>
+                      <a:noFill/>
+                    </a:ln>
+                    <a:extLst>
+                      <a:ext uri="{53640926-AAD7-44D8-BBD7-CCE9431645EC}">
+                        <a14:shadowObscured xmlns:a14="http://schemas.microsoft.com/office/drawing/2010/main"/>
+                      </a:ext>
+                    </a:extLst>
+                  </pic:spPr>
+                </pic:pic>
+              </a:graphicData>
+            </a:graphic>
+          </wp:inline>
+        </w:drawing>
+      </w:r>
+    </w:p>
+    <w:p>
+      <w:pPr>
+        <w:pStyle w:val="PargrafodaLista"/>
+        <w:ind w:left="0"/>
+        <w:jc w:val="both"/>
+      </w:pPr>
+    </w:p>
+    <w:p>
+      <w:pPr>
+        <w:pStyle w:val="PargrafodaLista"/>
+        <w:ind w:left="0"/>
+        <w:jc w:val="both"/>
+      </w:pPr>
+    </w:p>
+    <w:p>
+      <w:pPr>
+        <w:pStyle w:val="PargrafodaLista"/>
+        <w:numPr>
+          <w:ilvl w:val="0"/>
+          <w:numId w:val="21"/>
+        </w:numPr>
+        <w:ind w:left="1776"/>
+        <w:jc w:val="both"/>
+      </w:pPr>
+      <w:r>
+        <w:t xml:space="preserve">O comportamento da função de perda, demonstra uma queda consistente tanto no treino quanto na validação. O </w:t>
+      </w:r>
+      <w:proofErr w:type="spellStart"/>
+      <w:r>
+        <w:t>loss</w:t>
+      </w:r>
+      <w:proofErr w:type="spellEnd"/>
+      <w:r>
+        <w:t xml:space="preserve"> de treino diminui progressivamente de aproximadamente 2.72 para 1.99 ao longo das cinco épocas</w:t>
+      </w:r>
+      <w:r>
+        <w:t xml:space="preserve"> (Figura 8)</w:t>
+      </w:r>
+      <w:r>
+        <w:t xml:space="preserve">, enquanto o </w:t>
+      </w:r>
+      <w:proofErr w:type="spellStart"/>
+      <w:r>
+        <w:t>loss</w:t>
+      </w:r>
+      <w:proofErr w:type="spellEnd"/>
+      <w:r>
+        <w:t xml:space="preserve"> de validação segue uma trajetória semelhante, caindo de cerca de 2.62 para 1.93</w:t>
+      </w:r>
+      <w:r>
+        <w:t xml:space="preserve"> </w:t>
+      </w:r>
+      <w:r>
+        <w:t xml:space="preserve">(Figura </w:t>
+      </w:r>
+      <w:r>
+        <w:t>9</w:t>
+      </w:r>
+      <w:r>
+        <w:t>)</w:t>
+      </w:r>
+      <w:r>
+        <w:t>. Essa proximidade entre as curvas é um sinal claro de que o modelo está aprendendo padrões reais dos dados.</w:t>
+      </w:r>
+    </w:p>
+    <w:p>
+      <w:pPr>
+        <w:pStyle w:val="PargrafodaLista"/>
+        <w:ind w:left="1008"/>
+      </w:pPr>
+    </w:p>
+    <w:p>
+      <w:pPr>
+        <w:pStyle w:val="PargrafodaLista"/>
+        <w:numPr>
+          <w:ilvl w:val="0"/>
+          <w:numId w:val="21"/>
+        </w:numPr>
+        <w:ind w:left="1776"/>
+        <w:jc w:val="both"/>
+      </w:pPr>
+      <w:r>
+        <w:t>A acurácia de treino se mantém em torno de 43–44%</w:t>
+      </w:r>
+      <w:r>
+        <w:t xml:space="preserve"> </w:t>
+      </w:r>
+      <w:r>
+        <w:t>(Figura 8)</w:t>
+      </w:r>
+      <w:r>
+        <w:t>, enquanto a acurácia de validação alcança cerca de 45%</w:t>
+      </w:r>
+      <w:r>
+        <w:t xml:space="preserve"> </w:t>
+      </w:r>
+      <w:r>
+        <w:t xml:space="preserve">(Figura </w:t>
+      </w:r>
+      <w:r>
+        <w:t>9</w:t>
+      </w:r>
+      <w:r>
+        <w:t>)</w:t>
+      </w:r>
+      <w:r>
+        <w:t xml:space="preserve">. É perfeitamente esperado que a validação fique ligeiramente melhor do que o treino nesse estágio, especialmente porque o conjunto de treino passa por </w:t>
+      </w:r>
+      <w:proofErr w:type="spellStart"/>
+      <w:r>
+        <w:t>augmentations</w:t>
+      </w:r>
+      <w:proofErr w:type="spellEnd"/>
+      <w:r>
+        <w:t xml:space="preserve"> mais agressivas.</w:t>
+      </w:r>
+    </w:p>
+    <w:p>
+      <w:pPr>
+        <w:pStyle w:val="PargrafodaLista"/>
+        <w:ind w:left="0"/>
+        <w:jc w:val="both"/>
+      </w:pPr>
+    </w:p>
+    <w:p>
+      <w:pPr>
+        <w:pStyle w:val="PargrafodaLista"/>
+        <w:ind w:left="0"/>
+        <w:jc w:val="both"/>
+      </w:pPr>
+    </w:p>
+    <w:p>
+      <w:pPr>
+        <w:pStyle w:val="PargrafodaLista"/>
+        <w:ind w:left="1440"/>
+        <w:jc w:val="center"/>
+      </w:pPr>
+      <w:r>
+        <w:rPr>
+          <w:sz w:val="18"/>
+          <w:szCs w:val="18"/>
+        </w:rPr>
+        <w:t>Figura</w:t>
+      </w:r>
+      <w:r>
+        <w:rPr>
+          <w:sz w:val="18"/>
+          <w:szCs w:val="18"/>
+        </w:rPr>
+        <w:t xml:space="preserve"> </w:t>
+      </w:r>
+      <w:r>
+        <w:rPr>
+          <w:sz w:val="18"/>
+          <w:szCs w:val="18"/>
+        </w:rPr>
+        <w:t>9</w:t>
+      </w:r>
+      <w:r>
+        <w:rPr>
+          <w:sz w:val="18"/>
+          <w:szCs w:val="18"/>
+        </w:rPr>
+        <w:t xml:space="preserve">: </w:t>
+      </w:r>
+      <w:r>
+        <w:rPr>
+          <w:sz w:val="18"/>
+          <w:szCs w:val="18"/>
+        </w:rPr>
+        <w:t xml:space="preserve">Resultados de </w:t>
+      </w:r>
+      <w:r>
+        <w:rPr>
+          <w:sz w:val="18"/>
+          <w:szCs w:val="18"/>
+        </w:rPr>
+        <w:t>validação</w:t>
+      </w:r>
+    </w:p>
+    <w:p>
+      <w:pPr>
+        <w:pStyle w:val="PargrafodaLista"/>
+        <w:ind w:left="1776"/>
+        <w:jc w:val="center"/>
+      </w:pPr>
+      <w:r>
+        <w:drawing>
+          <wp:inline distT="0" distB="0" distL="0" distR="0" wp14:anchorId="24C71CB4" wp14:editId="4A6839FB">
+            <wp:extent cx="2972844" cy="1417320"/>
+            <wp:effectExtent l="0" t="0" r="0" b="0"/>
+            <wp:docPr id="1116867270" name="Imagem 1"/>
+            <wp:cNvGraphicFramePr>
+              <a:graphicFrameLocks xmlns:a="http://schemas.openxmlformats.org/drawingml/2006/main" noChangeAspect="1"/>
+            </wp:cNvGraphicFramePr>
+            <a:graphic xmlns:a="http://schemas.openxmlformats.org/drawingml/2006/main">
+              <a:graphicData uri="http://schemas.openxmlformats.org/drawingml/2006/picture">
+                <pic:pic xmlns:pic="http://schemas.openxmlformats.org/drawingml/2006/picture">
+                  <pic:nvPicPr>
+                    <pic:cNvPr id="1116867270" name=""/>
+                    <pic:cNvPicPr/>
+                  </pic:nvPicPr>
+                  <pic:blipFill rotWithShape="1">
+                    <a:blip r:embed="rId11"/>
+                    <a:srcRect l="59476" t="4198"/>
+                    <a:stretch>
+                      <a:fillRect/>
+                    </a:stretch>
+                  </pic:blipFill>
+                  <pic:spPr bwMode="auto">
+                    <a:xfrm>
+                      <a:off x="0" y="0"/>
+                      <a:ext cx="2982117" cy="1421741"/>
+                    </a:xfrm>
+                    <a:prstGeom prst="rect">
+                      <a:avLst/>
+                    </a:prstGeom>
+                    <a:ln>
+                      <a:noFill/>
+                    </a:ln>
+                    <a:extLst>
+                      <a:ext uri="{53640926-AAD7-44D8-BBD7-CCE9431645EC}">
+                        <a14:shadowObscured xmlns:a14="http://schemas.microsoft.com/office/drawing/2010/main"/>
+                      </a:ext>
+                    </a:extLst>
+                  </pic:spPr>
+                </pic:pic>
+              </a:graphicData>
+            </a:graphic>
+          </wp:inline>
+        </w:drawing>
+      </w:r>
+    </w:p>
+    <w:p>
+      <w:pPr>
+        <w:pStyle w:val="PargrafodaLista"/>
+        <w:jc w:val="both"/>
+        <w:rPr>
+          <w:b/>
+          <w:bCs/>
+        </w:rPr>
+      </w:pPr>
+    </w:p>
+    <w:p>
+      <w:pPr>
+        <w:pStyle w:val="PargrafodaLista"/>
+        <w:numPr>
+          <w:ilvl w:val="0"/>
+          <w:numId w:val="20"/>
+        </w:numPr>
+        <w:ind w:left="1416"/>
+        <w:jc w:val="both"/>
+        <w:rPr>
+          <w:b/>
+          <w:bCs/>
+        </w:rPr>
+      </w:pPr>
+      <w:r>
+        <w:rPr>
+          <w:b/>
+          <w:bCs/>
+        </w:rPr>
+        <w:t>Conclusões</w:t>
+      </w:r>
+      <w:r>
+        <w:rPr>
+          <w:b/>
+          <w:bCs/>
+        </w:rPr>
+        <w:t xml:space="preserve">: </w:t>
+      </w:r>
+      <w:r>
+        <w:t xml:space="preserve">Em termos </w:t>
+      </w:r>
+      <w:r>
+        <w:t>gerais,</w:t>
+      </w:r>
+      <w:r>
+        <w:t xml:space="preserve"> este experimento demonstra que o modelo aprende, que a perda diminui, que treino e validação são coerentes entre si e que não há falhas estruturais no pipeline</w:t>
+      </w:r>
+      <w:r>
+        <w:t>. É possível</w:t>
+      </w:r>
+      <w:r>
+        <w:t xml:space="preserve"> seguir com segurança para experimentos mais longos</w:t>
+      </w:r>
+      <w:r>
+        <w:t>.</w:t>
+      </w:r>
+    </w:p>
+    <w:p>
+      <w:pPr>
+        <w:pStyle w:val="PargrafodaLista"/>
+        <w:ind w:left="1416"/>
+        <w:jc w:val="both"/>
+        <w:rPr>
+          <w:b/>
+          <w:bCs/>
+        </w:rPr>
+      </w:pPr>
+    </w:p>
+    <w:p>
+      <w:pPr>
+        <w:pStyle w:val="PargrafodaLista"/>
+        <w:numPr>
+          <w:ilvl w:val="0"/>
+          <w:numId w:val="20"/>
+        </w:numPr>
+        <w:ind w:left="1416"/>
+        <w:jc w:val="both"/>
+        <w:rPr>
+          <w:b/>
+          <w:bCs/>
+        </w:rPr>
+      </w:pPr>
+      <w:r>
+        <w:rPr>
+          <w:b/>
+          <w:bCs/>
+        </w:rPr>
+        <w:t xml:space="preserve">Observação: </w:t>
+      </w:r>
+      <w:r>
+        <w:t xml:space="preserve">A mesma correção ao </w:t>
+      </w:r>
+      <w:proofErr w:type="spellStart"/>
+      <w:r>
+        <w:t>loader</w:t>
+      </w:r>
+      <w:proofErr w:type="spellEnd"/>
+      <w:r>
+        <w:t xml:space="preserve"> da </w:t>
+      </w:r>
+      <w:proofErr w:type="spellStart"/>
+      <w:r>
+        <w:t>ResNet</w:t>
+      </w:r>
+      <w:proofErr w:type="spellEnd"/>
+      <w:r>
+        <w:t xml:space="preserve"> será analisada e aplicada à implementação da </w:t>
+      </w:r>
+      <w:proofErr w:type="spellStart"/>
+      <w:r>
+        <w:t>ViT.</w:t>
+      </w:r>
+      <w:proofErr w:type="spellEnd"/>
     </w:p>
     <w:sectPr>
       <w:pgSz w:w="11906" w:h="16838"/>
@@ -2938,6 +4635,119 @@
     </w:lvl>
   </w:abstractNum>
   <w:abstractNum w:abstractNumId="2" w15:restartNumberingAfterBreak="0">
+    <w:nsid w:val="03FF0D00"/>
+    <w:multiLevelType w:val="hybridMultilevel"/>
+    <w:tmpl w:val="486CDCAC"/>
+    <w:lvl w:ilvl="0" w:tplc="04160009">
+      <w:start w:val="1"/>
+      <w:numFmt w:val="bullet"/>
+      <w:lvlText w:val=""/>
+      <w:lvlJc w:val="left"/>
+      <w:pPr>
+        <w:ind w:left="1488" w:hanging="360"/>
+      </w:pPr>
+      <w:rPr>
+        <w:rFonts w:ascii="Wingdings" w:hAnsi="Wingdings" w:hint="default"/>
+      </w:rPr>
+    </w:lvl>
+    <w:lvl w:ilvl="1" w:tplc="FFFFFFFF" w:tentative="1">
+      <w:start w:val="1"/>
+      <w:numFmt w:val="bullet"/>
+      <w:lvlText w:val="o"/>
+      <w:lvlJc w:val="left"/>
+      <w:pPr>
+        <w:ind w:left="2208" w:hanging="360"/>
+      </w:pPr>
+      <w:rPr>
+        <w:rFonts w:ascii="Courier New" w:hAnsi="Courier New" w:cs="Courier New" w:hint="default"/>
+      </w:rPr>
+    </w:lvl>
+    <w:lvl w:ilvl="2" w:tplc="FFFFFFFF" w:tentative="1">
+      <w:start w:val="1"/>
+      <w:numFmt w:val="bullet"/>
+      <w:lvlText w:val=""/>
+      <w:lvlJc w:val="left"/>
+      <w:pPr>
+        <w:ind w:left="2928" w:hanging="360"/>
+      </w:pPr>
+      <w:rPr>
+        <w:rFonts w:ascii="Wingdings" w:hAnsi="Wingdings" w:hint="default"/>
+      </w:rPr>
+    </w:lvl>
+    <w:lvl w:ilvl="3" w:tplc="FFFFFFFF" w:tentative="1">
+      <w:start w:val="1"/>
+      <w:numFmt w:val="bullet"/>
+      <w:lvlText w:val=""/>
+      <w:lvlJc w:val="left"/>
+      <w:pPr>
+        <w:ind w:left="3648" w:hanging="360"/>
+      </w:pPr>
+      <w:rPr>
+        <w:rFonts w:ascii="Symbol" w:hAnsi="Symbol" w:hint="default"/>
+      </w:rPr>
+    </w:lvl>
+    <w:lvl w:ilvl="4" w:tplc="FFFFFFFF" w:tentative="1">
+      <w:start w:val="1"/>
+      <w:numFmt w:val="bullet"/>
+      <w:lvlText w:val="o"/>
+      <w:lvlJc w:val="left"/>
+      <w:pPr>
+        <w:ind w:left="4368" w:hanging="360"/>
+      </w:pPr>
+      <w:rPr>
+        <w:rFonts w:ascii="Courier New" w:hAnsi="Courier New" w:cs="Courier New" w:hint="default"/>
+      </w:rPr>
+    </w:lvl>
+    <w:lvl w:ilvl="5" w:tplc="FFFFFFFF" w:tentative="1">
+      <w:start w:val="1"/>
+      <w:numFmt w:val="bullet"/>
+      <w:lvlText w:val=""/>
+      <w:lvlJc w:val="left"/>
+      <w:pPr>
+        <w:ind w:left="5088" w:hanging="360"/>
+      </w:pPr>
+      <w:rPr>
+        <w:rFonts w:ascii="Wingdings" w:hAnsi="Wingdings" w:hint="default"/>
+      </w:rPr>
+    </w:lvl>
+    <w:lvl w:ilvl="6" w:tplc="FFFFFFFF" w:tentative="1">
+      <w:start w:val="1"/>
+      <w:numFmt w:val="bullet"/>
+      <w:lvlText w:val=""/>
+      <w:lvlJc w:val="left"/>
+      <w:pPr>
+        <w:ind w:left="5808" w:hanging="360"/>
+      </w:pPr>
+      <w:rPr>
+        <w:rFonts w:ascii="Symbol" w:hAnsi="Symbol" w:hint="default"/>
+      </w:rPr>
+    </w:lvl>
+    <w:lvl w:ilvl="7" w:tplc="FFFFFFFF" w:tentative="1">
+      <w:start w:val="1"/>
+      <w:numFmt w:val="bullet"/>
+      <w:lvlText w:val="o"/>
+      <w:lvlJc w:val="left"/>
+      <w:pPr>
+        <w:ind w:left="6528" w:hanging="360"/>
+      </w:pPr>
+      <w:rPr>
+        <w:rFonts w:ascii="Courier New" w:hAnsi="Courier New" w:cs="Courier New" w:hint="default"/>
+      </w:rPr>
+    </w:lvl>
+    <w:lvl w:ilvl="8" w:tplc="FFFFFFFF" w:tentative="1">
+      <w:start w:val="1"/>
+      <w:numFmt w:val="bullet"/>
+      <w:lvlText w:val=""/>
+      <w:lvlJc w:val="left"/>
+      <w:pPr>
+        <w:ind w:left="7248" w:hanging="360"/>
+      </w:pPr>
+      <w:rPr>
+        <w:rFonts w:ascii="Wingdings" w:hAnsi="Wingdings" w:hint="default"/>
+      </w:rPr>
+    </w:lvl>
+  </w:abstractNum>
+  <w:abstractNum w:abstractNumId="3" w15:restartNumberingAfterBreak="0">
     <w:nsid w:val="09B751D6"/>
     <w:multiLevelType w:val="multilevel"/>
     <w:tmpl w:val="80BAE088"/>
@@ -3086,7 +4896,7 @@
       </w:rPr>
     </w:lvl>
   </w:abstractNum>
-  <w:abstractNum w:abstractNumId="3" w15:restartNumberingAfterBreak="0">
+  <w:abstractNum w:abstractNumId="4" w15:restartNumberingAfterBreak="0">
     <w:nsid w:val="12F86942"/>
     <w:multiLevelType w:val="hybridMultilevel"/>
     <w:tmpl w:val="AFFE58F4"/>
@@ -3199,7 +5009,7 @@
       </w:rPr>
     </w:lvl>
   </w:abstractNum>
-  <w:abstractNum w:abstractNumId="4" w15:restartNumberingAfterBreak="0">
+  <w:abstractNum w:abstractNumId="5" w15:restartNumberingAfterBreak="0">
     <w:nsid w:val="16015DE7"/>
     <w:multiLevelType w:val="multilevel"/>
     <w:tmpl w:val="5F48E62E"/>
@@ -3348,7 +5158,7 @@
       </w:rPr>
     </w:lvl>
   </w:abstractNum>
-  <w:abstractNum w:abstractNumId="5" w15:restartNumberingAfterBreak="0">
+  <w:abstractNum w:abstractNumId="6" w15:restartNumberingAfterBreak="0">
     <w:nsid w:val="257F3AFD"/>
     <w:multiLevelType w:val="hybridMultilevel"/>
     <w:tmpl w:val="1EC031A0"/>
@@ -3461,7 +5271,7 @@
       </w:rPr>
     </w:lvl>
   </w:abstractNum>
-  <w:abstractNum w:abstractNumId="6" w15:restartNumberingAfterBreak="0">
+  <w:abstractNum w:abstractNumId="7" w15:restartNumberingAfterBreak="0">
     <w:nsid w:val="283E7EDD"/>
     <w:multiLevelType w:val="hybridMultilevel"/>
     <w:tmpl w:val="B8DEC0E6"/>
@@ -3574,7 +5384,120 @@
       </w:rPr>
     </w:lvl>
   </w:abstractNum>
-  <w:abstractNum w:abstractNumId="7" w15:restartNumberingAfterBreak="0">
+  <w:abstractNum w:abstractNumId="8" w15:restartNumberingAfterBreak="0">
+    <w:nsid w:val="29B241C9"/>
+    <w:multiLevelType w:val="hybridMultilevel"/>
+    <w:tmpl w:val="0968580C"/>
+    <w:lvl w:ilvl="0" w:tplc="0416000B">
+      <w:start w:val="1"/>
+      <w:numFmt w:val="bullet"/>
+      <w:lvlText w:val=""/>
+      <w:lvlJc w:val="left"/>
+      <w:pPr>
+        <w:ind w:left="1488" w:hanging="360"/>
+      </w:pPr>
+      <w:rPr>
+        <w:rFonts w:ascii="Wingdings" w:hAnsi="Wingdings" w:hint="default"/>
+      </w:rPr>
+    </w:lvl>
+    <w:lvl w:ilvl="1" w:tplc="04160003" w:tentative="1">
+      <w:start w:val="1"/>
+      <w:numFmt w:val="bullet"/>
+      <w:lvlText w:val="o"/>
+      <w:lvlJc w:val="left"/>
+      <w:pPr>
+        <w:ind w:left="2208" w:hanging="360"/>
+      </w:pPr>
+      <w:rPr>
+        <w:rFonts w:ascii="Courier New" w:hAnsi="Courier New" w:cs="Courier New" w:hint="default"/>
+      </w:rPr>
+    </w:lvl>
+    <w:lvl w:ilvl="2" w:tplc="04160005" w:tentative="1">
+      <w:start w:val="1"/>
+      <w:numFmt w:val="bullet"/>
+      <w:lvlText w:val=""/>
+      <w:lvlJc w:val="left"/>
+      <w:pPr>
+        <w:ind w:left="2928" w:hanging="360"/>
+      </w:pPr>
+      <w:rPr>
+        <w:rFonts w:ascii="Wingdings" w:hAnsi="Wingdings" w:hint="default"/>
+      </w:rPr>
+    </w:lvl>
+    <w:lvl w:ilvl="3" w:tplc="04160001" w:tentative="1">
+      <w:start w:val="1"/>
+      <w:numFmt w:val="bullet"/>
+      <w:lvlText w:val=""/>
+      <w:lvlJc w:val="left"/>
+      <w:pPr>
+        <w:ind w:left="3648" w:hanging="360"/>
+      </w:pPr>
+      <w:rPr>
+        <w:rFonts w:ascii="Symbol" w:hAnsi="Symbol" w:hint="default"/>
+      </w:rPr>
+    </w:lvl>
+    <w:lvl w:ilvl="4" w:tplc="04160003" w:tentative="1">
+      <w:start w:val="1"/>
+      <w:numFmt w:val="bullet"/>
+      <w:lvlText w:val="o"/>
+      <w:lvlJc w:val="left"/>
+      <w:pPr>
+        <w:ind w:left="4368" w:hanging="360"/>
+      </w:pPr>
+      <w:rPr>
+        <w:rFonts w:ascii="Courier New" w:hAnsi="Courier New" w:cs="Courier New" w:hint="default"/>
+      </w:rPr>
+    </w:lvl>
+    <w:lvl w:ilvl="5" w:tplc="04160005" w:tentative="1">
+      <w:start w:val="1"/>
+      <w:numFmt w:val="bullet"/>
+      <w:lvlText w:val=""/>
+      <w:lvlJc w:val="left"/>
+      <w:pPr>
+        <w:ind w:left="5088" w:hanging="360"/>
+      </w:pPr>
+      <w:rPr>
+        <w:rFonts w:ascii="Wingdings" w:hAnsi="Wingdings" w:hint="default"/>
+      </w:rPr>
+    </w:lvl>
+    <w:lvl w:ilvl="6" w:tplc="04160001" w:tentative="1">
+      <w:start w:val="1"/>
+      <w:numFmt w:val="bullet"/>
+      <w:lvlText w:val=""/>
+      <w:lvlJc w:val="left"/>
+      <w:pPr>
+        <w:ind w:left="5808" w:hanging="360"/>
+      </w:pPr>
+      <w:rPr>
+        <w:rFonts w:ascii="Symbol" w:hAnsi="Symbol" w:hint="default"/>
+      </w:rPr>
+    </w:lvl>
+    <w:lvl w:ilvl="7" w:tplc="04160003" w:tentative="1">
+      <w:start w:val="1"/>
+      <w:numFmt w:val="bullet"/>
+      <w:lvlText w:val="o"/>
+      <w:lvlJc w:val="left"/>
+      <w:pPr>
+        <w:ind w:left="6528" w:hanging="360"/>
+      </w:pPr>
+      <w:rPr>
+        <w:rFonts w:ascii="Courier New" w:hAnsi="Courier New" w:cs="Courier New" w:hint="default"/>
+      </w:rPr>
+    </w:lvl>
+    <w:lvl w:ilvl="8" w:tplc="04160005" w:tentative="1">
+      <w:start w:val="1"/>
+      <w:numFmt w:val="bullet"/>
+      <w:lvlText w:val=""/>
+      <w:lvlJc w:val="left"/>
+      <w:pPr>
+        <w:ind w:left="7248" w:hanging="360"/>
+      </w:pPr>
+      <w:rPr>
+        <w:rFonts w:ascii="Wingdings" w:hAnsi="Wingdings" w:hint="default"/>
+      </w:rPr>
+    </w:lvl>
+  </w:abstractNum>
+  <w:abstractNum w:abstractNumId="9" w15:restartNumberingAfterBreak="0">
     <w:nsid w:val="2B7D0660"/>
     <w:multiLevelType w:val="hybridMultilevel"/>
     <w:tmpl w:val="7264EF5C"/>
@@ -3687,7 +5610,7 @@
       </w:rPr>
     </w:lvl>
   </w:abstractNum>
-  <w:abstractNum w:abstractNumId="8" w15:restartNumberingAfterBreak="0">
+  <w:abstractNum w:abstractNumId="10" w15:restartNumberingAfterBreak="0">
     <w:nsid w:val="3B8A6728"/>
     <w:multiLevelType w:val="multilevel"/>
     <w:tmpl w:val="7512D090"/>
@@ -3836,7 +5759,7 @@
       </w:rPr>
     </w:lvl>
   </w:abstractNum>
-  <w:abstractNum w:abstractNumId="9" w15:restartNumberingAfterBreak="0">
+  <w:abstractNum w:abstractNumId="11" w15:restartNumberingAfterBreak="0">
     <w:nsid w:val="3E130E0A"/>
     <w:multiLevelType w:val="hybridMultilevel"/>
     <w:tmpl w:val="9B626D74"/>
@@ -3949,7 +5872,7 @@
       </w:rPr>
     </w:lvl>
   </w:abstractNum>
-  <w:abstractNum w:abstractNumId="10" w15:restartNumberingAfterBreak="0">
+  <w:abstractNum w:abstractNumId="12" w15:restartNumberingAfterBreak="0">
     <w:nsid w:val="44BB04AA"/>
     <w:multiLevelType w:val="hybridMultilevel"/>
     <w:tmpl w:val="47922734"/>
@@ -4062,7 +5985,7 @@
       </w:rPr>
     </w:lvl>
   </w:abstractNum>
-  <w:abstractNum w:abstractNumId="11" w15:restartNumberingAfterBreak="0">
+  <w:abstractNum w:abstractNumId="13" w15:restartNumberingAfterBreak="0">
     <w:nsid w:val="47F12BC3"/>
     <w:multiLevelType w:val="hybridMultilevel"/>
     <w:tmpl w:val="0FA6ACEE"/>
@@ -4175,7 +6098,7 @@
       </w:rPr>
     </w:lvl>
   </w:abstractNum>
-  <w:abstractNum w:abstractNumId="12" w15:restartNumberingAfterBreak="0">
+  <w:abstractNum w:abstractNumId="14" w15:restartNumberingAfterBreak="0">
     <w:nsid w:val="5115667A"/>
     <w:multiLevelType w:val="hybridMultilevel"/>
     <w:tmpl w:val="8A3C7FB8"/>
@@ -4288,7 +6211,7 @@
       </w:rPr>
     </w:lvl>
   </w:abstractNum>
-  <w:abstractNum w:abstractNumId="13" w15:restartNumberingAfterBreak="0">
+  <w:abstractNum w:abstractNumId="15" w15:restartNumberingAfterBreak="0">
     <w:nsid w:val="5796665F"/>
     <w:multiLevelType w:val="hybridMultilevel"/>
     <w:tmpl w:val="28F0045E"/>
@@ -4377,7 +6300,7 @@
       </w:pPr>
     </w:lvl>
   </w:abstractNum>
-  <w:abstractNum w:abstractNumId="14" w15:restartNumberingAfterBreak="0">
+  <w:abstractNum w:abstractNumId="16" w15:restartNumberingAfterBreak="0">
     <w:nsid w:val="5A33296D"/>
     <w:multiLevelType w:val="multilevel"/>
     <w:tmpl w:val="F6EEC362"/>
@@ -4526,7 +6449,7 @@
       </w:rPr>
     </w:lvl>
   </w:abstractNum>
-  <w:abstractNum w:abstractNumId="15" w15:restartNumberingAfterBreak="0">
+  <w:abstractNum w:abstractNumId="17" w15:restartNumberingAfterBreak="0">
     <w:nsid w:val="5FFF078E"/>
     <w:multiLevelType w:val="hybridMultilevel"/>
     <w:tmpl w:val="0CBE2522"/>
@@ -4639,7 +6562,7 @@
       </w:rPr>
     </w:lvl>
   </w:abstractNum>
-  <w:abstractNum w:abstractNumId="16" w15:restartNumberingAfterBreak="0">
+  <w:abstractNum w:abstractNumId="18" w15:restartNumberingAfterBreak="0">
     <w:nsid w:val="7CB32D06"/>
     <w:multiLevelType w:val="hybridMultilevel"/>
     <w:tmpl w:val="06D44BFE"/>
@@ -4752,7 +6675,7 @@
       </w:rPr>
     </w:lvl>
   </w:abstractNum>
-  <w:abstractNum w:abstractNumId="17" w15:restartNumberingAfterBreak="0">
+  <w:abstractNum w:abstractNumId="19" w15:restartNumberingAfterBreak="0">
     <w:nsid w:val="7D075251"/>
     <w:multiLevelType w:val="hybridMultilevel"/>
     <w:tmpl w:val="DE3E8316"/>
@@ -4865,7 +6788,7 @@
       </w:rPr>
     </w:lvl>
   </w:abstractNum>
-  <w:abstractNum w:abstractNumId="18" w15:restartNumberingAfterBreak="0">
+  <w:abstractNum w:abstractNumId="20" w15:restartNumberingAfterBreak="0">
     <w:nsid w:val="7FB7601E"/>
     <w:multiLevelType w:val="hybridMultilevel"/>
     <w:tmpl w:val="70887F96"/>
@@ -4979,61 +6902,67 @@
     </w:lvl>
   </w:abstractNum>
   <w:num w:numId="1" w16cid:durableId="1615208601">
-    <w:abstractNumId w:val="13"/>
+    <w:abstractNumId w:val="15"/>
   </w:num>
   <w:num w:numId="2" w16cid:durableId="1097402540">
-    <w:abstractNumId w:val="12"/>
+    <w:abstractNumId w:val="14"/>
   </w:num>
   <w:num w:numId="3" w16cid:durableId="170608834">
     <w:abstractNumId w:val="1"/>
   </w:num>
   <w:num w:numId="4" w16cid:durableId="1548687179">
-    <w:abstractNumId w:val="11"/>
+    <w:abstractNumId w:val="13"/>
   </w:num>
   <w:num w:numId="5" w16cid:durableId="1836650803">
     <w:abstractNumId w:val="0"/>
   </w:num>
   <w:num w:numId="6" w16cid:durableId="543980649">
+    <w:abstractNumId w:val="6"/>
+  </w:num>
+  <w:num w:numId="7" w16cid:durableId="731393186">
+    <w:abstractNumId w:val="18"/>
+  </w:num>
+  <w:num w:numId="8" w16cid:durableId="105393592">
     <w:abstractNumId w:val="5"/>
   </w:num>
-  <w:num w:numId="7" w16cid:durableId="731393186">
+  <w:num w:numId="9" w16cid:durableId="621232043">
+    <w:abstractNumId w:val="3"/>
+  </w:num>
+  <w:num w:numId="10" w16cid:durableId="2124222485">
+    <w:abstractNumId w:val="9"/>
+  </w:num>
+  <w:num w:numId="11" w16cid:durableId="1832524834">
+    <w:abstractNumId w:val="19"/>
+  </w:num>
+  <w:num w:numId="12" w16cid:durableId="1891188526">
+    <w:abstractNumId w:val="20"/>
+  </w:num>
+  <w:num w:numId="13" w16cid:durableId="838423982">
+    <w:abstractNumId w:val="11"/>
+  </w:num>
+  <w:num w:numId="14" w16cid:durableId="2133136465">
+    <w:abstractNumId w:val="4"/>
+  </w:num>
+  <w:num w:numId="15" w16cid:durableId="1916890474">
+    <w:abstractNumId w:val="12"/>
+  </w:num>
+  <w:num w:numId="16" w16cid:durableId="1868639224">
+    <w:abstractNumId w:val="10"/>
+  </w:num>
+  <w:num w:numId="17" w16cid:durableId="2074740691">
     <w:abstractNumId w:val="16"/>
   </w:num>
-  <w:num w:numId="8" w16cid:durableId="105393592">
-    <w:abstractNumId w:val="4"/>
-  </w:num>
-  <w:num w:numId="9" w16cid:durableId="621232043">
-    <w:abstractNumId w:val="2"/>
-  </w:num>
-  <w:num w:numId="10" w16cid:durableId="2124222485">
+  <w:num w:numId="18" w16cid:durableId="1530340441">
     <w:abstractNumId w:val="7"/>
   </w:num>
-  <w:num w:numId="11" w16cid:durableId="1832524834">
+  <w:num w:numId="19" w16cid:durableId="738989656">
     <w:abstractNumId w:val="17"/>
   </w:num>
-  <w:num w:numId="12" w16cid:durableId="1891188526">
-    <w:abstractNumId w:val="18"/>
-  </w:num>
-  <w:num w:numId="13" w16cid:durableId="838423982">
-    <w:abstractNumId w:val="9"/>
-  </w:num>
-  <w:num w:numId="14" w16cid:durableId="2133136465">
-    <w:abstractNumId w:val="3"/>
-  </w:num>
-  <w:num w:numId="15" w16cid:durableId="1916890474">
-    <w:abstractNumId w:val="10"/>
-  </w:num>
-  <w:num w:numId="16" w16cid:durableId="1868639224">
+  <w:num w:numId="20" w16cid:durableId="1067458539">
     <w:abstractNumId w:val="8"/>
   </w:num>
-  <w:num w:numId="17" w16cid:durableId="2074740691">
-    <w:abstractNumId w:val="14"/>
-  </w:num>
-  <w:num w:numId="18" w16cid:durableId="1530340441">
-    <w:abstractNumId w:val="6"/>
-  </w:num>
-  <w:num w:numId="19" w16cid:durableId="738989656">
-    <w:abstractNumId w:val="15"/>
+  <w:num w:numId="21" w16cid:durableId="1593928561">
+    <w:abstractNumId w:val="2"/>
   </w:num>
 </w:numbering>
 </file>

</xml_diff>

<commit_message>
Adição do dataset e atualização da documentação
</commit_message>
<xml_diff>
--- a/Documentation/Experimentos com ResNet-50.docx
+++ b/Documentation/Experimentos com ResNet-50.docx
@@ -137,21 +137,7 @@
         <w:rPr>
           <w:u w:val="single"/>
         </w:rPr>
-        <w:t xml:space="preserve">Este documento foi elaborado após a realização dos testes iniciais com a arquitetura </w:t>
-      </w:r>
-      <w:proofErr w:type="spellStart"/>
-      <w:r>
-        <w:rPr>
-          <w:u w:val="single"/>
-        </w:rPr>
-        <w:t>ViT.</w:t>
-      </w:r>
-      <w:proofErr w:type="spellEnd"/>
-      <w:r>
-        <w:rPr>
-          <w:u w:val="single"/>
-        </w:rPr>
-        <w:t xml:space="preserve"> Dessa forma, as técnicas e os conceitos previamente empregados são detalhados no documento </w:t>
+        <w:t xml:space="preserve">Este documento foi elaborado após a realização dos testes iniciais com a arquitetura ViT. Dessa forma, as técnicas e os conceitos previamente empregados são detalhados no documento </w:t>
       </w:r>
       <w:r>
         <w:rPr>
@@ -187,15 +173,7 @@
         <w:t>Conforme</w:t>
       </w:r>
       <w:r>
-        <w:t xml:space="preserve"> foi descrito pelo experimento inicial de validação conduzido com a arquitetura Vision </w:t>
-      </w:r>
-      <w:proofErr w:type="spellStart"/>
-      <w:r>
-        <w:t>Transformer</w:t>
-      </w:r>
-      <w:proofErr w:type="spellEnd"/>
-      <w:r>
-        <w:t xml:space="preserve">, </w:t>
+        <w:t xml:space="preserve"> foi descrito pelo experimento inicial de validação conduzido com a arquitetura Vision Transformer, </w:t>
       </w:r>
       <w:r>
         <w:t>não vale a pena</w:t>
@@ -223,78 +201,32 @@
       <w:r>
         <w:t xml:space="preserve">implementação sem que haja o cenário ideal para replicar os resultados. Como existem limitações atuais com o hardware utilizado, será conduzida apenas um teste de sanidade da implementação feita para a ResNet-50. Importante destacar que a construção da arquitetura buscou seguir fielmente às etapas descritas pelo artigo </w:t>
       </w:r>
-      <w:proofErr w:type="spellStart"/>
       <w:r>
         <w:rPr>
           <w:i/>
           <w:iCs/>
           <w:u w:val="single"/>
         </w:rPr>
-        <w:t>Deep</w:t>
-      </w:r>
-      <w:proofErr w:type="spellEnd"/>
+        <w:t>Deep Residual Learning for Image Recognition</w:t>
+      </w:r>
       <w:r>
         <w:rPr>
           <w:i/>
           <w:iCs/>
           <w:u w:val="single"/>
         </w:rPr>
-        <w:t xml:space="preserve"> Residual Learning for </w:t>
-      </w:r>
-      <w:proofErr w:type="spellStart"/>
+        <w:t>.</w:t>
+      </w:r>
       <w:r>
         <w:rPr>
           <w:i/>
           <w:iCs/>
           <w:u w:val="single"/>
         </w:rPr>
-        <w:t>Image</w:t>
-      </w:r>
-      <w:proofErr w:type="spellEnd"/>
-      <w:r>
-        <w:rPr>
-          <w:i/>
-          <w:iCs/>
-          <w:u w:val="single"/>
-        </w:rPr>
         <w:t xml:space="preserve"> </w:t>
       </w:r>
-      <w:proofErr w:type="spellStart"/>
-      <w:r>
-        <w:rPr>
-          <w:i/>
-          <w:iCs/>
-          <w:u w:val="single"/>
-        </w:rPr>
-        <w:t>Recognition</w:t>
-      </w:r>
-      <w:proofErr w:type="spellEnd"/>
-      <w:r>
-        <w:rPr>
-          <w:i/>
-          <w:iCs/>
-          <w:u w:val="single"/>
-        </w:rPr>
-        <w:t>.</w:t>
-      </w:r>
-      <w:r>
-        <w:rPr>
-          <w:i/>
-          <w:iCs/>
-          <w:u w:val="single"/>
-        </w:rPr>
-        <w:t xml:space="preserve"> </w:t>
-      </w:r>
-      <w:r>
-        <w:t xml:space="preserve">De modo similar ao que foi descrito nos testes de validação para a arquitetura Vision </w:t>
-      </w:r>
-      <w:proofErr w:type="spellStart"/>
-      <w:r>
-        <w:t>transformers</w:t>
-      </w:r>
-      <w:proofErr w:type="spellEnd"/>
-      <w:r>
-        <w:t>, temos:</w:t>
+      <w:r>
+        <w:t>De modo similar ao que foi descrito nos testes de validação para a arquitetura Vision transformers, temos:</w:t>
       </w:r>
     </w:p>
     <w:p>
@@ -400,17 +332,8 @@
           <w:b/>
           <w:bCs/>
         </w:rPr>
-        <w:t xml:space="preserve"> a base </w:t>
-      </w:r>
-      <w:proofErr w:type="spellStart"/>
-      <w:r>
-        <w:rPr>
-          <w:b/>
-          <w:bCs/>
-        </w:rPr>
-        <w:t>ImageNet</w:t>
-      </w:r>
-      <w:proofErr w:type="spellEnd"/>
+        <w:t xml:space="preserve"> a base ImageNet</w:t>
+      </w:r>
       <w:r>
         <w:rPr>
           <w:b/>
@@ -479,42 +402,69 @@
       <w:r>
         <w:t xml:space="preserve"> </w:t>
       </w:r>
-      <w:proofErr w:type="spellStart"/>
-      <w:r>
-        <w:t>Sanity</w:t>
-      </w:r>
-      <w:proofErr w:type="spellEnd"/>
-      <w:r>
+      <w:r>
+        <w:t>Sanity Check Básico</w:t>
+      </w:r>
+      <w:r>
+        <w:t xml:space="preserve"> com </w:t>
+      </w:r>
+      <w:r>
+        <w:t xml:space="preserve">STEP_PER_EPOCH = </w:t>
+      </w:r>
+      <w:r>
+        <w:t>(</w:t>
+      </w:r>
+      <w:r>
+        <w:t>347</w:t>
+      </w:r>
+      <w:r>
+        <w:t>) e EPOCHS = (</w:t>
+      </w:r>
+      <w:r>
+        <w:t>5</w:t>
+      </w:r>
+      <w:r>
+        <w:t>)</w:t>
+      </w:r>
+    </w:p>
+    <w:p>
+      <w:pPr>
+        <w:pStyle w:val="PargrafodaLista"/>
+        <w:ind w:left="1440"/>
+        <w:jc w:val="both"/>
+      </w:pPr>
+      <w:r>
+        <w:t>→</w:t>
+      </w:r>
+      <w:r>
+        <w:t xml:space="preserve"> Rede </w:t>
+      </w:r>
+      <w:r>
+        <w:t>treinada do zero com a base ImageNet1K</w:t>
+      </w:r>
+    </w:p>
+    <w:p>
+      <w:pPr>
+        <w:pStyle w:val="PargrafodaLista"/>
+        <w:ind w:left="1440"/>
+        <w:jc w:val="both"/>
+      </w:pPr>
+      <w:r>
+        <w:rPr>
+          <w:b/>
+          <w:bCs/>
+        </w:rPr>
+        <w:t>→ Parâmetros utilizados:</w:t>
+      </w:r>
+      <w:r>
+        <w:rPr>
+          <w:b/>
+          <w:bCs/>
+        </w:rPr>
         <w:t xml:space="preserve"> </w:t>
       </w:r>
-      <w:proofErr w:type="spellStart"/>
-      <w:r>
-        <w:t>Check</w:t>
-      </w:r>
-      <w:proofErr w:type="spellEnd"/>
-      <w:r>
-        <w:t xml:space="preserve"> Básico</w:t>
-      </w:r>
-      <w:r>
-        <w:t xml:space="preserve"> com </w:t>
-      </w:r>
-      <w:r>
-        <w:t xml:space="preserve">STEP_PER_EPOCH = </w:t>
-      </w:r>
-      <w:r>
-        <w:t>(</w:t>
-      </w:r>
-      <w:r>
-        <w:t>347</w:t>
-      </w:r>
-      <w:r>
-        <w:t>) e EPOCHS = (</w:t>
-      </w:r>
-      <w:r>
-        <w:t>5</w:t>
-      </w:r>
-      <w:r>
-        <w:t>)</w:t>
+      <w:r>
+        <w:t>Tanto as configurações voltadas para o carregamento dos dados, quanto as configurações exigidas pela arquitetura Vision Transformers estão descritas na Figura 1.</w:t>
       </w:r>
     </w:p>
     <w:p>
@@ -523,15 +473,6 @@
         <w:ind w:left="1440"/>
         <w:jc w:val="both"/>
       </w:pPr>
-      <w:r>
-        <w:t>→</w:t>
-      </w:r>
-      <w:r>
-        <w:t xml:space="preserve"> Rede </w:t>
-      </w:r>
-      <w:r>
-        <w:t>treinada do zero com a base ImageNet1K</w:t>
-      </w:r>
     </w:p>
     <w:p>
       <w:pPr>
@@ -544,49 +485,10 @@
           <w:b/>
           <w:bCs/>
         </w:rPr>
-        <w:t>→ Parâmetros utilizados:</w:t>
-      </w:r>
-      <w:r>
-        <w:rPr>
-          <w:b/>
-          <w:bCs/>
-        </w:rPr>
-        <w:t xml:space="preserve"> </w:t>
-      </w:r>
-      <w:r>
-        <w:t>Tanto as configurações voltadas para o carregamento dos dados, quanto as configurações exigidas pela arquitetura Vision Transformers estão descritas na Figura 1.</w:t>
-      </w:r>
-    </w:p>
-    <w:p>
-      <w:pPr>
-        <w:pStyle w:val="PargrafodaLista"/>
-        <w:ind w:left="1440"/>
-        <w:jc w:val="both"/>
-      </w:pPr>
-    </w:p>
-    <w:p>
-      <w:pPr>
-        <w:pStyle w:val="PargrafodaLista"/>
-        <w:ind w:left="1440"/>
-        <w:jc w:val="both"/>
-      </w:pPr>
-      <w:r>
-        <w:rPr>
-          <w:b/>
-          <w:bCs/>
-        </w:rPr>
         <w:t>OBSERVAÇÃO:</w:t>
       </w:r>
       <w:r>
-        <w:t xml:space="preserve"> A condução do teste de sanidade para esta arquitetura segue os mesmos moldes e protocolos adotados para a Vision </w:t>
-      </w:r>
-      <w:proofErr w:type="spellStart"/>
-      <w:r>
-        <w:t>Transformer</w:t>
-      </w:r>
-      <w:proofErr w:type="spellEnd"/>
-      <w:r>
-        <w:t>.</w:t>
+        <w:t xml:space="preserve"> A condução do teste de sanidade para esta arquitetura segue os mesmos moldes e protocolos adotados para a Vision Transformer.</w:t>
       </w:r>
     </w:p>
     <w:p>
@@ -720,31 +622,29 @@
           <w:iCs/>
           <w:color w:val="000000" w:themeColor="text1"/>
         </w:rPr>
-        <w:t xml:space="preserve">Logs do </w:t>
-      </w:r>
-      <w:proofErr w:type="spellStart"/>
+        <w:t>Logs do Pycharm</w:t>
+      </w:r>
       <w:r>
         <w:rPr>
           <w:i/>
           <w:iCs/>
           <w:color w:val="000000" w:themeColor="text1"/>
         </w:rPr>
-        <w:t>Pycharm</w:t>
-      </w:r>
-      <w:proofErr w:type="spellEnd"/>
+        <w:t xml:space="preserve"> </w:t>
+      </w:r>
+      <w:r>
+        <w:rPr>
+          <w:color w:val="000000" w:themeColor="text1"/>
+        </w:rPr>
+        <w:t xml:space="preserve">estão </w:t>
+      </w:r>
       <w:r>
         <w:rPr>
           <w:i/>
           <w:iCs/>
           <w:color w:val="000000" w:themeColor="text1"/>
         </w:rPr>
-        <w:t xml:space="preserve"> </w:t>
-      </w:r>
-      <w:r>
-        <w:rPr>
-          <w:color w:val="000000" w:themeColor="text1"/>
-        </w:rPr>
-        <w:t xml:space="preserve">estão </w:t>
+        <w:t>localizados em "\Projeto-Classificadores\Documentation\</w:t>
       </w:r>
       <w:r>
         <w:rPr>
@@ -752,135 +652,35 @@
           <w:iCs/>
           <w:color w:val="000000" w:themeColor="text1"/>
         </w:rPr>
-        <w:t>localizados em "\Projeto-Classificadores\</w:t>
-      </w:r>
-      <w:proofErr w:type="spellStart"/>
+        <w:t>Pycharm LOGS\</w:t>
+      </w:r>
       <w:r>
         <w:rPr>
           <w:i/>
           <w:iCs/>
           <w:color w:val="000000" w:themeColor="text1"/>
         </w:rPr>
-        <w:t>Documentation</w:t>
-      </w:r>
-      <w:proofErr w:type="spellEnd"/>
+        <w:t>Validation ResNet Sanity Check - LOG</w:t>
+      </w:r>
       <w:r>
         <w:rPr>
           <w:i/>
           <w:iCs/>
           <w:color w:val="000000" w:themeColor="text1"/>
         </w:rPr>
-        <w:t>\</w:t>
-      </w:r>
-      <w:proofErr w:type="spellStart"/>
-      <w:r>
+        <w:t>.txt"</w:t>
+      </w:r>
+    </w:p>
+    <w:p>
+      <w:pPr>
+        <w:pStyle w:val="PargrafodaLista"/>
+        <w:ind w:left="1440"/>
+        <w:jc w:val="both"/>
         <w:rPr>
           <w:i/>
           <w:iCs/>
           <w:color w:val="000000" w:themeColor="text1"/>
         </w:rPr>
-        <w:t>Pycharm</w:t>
-      </w:r>
-      <w:proofErr w:type="spellEnd"/>
-      <w:r>
-        <w:rPr>
-          <w:i/>
-          <w:iCs/>
-          <w:color w:val="000000" w:themeColor="text1"/>
-        </w:rPr>
-        <w:t xml:space="preserve"> LOGS\</w:t>
-      </w:r>
-      <w:proofErr w:type="spellStart"/>
-      <w:r>
-        <w:rPr>
-          <w:i/>
-          <w:iCs/>
-          <w:color w:val="000000" w:themeColor="text1"/>
-        </w:rPr>
-        <w:t>Validation</w:t>
-      </w:r>
-      <w:proofErr w:type="spellEnd"/>
-      <w:r>
-        <w:rPr>
-          <w:i/>
-          <w:iCs/>
-          <w:color w:val="000000" w:themeColor="text1"/>
-        </w:rPr>
-        <w:t xml:space="preserve"> </w:t>
-      </w:r>
-      <w:proofErr w:type="spellStart"/>
-      <w:r>
-        <w:rPr>
-          <w:i/>
-          <w:iCs/>
-          <w:color w:val="000000" w:themeColor="text1"/>
-        </w:rPr>
-        <w:t>ResNet</w:t>
-      </w:r>
-      <w:proofErr w:type="spellEnd"/>
-      <w:r>
-        <w:rPr>
-          <w:i/>
-          <w:iCs/>
-          <w:color w:val="000000" w:themeColor="text1"/>
-        </w:rPr>
-        <w:t xml:space="preserve"> </w:t>
-      </w:r>
-      <w:proofErr w:type="spellStart"/>
-      <w:r>
-        <w:rPr>
-          <w:i/>
-          <w:iCs/>
-          <w:color w:val="000000" w:themeColor="text1"/>
-        </w:rPr>
-        <w:t>Sanity</w:t>
-      </w:r>
-      <w:proofErr w:type="spellEnd"/>
-      <w:r>
-        <w:rPr>
-          <w:i/>
-          <w:iCs/>
-          <w:color w:val="000000" w:themeColor="text1"/>
-        </w:rPr>
-        <w:t xml:space="preserve"> </w:t>
-      </w:r>
-      <w:proofErr w:type="spellStart"/>
-      <w:r>
-        <w:rPr>
-          <w:i/>
-          <w:iCs/>
-          <w:color w:val="000000" w:themeColor="text1"/>
-        </w:rPr>
-        <w:t>Check</w:t>
-      </w:r>
-      <w:proofErr w:type="spellEnd"/>
-      <w:r>
-        <w:rPr>
-          <w:i/>
-          <w:iCs/>
-          <w:color w:val="000000" w:themeColor="text1"/>
-        </w:rPr>
-        <w:t xml:space="preserve"> - LOG</w:t>
-      </w:r>
-      <w:r>
-        <w:rPr>
-          <w:i/>
-          <w:iCs/>
-          <w:color w:val="000000" w:themeColor="text1"/>
-        </w:rPr>
-        <w:t>.txt"</w:t>
-      </w:r>
-    </w:p>
-    <w:p>
-      <w:pPr>
-        <w:pStyle w:val="PargrafodaLista"/>
-        <w:ind w:left="1440"/>
-        <w:jc w:val="both"/>
-        <w:rPr>
-          <w:i/>
-          <w:iCs/>
-          <w:color w:val="000000" w:themeColor="text1"/>
-        </w:rPr>
       </w:pPr>
     </w:p>
     <w:p>
@@ -901,54 +701,22 @@
           <w:sz w:val="18"/>
           <w:szCs w:val="18"/>
         </w:rPr>
-        <w:t xml:space="preserve"> </w:t>
+        <w:t xml:space="preserve"> 2</w:t>
       </w:r>
       <w:r>
         <w:rPr>
           <w:sz w:val="18"/>
           <w:szCs w:val="18"/>
         </w:rPr>
-        <w:t>2</w:t>
+        <w:t xml:space="preserve">: </w:t>
       </w:r>
       <w:r>
         <w:rPr>
           <w:sz w:val="18"/>
           <w:szCs w:val="18"/>
         </w:rPr>
-        <w:t xml:space="preserve">: </w:t>
-      </w:r>
-      <w:r>
-        <w:rPr>
-          <w:sz w:val="18"/>
-          <w:szCs w:val="18"/>
-        </w:rPr>
-        <w:t xml:space="preserve">Resultados obtidos do treinamento no teste de </w:t>
-      </w:r>
-      <w:proofErr w:type="spellStart"/>
-      <w:r>
-        <w:rPr>
-          <w:sz w:val="18"/>
-          <w:szCs w:val="18"/>
-        </w:rPr>
-        <w:t>Sanity</w:t>
-      </w:r>
-      <w:proofErr w:type="spellEnd"/>
-      <w:r>
-        <w:rPr>
-          <w:sz w:val="18"/>
-          <w:szCs w:val="18"/>
-        </w:rPr>
-        <w:t xml:space="preserve"> </w:t>
-      </w:r>
-      <w:proofErr w:type="spellStart"/>
-      <w:r>
-        <w:rPr>
-          <w:sz w:val="18"/>
-          <w:szCs w:val="18"/>
-        </w:rPr>
-        <w:t>Check</w:t>
-      </w:r>
-      <w:proofErr w:type="spellEnd"/>
+        <w:t>Resultados obtidos do treinamento no teste de Sanity Check</w:t>
+      </w:r>
     </w:p>
     <w:p>
       <w:pPr>
@@ -1050,7 +818,6 @@
         </w:rPr>
         <w:t xml:space="preserve"> primeira época, a </w:t>
       </w:r>
-      <w:proofErr w:type="spellStart"/>
       <w:r>
         <w:rPr>
           <w:i/>
@@ -1059,7 +826,6 @@
         </w:rPr>
         <w:t>loss</w:t>
       </w:r>
-      <w:proofErr w:type="spellEnd"/>
       <w:r>
         <w:rPr>
           <w:color w:val="000000" w:themeColor="text1"/>
@@ -1076,21 +842,7 @@
         <w:rPr>
           <w:color w:val="000000" w:themeColor="text1"/>
         </w:rPr>
-        <w:t xml:space="preserve">. Para um problema de classificação com 1000 classes, a perda teórica associada a uma predição aleatória é dada por </w:t>
-      </w:r>
-      <w:proofErr w:type="gramStart"/>
-      <w:r>
-        <w:rPr>
-          <w:color w:val="000000" w:themeColor="text1"/>
-        </w:rPr>
-        <w:t>log(</w:t>
-      </w:r>
-      <w:proofErr w:type="gramEnd"/>
-      <w:r>
-        <w:rPr>
-          <w:color w:val="000000" w:themeColor="text1"/>
-        </w:rPr>
-        <w:t>1000) ≈ 6.907</w:t>
+        <w:t>. Para um problema de classificação com 1000 classes, a perda teórica associada a uma predição aleatória é dada por log(1000) ≈ 6.907</w:t>
       </w:r>
       <w:r>
         <w:rPr>
@@ -1104,25 +856,7 @@
           <w:iCs/>
           <w:color w:val="000000" w:themeColor="text1"/>
         </w:rPr>
-        <w:t xml:space="preserve">(Ver explicação mais detalhada no teste de sanidade conduzido para a </w:t>
-      </w:r>
-      <w:proofErr w:type="spellStart"/>
-      <w:r>
-        <w:rPr>
-          <w:i/>
-          <w:iCs/>
-          <w:color w:val="000000" w:themeColor="text1"/>
-        </w:rPr>
-        <w:t>ViT</w:t>
-      </w:r>
-      <w:proofErr w:type="spellEnd"/>
-      <w:r>
-        <w:rPr>
-          <w:i/>
-          <w:iCs/>
-          <w:color w:val="000000" w:themeColor="text1"/>
-        </w:rPr>
-        <w:t>)</w:t>
+        <w:t>(Ver explicação mais detalhada no teste de sanidade conduzido para a ViT)</w:t>
       </w:r>
       <w:r>
         <w:rPr>
@@ -1233,68 +967,22 @@
           <w:sz w:val="18"/>
           <w:szCs w:val="18"/>
         </w:rPr>
-        <w:t xml:space="preserve"> </w:t>
+        <w:t xml:space="preserve"> 3</w:t>
       </w:r>
       <w:r>
         <w:rPr>
           <w:sz w:val="18"/>
           <w:szCs w:val="18"/>
         </w:rPr>
-        <w:t>3</w:t>
+        <w:t xml:space="preserve">: </w:t>
       </w:r>
       <w:r>
         <w:rPr>
           <w:sz w:val="18"/>
           <w:szCs w:val="18"/>
         </w:rPr>
-        <w:t xml:space="preserve">: </w:t>
-      </w:r>
-      <w:r>
-        <w:rPr>
-          <w:sz w:val="18"/>
-          <w:szCs w:val="18"/>
-        </w:rPr>
-        <w:t>Resultados obtidos d</w:t>
-      </w:r>
-      <w:r>
-        <w:rPr>
-          <w:sz w:val="18"/>
-          <w:szCs w:val="18"/>
-        </w:rPr>
-        <w:t>a validação no teste de</w:t>
-      </w:r>
-      <w:r>
-        <w:rPr>
-          <w:sz w:val="18"/>
-          <w:szCs w:val="18"/>
-        </w:rPr>
-        <w:t xml:space="preserve"> </w:t>
-      </w:r>
-      <w:proofErr w:type="spellStart"/>
-      <w:r>
-        <w:rPr>
-          <w:sz w:val="18"/>
-          <w:szCs w:val="18"/>
-        </w:rPr>
-        <w:t>Sanity</w:t>
-      </w:r>
-      <w:proofErr w:type="spellEnd"/>
-      <w:r>
-        <w:rPr>
-          <w:sz w:val="18"/>
-          <w:szCs w:val="18"/>
-        </w:rPr>
-        <w:t xml:space="preserve"> </w:t>
-      </w:r>
-      <w:proofErr w:type="spellStart"/>
-      <w:r>
-        <w:rPr>
-          <w:sz w:val="18"/>
-          <w:szCs w:val="18"/>
-        </w:rPr>
-        <w:t>Check</w:t>
-      </w:r>
-      <w:proofErr w:type="spellEnd"/>
+        <w:t>Resultados obtidos da validação no teste de Sanity Check</w:t>
+      </w:r>
     </w:p>
     <w:p>
       <w:pPr>
@@ -1386,7 +1074,6 @@
         </w:rPr>
         <w:t xml:space="preserve">No conjunto de validação, tanto a acurácia Top-1 quanto a Top-5 permanecem zeradas ao longo das cinco épocas. Esse comportamento, embora à primeira vista possa parecer preocupante, é esperado nesse estágio inicial do treinamento. A ResNet-50 treinada do zero no </w:t>
       </w:r>
-      <w:proofErr w:type="spellStart"/>
       <w:r>
         <w:rPr>
           <w:i/>
@@ -1395,7 +1082,6 @@
         </w:rPr>
         <w:t>ImageNet</w:t>
       </w:r>
-      <w:proofErr w:type="spellEnd"/>
       <w:r>
         <w:rPr>
           <w:color w:val="000000" w:themeColor="text1"/>
@@ -1491,18 +1177,8 @@
           <w:iCs/>
           <w:color w:val="000000" w:themeColor="text1"/>
         </w:rPr>
-        <w:t xml:space="preserve">batch </w:t>
-      </w:r>
-      <w:proofErr w:type="spellStart"/>
-      <w:r>
-        <w:rPr>
-          <w:i/>
-          <w:iCs/>
-          <w:color w:val="000000" w:themeColor="text1"/>
-        </w:rPr>
-        <w:t>size</w:t>
-      </w:r>
-      <w:proofErr w:type="spellEnd"/>
+        <w:t>batch size</w:t>
+      </w:r>
       <w:r>
         <w:rPr>
           <w:color w:val="000000" w:themeColor="text1"/>
@@ -1809,15 +1485,7 @@
         <w:t>O objetivo deste experimento foi</w:t>
       </w:r>
       <w:r>
-        <w:t xml:space="preserve"> adequar o código da ResNet-50 construído para a validação ao projeto principal, a principal modificação foi relacionada ao carregamento de dados. Os </w:t>
-      </w:r>
-      <w:proofErr w:type="spellStart"/>
-      <w:r>
-        <w:t>TFRecords</w:t>
-      </w:r>
-      <w:proofErr w:type="spellEnd"/>
-      <w:r>
-        <w:t xml:space="preserve"> não são mais utilizados, agora as imagens puras provenientes da base de dados servem como entrada.</w:t>
+        <w:t xml:space="preserve"> adequar o código da ResNet-50 construído para a validação ao projeto principal, a principal modificação foi relacionada ao carregamento de dados. Os TFRecords não são mais utilizados, agora as imagens puras provenientes da base de dados servem como entrada.</w:t>
       </w:r>
     </w:p>
     <w:p>
@@ -1864,21 +1532,7 @@
         <w:rPr>
           <w:u w:val="single"/>
         </w:rPr>
-        <w:t xml:space="preserve"> estrutura da rede e as configurações do Trainer não foram alteradas, isso pode ser feito futuramente para explorar o impacto de diferentes valores para os </w:t>
-      </w:r>
-      <w:proofErr w:type="spellStart"/>
-      <w:r>
-        <w:rPr>
-          <w:u w:val="single"/>
-        </w:rPr>
-        <w:t>hiper-parâmetros</w:t>
-      </w:r>
-      <w:proofErr w:type="spellEnd"/>
-      <w:r>
-        <w:rPr>
-          <w:u w:val="single"/>
-        </w:rPr>
-        <w:t>, contudo, isso não foi o aplicado neste teste em específico.</w:t>
+        <w:t xml:space="preserve"> estrutura da rede e as configurações do Trainer não foram alteradas, isso pode ser feito futuramente para explorar o impacto de diferentes valores para os hiper-parâmetros, contudo, isso não foi o aplicado neste teste em específico.</w:t>
       </w:r>
     </w:p>
     <w:p>
@@ -1912,21 +1566,8 @@
       <w:r>
         <w:t xml:space="preserve"> </w:t>
       </w:r>
-      <w:proofErr w:type="spellStart"/>
-      <w:r>
-        <w:t>Sanity</w:t>
-      </w:r>
-      <w:proofErr w:type="spellEnd"/>
-      <w:r>
-        <w:t xml:space="preserve"> </w:t>
-      </w:r>
-      <w:proofErr w:type="spellStart"/>
-      <w:r>
-        <w:t>Check</w:t>
-      </w:r>
-      <w:proofErr w:type="spellEnd"/>
-      <w:r>
-        <w:t xml:space="preserve"> Básico</w:t>
+      <w:r>
+        <w:t>Sanity Check Básico</w:t>
       </w:r>
       <w:r>
         <w:t xml:space="preserve"> com </w:t>
@@ -2119,31 +1760,29 @@
           <w:iCs/>
           <w:color w:val="000000" w:themeColor="text1"/>
         </w:rPr>
-        <w:t xml:space="preserve">Logs do </w:t>
-      </w:r>
-      <w:proofErr w:type="spellStart"/>
+        <w:t>Logs do Pycharm</w:t>
+      </w:r>
       <w:r>
         <w:rPr>
           <w:i/>
           <w:iCs/>
           <w:color w:val="000000" w:themeColor="text1"/>
         </w:rPr>
-        <w:t>Pycharm</w:t>
-      </w:r>
-      <w:proofErr w:type="spellEnd"/>
+        <w:t xml:space="preserve"> </w:t>
+      </w:r>
+      <w:r>
+        <w:rPr>
+          <w:color w:val="000000" w:themeColor="text1"/>
+        </w:rPr>
+        <w:t xml:space="preserve">estão </w:t>
+      </w:r>
       <w:r>
         <w:rPr>
           <w:i/>
           <w:iCs/>
           <w:color w:val="000000" w:themeColor="text1"/>
         </w:rPr>
-        <w:t xml:space="preserve"> </w:t>
-      </w:r>
-      <w:r>
-        <w:rPr>
-          <w:color w:val="000000" w:themeColor="text1"/>
-        </w:rPr>
-        <w:t xml:space="preserve">estão </w:t>
+        <w:t>localizados em "\Projeto-Classificadores\Documentation\</w:t>
       </w:r>
       <w:r>
         <w:rPr>
@@ -2151,210 +1790,109 @@
           <w:iCs/>
           <w:color w:val="000000" w:themeColor="text1"/>
         </w:rPr>
-        <w:t>localizados em "\Projeto-Classificadores\</w:t>
-      </w:r>
-      <w:proofErr w:type="spellStart"/>
+        <w:t>Pycharm LOGS\</w:t>
+      </w:r>
       <w:r>
         <w:rPr>
           <w:i/>
           <w:iCs/>
           <w:color w:val="000000" w:themeColor="text1"/>
         </w:rPr>
-        <w:t>Documentation</w:t>
-      </w:r>
-      <w:proofErr w:type="spellEnd"/>
+        <w:t>Main</w:t>
+      </w:r>
       <w:r>
         <w:rPr>
           <w:i/>
           <w:iCs/>
           <w:color w:val="000000" w:themeColor="text1"/>
         </w:rPr>
-        <w:t>\</w:t>
-      </w:r>
-      <w:proofErr w:type="spellStart"/>
+        <w:t xml:space="preserve"> ResNet Sanity Check - LOG</w:t>
+      </w:r>
       <w:r>
         <w:rPr>
           <w:i/>
           <w:iCs/>
           <w:color w:val="000000" w:themeColor="text1"/>
         </w:rPr>
-        <w:t>Pycharm</w:t>
-      </w:r>
-      <w:proofErr w:type="spellEnd"/>
+        <w:t>.txt"</w:t>
+      </w:r>
+    </w:p>
+    <w:p>
+      <w:pPr>
+        <w:pStyle w:val="PargrafodaLista"/>
+        <w:ind w:left="1440"/>
+        <w:jc w:val="both"/>
+      </w:pPr>
+    </w:p>
+    <w:p>
+      <w:pPr>
+        <w:pStyle w:val="PargrafodaLista"/>
+        <w:ind w:left="1440"/>
+        <w:jc w:val="both"/>
+      </w:pPr>
+      <w:r>
+        <w:rPr>
+          <w:b/>
+          <w:bCs/>
+        </w:rPr>
+        <w:t>OBSERVAÇÃO:</w:t>
+      </w:r>
+      <w:r>
+        <w:rPr>
+          <w:b/>
+          <w:bCs/>
+        </w:rPr>
+        <w:t xml:space="preserve"> </w:t>
+      </w:r>
+      <w:r>
+        <w:t>Os warnings</w:t>
+      </w:r>
+      <w:r>
+        <w:t xml:space="preserve"> </w:t>
+      </w:r>
+      <w:r>
+        <w:t>extensos</w:t>
+      </w:r>
+      <w:r>
+        <w:t xml:space="preserve"> presentes no arquivo de log</w:t>
+      </w:r>
+      <w:r>
+        <w:t xml:space="preserve"> relacionados a </w:t>
+      </w:r>
       <w:r>
         <w:rPr>
           <w:i/>
           <w:iCs/>
-          <w:color w:val="000000" w:themeColor="text1"/>
-        </w:rPr>
-        <w:t xml:space="preserve"> LOGS\</w:t>
-      </w:r>
-      <w:proofErr w:type="spellStart"/>
+        </w:rPr>
+        <w:t>while_loop</w:t>
+      </w:r>
+      <w:r>
+        <w:t xml:space="preserve">, </w:t>
+      </w:r>
       <w:r>
         <w:rPr>
           <w:i/>
           <w:iCs/>
-          <w:color w:val="000000" w:themeColor="text1"/>
-        </w:rPr>
-        <w:t>Main</w:t>
-      </w:r>
-      <w:proofErr w:type="spellEnd"/>
+        </w:rPr>
+        <w:t>StatelessRandomUniform</w:t>
+      </w:r>
+      <w:r>
+        <w:t xml:space="preserve">, </w:t>
+      </w:r>
       <w:r>
         <w:rPr>
           <w:i/>
           <w:iCs/>
-          <w:color w:val="000000" w:themeColor="text1"/>
-        </w:rPr>
-        <w:t xml:space="preserve"> </w:t>
-      </w:r>
-      <w:proofErr w:type="spellStart"/>
+        </w:rPr>
+        <w:t>ImageProjectiveTransformV3</w:t>
+      </w:r>
+      <w:r>
+        <w:t xml:space="preserve"> e </w:t>
+      </w:r>
       <w:r>
         <w:rPr>
           <w:i/>
           <w:iCs/>
-          <w:color w:val="000000" w:themeColor="text1"/>
-        </w:rPr>
-        <w:t>ResNet</w:t>
-      </w:r>
-      <w:proofErr w:type="spellEnd"/>
-      <w:r>
-        <w:rPr>
-          <w:i/>
-          <w:iCs/>
-          <w:color w:val="000000" w:themeColor="text1"/>
-        </w:rPr>
-        <w:t xml:space="preserve"> </w:t>
-      </w:r>
-      <w:proofErr w:type="spellStart"/>
-      <w:r>
-        <w:rPr>
-          <w:i/>
-          <w:iCs/>
-          <w:color w:val="000000" w:themeColor="text1"/>
-        </w:rPr>
-        <w:t>Sanity</w:t>
-      </w:r>
-      <w:proofErr w:type="spellEnd"/>
-      <w:r>
-        <w:rPr>
-          <w:i/>
-          <w:iCs/>
-          <w:color w:val="000000" w:themeColor="text1"/>
-        </w:rPr>
-        <w:t xml:space="preserve"> </w:t>
-      </w:r>
-      <w:proofErr w:type="spellStart"/>
-      <w:r>
-        <w:rPr>
-          <w:i/>
-          <w:iCs/>
-          <w:color w:val="000000" w:themeColor="text1"/>
-        </w:rPr>
-        <w:t>Check</w:t>
-      </w:r>
-      <w:proofErr w:type="spellEnd"/>
-      <w:r>
-        <w:rPr>
-          <w:i/>
-          <w:iCs/>
-          <w:color w:val="000000" w:themeColor="text1"/>
-        </w:rPr>
-        <w:t xml:space="preserve"> - LOG</w:t>
-      </w:r>
-      <w:r>
-        <w:rPr>
-          <w:i/>
-          <w:iCs/>
-          <w:color w:val="000000" w:themeColor="text1"/>
-        </w:rPr>
-        <w:t>.txt"</w:t>
-      </w:r>
-    </w:p>
-    <w:p>
-      <w:pPr>
-        <w:pStyle w:val="PargrafodaLista"/>
-        <w:ind w:left="1440"/>
-        <w:jc w:val="both"/>
-      </w:pPr>
-    </w:p>
-    <w:p>
-      <w:pPr>
-        <w:pStyle w:val="PargrafodaLista"/>
-        <w:ind w:left="1440"/>
-        <w:jc w:val="both"/>
-      </w:pPr>
-      <w:r>
-        <w:rPr>
-          <w:b/>
-          <w:bCs/>
-        </w:rPr>
-        <w:t>OBSERVAÇÃO:</w:t>
-      </w:r>
-      <w:r>
-        <w:rPr>
-          <w:b/>
-          <w:bCs/>
-        </w:rPr>
-        <w:t xml:space="preserve"> </w:t>
-      </w:r>
-      <w:r>
-        <w:t xml:space="preserve">Os </w:t>
-      </w:r>
-      <w:proofErr w:type="spellStart"/>
-      <w:r>
-        <w:t>warnings</w:t>
-      </w:r>
-      <w:proofErr w:type="spellEnd"/>
-      <w:r>
-        <w:t xml:space="preserve"> </w:t>
-      </w:r>
-      <w:r>
-        <w:t>extensos</w:t>
-      </w:r>
-      <w:r>
-        <w:t xml:space="preserve"> presentes no arquivo de log</w:t>
-      </w:r>
-      <w:r>
-        <w:t xml:space="preserve"> relacionados a </w:t>
-      </w:r>
-      <w:proofErr w:type="spellStart"/>
-      <w:r>
-        <w:rPr>
-          <w:i/>
-          <w:iCs/>
-        </w:rPr>
-        <w:t>while_loop</w:t>
-      </w:r>
-      <w:proofErr w:type="spellEnd"/>
-      <w:r>
-        <w:t xml:space="preserve">, </w:t>
-      </w:r>
-      <w:proofErr w:type="spellStart"/>
-      <w:r>
-        <w:rPr>
-          <w:i/>
-          <w:iCs/>
-        </w:rPr>
-        <w:t>StatelessRandomUniform</w:t>
-      </w:r>
-      <w:proofErr w:type="spellEnd"/>
-      <w:r>
-        <w:t xml:space="preserve">, </w:t>
-      </w:r>
-      <w:r>
-        <w:rPr>
-          <w:i/>
-          <w:iCs/>
-        </w:rPr>
-        <w:t>ImageProjectiveTransformV3</w:t>
-      </w:r>
-      <w:r>
-        <w:t xml:space="preserve"> e </w:t>
-      </w:r>
-      <w:r>
-        <w:rPr>
-          <w:i/>
-          <w:iCs/>
         </w:rPr>
         <w:t>AdjustContrastv2</w:t>
       </w:r>
@@ -2365,23 +1903,7 @@
         <w:t>representam</w:t>
       </w:r>
       <w:r>
-        <w:t xml:space="preserve"> um problema funcional. Eles indicam apenas que o </w:t>
-      </w:r>
-      <w:proofErr w:type="spellStart"/>
-      <w:r>
-        <w:t>TensorFlow</w:t>
-      </w:r>
-      <w:proofErr w:type="spellEnd"/>
-      <w:r>
-        <w:t xml:space="preserve"> está encapsulando operações de data </w:t>
-      </w:r>
-      <w:proofErr w:type="spellStart"/>
-      <w:r>
-        <w:t>augmentation</w:t>
-      </w:r>
-      <w:proofErr w:type="spellEnd"/>
-      <w:r>
-        <w:t xml:space="preserve"> estocástico em laços internos por limitações do conversor de grafo. </w:t>
+        <w:t xml:space="preserve"> um problema funcional. Eles indicam apenas que o TensorFlow está encapsulando operações de data augmentation estocástico em laços internos por limitações do conversor de grafo. </w:t>
       </w:r>
     </w:p>
     <w:p>
@@ -2413,68 +1935,22 @@
           <w:sz w:val="18"/>
           <w:szCs w:val="18"/>
         </w:rPr>
-        <w:t xml:space="preserve"> </w:t>
+        <w:t xml:space="preserve"> 5</w:t>
       </w:r>
       <w:r>
         <w:rPr>
           <w:sz w:val="18"/>
           <w:szCs w:val="18"/>
         </w:rPr>
-        <w:t>5</w:t>
+        <w:t xml:space="preserve">: </w:t>
       </w:r>
       <w:r>
         <w:rPr>
           <w:sz w:val="18"/>
           <w:szCs w:val="18"/>
         </w:rPr>
-        <w:t xml:space="preserve">: </w:t>
-      </w:r>
-      <w:r>
-        <w:rPr>
-          <w:sz w:val="18"/>
-          <w:szCs w:val="18"/>
-        </w:rPr>
-        <w:t>Resultados obtidos d</w:t>
-      </w:r>
-      <w:r>
-        <w:rPr>
-          <w:sz w:val="18"/>
-          <w:szCs w:val="18"/>
-        </w:rPr>
-        <w:t xml:space="preserve">o treinamento </w:t>
-      </w:r>
-      <w:r>
-        <w:rPr>
-          <w:sz w:val="18"/>
-          <w:szCs w:val="18"/>
-        </w:rPr>
-        <w:t xml:space="preserve">no teste de </w:t>
-      </w:r>
-      <w:proofErr w:type="spellStart"/>
-      <w:r>
-        <w:rPr>
-          <w:sz w:val="18"/>
-          <w:szCs w:val="18"/>
-        </w:rPr>
-        <w:t>Sanity</w:t>
-      </w:r>
-      <w:proofErr w:type="spellEnd"/>
-      <w:r>
-        <w:rPr>
-          <w:sz w:val="18"/>
-          <w:szCs w:val="18"/>
-        </w:rPr>
-        <w:t xml:space="preserve"> </w:t>
-      </w:r>
-      <w:proofErr w:type="spellStart"/>
-      <w:r>
-        <w:rPr>
-          <w:sz w:val="18"/>
-          <w:szCs w:val="18"/>
-        </w:rPr>
-        <w:t>Check</w:t>
-      </w:r>
-      <w:proofErr w:type="spellEnd"/>
+        <w:t>Resultados obtidos do treinamento no teste de Sanity Check</w:t>
+      </w:r>
     </w:p>
     <w:p>
       <w:pPr>
@@ -2563,15 +2039,7 @@
         <w:t>saudável e esperado para este teste</w:t>
       </w:r>
       <w:r>
-        <w:t xml:space="preserve">. A </w:t>
-      </w:r>
-      <w:proofErr w:type="spellStart"/>
-      <w:r>
-        <w:t>loss</w:t>
-      </w:r>
-      <w:proofErr w:type="spellEnd"/>
-      <w:r>
-        <w:t xml:space="preserve"> cai progressivamente ao longo das cinco épocas, e a acurácia de treino se mantém na faixa de 43–44%. Isso indica que o modelo está aprendendo padrões. </w:t>
+        <w:t xml:space="preserve">. A loss cai progressivamente ao longo das cinco épocas, e a acurácia de treino se mantém na faixa de 43–44%. Isso indica que o modelo está aprendendo padrões. </w:t>
       </w:r>
       <w:r>
         <w:t>A</w:t>
@@ -2635,68 +2103,22 @@
           <w:sz w:val="18"/>
           <w:szCs w:val="18"/>
         </w:rPr>
-        <w:t xml:space="preserve"> </w:t>
+        <w:t xml:space="preserve"> 6</w:t>
       </w:r>
       <w:r>
         <w:rPr>
           <w:sz w:val="18"/>
           <w:szCs w:val="18"/>
         </w:rPr>
-        <w:t>6</w:t>
+        <w:t xml:space="preserve">: </w:t>
       </w:r>
       <w:r>
         <w:rPr>
           <w:sz w:val="18"/>
           <w:szCs w:val="18"/>
         </w:rPr>
-        <w:t xml:space="preserve">: </w:t>
-      </w:r>
-      <w:r>
-        <w:rPr>
-          <w:sz w:val="18"/>
-          <w:szCs w:val="18"/>
-        </w:rPr>
-        <w:t>Resultados obtidos d</w:t>
-      </w:r>
-      <w:r>
-        <w:rPr>
-          <w:sz w:val="18"/>
-          <w:szCs w:val="18"/>
-        </w:rPr>
-        <w:t xml:space="preserve">a validação </w:t>
-      </w:r>
-      <w:r>
-        <w:rPr>
-          <w:sz w:val="18"/>
-          <w:szCs w:val="18"/>
-        </w:rPr>
-        <w:t xml:space="preserve">no teste de </w:t>
-      </w:r>
-      <w:proofErr w:type="spellStart"/>
-      <w:r>
-        <w:rPr>
-          <w:sz w:val="18"/>
-          <w:szCs w:val="18"/>
-        </w:rPr>
-        <w:t>Sanity</w:t>
-      </w:r>
-      <w:proofErr w:type="spellEnd"/>
-      <w:r>
-        <w:rPr>
-          <w:sz w:val="18"/>
-          <w:szCs w:val="18"/>
-        </w:rPr>
-        <w:t xml:space="preserve"> </w:t>
-      </w:r>
-      <w:proofErr w:type="spellStart"/>
-      <w:r>
-        <w:rPr>
-          <w:sz w:val="18"/>
-          <w:szCs w:val="18"/>
-        </w:rPr>
-        <w:t>Check</w:t>
-      </w:r>
-      <w:proofErr w:type="spellEnd"/>
+        <w:t>Resultados obtidos da validação no teste de Sanity Check</w:t>
+      </w:r>
       <w:r>
         <w:t xml:space="preserve"> </w:t>
       </w:r>
@@ -2766,15 +2188,7 @@
         <w:jc w:val="both"/>
       </w:pPr>
       <w:r>
-        <w:t xml:space="preserve">Apesar de a </w:t>
-      </w:r>
-      <w:proofErr w:type="spellStart"/>
-      <w:r>
-        <w:t>loss</w:t>
-      </w:r>
-      <w:proofErr w:type="spellEnd"/>
-      <w:r>
-        <w:t xml:space="preserve"> de validação apresentar uma leve redução ao longo das épocas, a acurácia e o top-1 de validação permanecem em zero durante todo o treinamento.</w:t>
+        <w:t>Apesar de a loss de validação apresentar uma leve redução ao longo das épocas, a acurácia e o top-1 de validação permanecem em zero durante todo o treinamento.</w:t>
       </w:r>
       <w:r>
         <w:t xml:space="preserve"> </w:t>
@@ -2785,7 +2199,6 @@
         </w:rPr>
         <w:t xml:space="preserve">A ResNet-50 treinada do zero no </w:t>
       </w:r>
-      <w:proofErr w:type="spellStart"/>
       <w:r>
         <w:rPr>
           <w:i/>
@@ -2794,7 +2207,6 @@
         </w:rPr>
         <w:t>ImageNet</w:t>
       </w:r>
-      <w:proofErr w:type="spellEnd"/>
       <w:r>
         <w:rPr>
           <w:color w:val="000000" w:themeColor="text1"/>
@@ -2854,31 +2266,7 @@
         <w:t xml:space="preserve">→ Conclusões: </w:t>
       </w:r>
       <w:r>
-        <w:t xml:space="preserve">Do ponto de vista da dinâmica de otimização, o treinamento é estável. O learning rate inicial de 0.1 não causou divergência, a </w:t>
-      </w:r>
-      <w:proofErr w:type="spellStart"/>
-      <w:r>
-        <w:t>loss</w:t>
-      </w:r>
-      <w:proofErr w:type="spellEnd"/>
-      <w:r>
-        <w:t xml:space="preserve"> não apresentou explosões e não há sinais de instabilidade numérica, mesmo com </w:t>
-      </w:r>
-      <w:proofErr w:type="spellStart"/>
-      <w:r>
-        <w:t>mixed</w:t>
-      </w:r>
-      <w:proofErr w:type="spellEnd"/>
-      <w:r>
-        <w:t xml:space="preserve"> </w:t>
-      </w:r>
-      <w:proofErr w:type="spellStart"/>
-      <w:r>
-        <w:t>precision</w:t>
-      </w:r>
-      <w:proofErr w:type="spellEnd"/>
-      <w:r>
-        <w:t>.</w:t>
+        <w:t>Do ponto de vista da dinâmica de otimização, o treinamento é estável. O learning rate inicial de 0.1 não causou divergência, a loss não apresentou explosões e não há sinais de instabilidade numérica, mesmo com mixed precision.</w:t>
       </w:r>
       <w:r>
         <w:t xml:space="preserve"> </w:t>
@@ -3064,7 +2452,6 @@
       <w:r>
         <w:t xml:space="preserve">Do ponto de vista funcional, o </w:t>
       </w:r>
-      <w:proofErr w:type="spellStart"/>
       <w:r>
         <w:rPr>
           <w:i/>
@@ -3072,11 +2459,9 @@
         </w:rPr>
         <w:t>DataLoader</w:t>
       </w:r>
-      <w:proofErr w:type="spellEnd"/>
       <w:r>
         <w:t xml:space="preserve"> funciona: ele carrega imagens, cria splits treino/validação, aplica </w:t>
       </w:r>
-      <w:proofErr w:type="spellStart"/>
       <w:r>
         <w:rPr>
           <w:i/>
@@ -3084,46 +2469,32 @@
         </w:rPr>
         <w:t>augmentations</w:t>
       </w:r>
-      <w:proofErr w:type="spellEnd"/>
       <w:r>
         <w:t xml:space="preserve">, normaliza os pixels e entrega </w:t>
       </w:r>
-      <w:proofErr w:type="spellStart"/>
       <w:r>
         <w:rPr>
           <w:i/>
           <w:iCs/>
         </w:rPr>
-        <w:t>tf.</w:t>
-      </w:r>
-      <w:proofErr w:type="gramStart"/>
+        <w:t>tf.data.Dataset</w:t>
+      </w:r>
+      <w:r>
+        <w:t xml:space="preserve"> válidos</w:t>
+      </w:r>
+      <w:r>
+        <w:t xml:space="preserve">. </w:t>
+      </w:r>
+      <w:r>
+        <w:t xml:space="preserve">No entanto, do ponto de vista metodológico e estatístico, esse </w:t>
+      </w:r>
       <w:r>
         <w:rPr>
           <w:i/>
           <w:iCs/>
         </w:rPr>
-        <w:t>data.Dataset</w:t>
-      </w:r>
-      <w:proofErr w:type="spellEnd"/>
-      <w:proofErr w:type="gramEnd"/>
-      <w:r>
-        <w:t xml:space="preserve"> válidos</w:t>
-      </w:r>
-      <w:r>
-        <w:t xml:space="preserve">. </w:t>
-      </w:r>
-      <w:r>
-        <w:t xml:space="preserve">No entanto, do ponto de vista metodológico e estatístico, esse </w:t>
-      </w:r>
-      <w:proofErr w:type="spellStart"/>
-      <w:r>
-        <w:rPr>
-          <w:i/>
-          <w:iCs/>
-        </w:rPr>
         <w:t>loader</w:t>
       </w:r>
-      <w:proofErr w:type="spellEnd"/>
       <w:r>
         <w:t xml:space="preserve"> não </w:t>
       </w:r>
@@ -3174,21 +2545,7 @@
           <w:b/>
           <w:bCs/>
         </w:rPr>
-        <w:t>P</w:t>
-      </w:r>
-      <w:r>
-        <w:rPr>
-          <w:b/>
-          <w:bCs/>
-        </w:rPr>
-        <w:t>rimeiro ponto crítico</w:t>
-      </w:r>
-      <w:r>
-        <w:rPr>
-          <w:b/>
-          <w:bCs/>
-        </w:rPr>
-        <w:t>:</w:t>
+        <w:t>Primeiro ponto crítico:</w:t>
       </w:r>
       <w:r>
         <w:t xml:space="preserve"> </w:t>
@@ -3196,7 +2553,6 @@
       <w:r>
         <w:t xml:space="preserve">uso de </w:t>
       </w:r>
-      <w:proofErr w:type="spellStart"/>
       <w:r>
         <w:rPr>
           <w:i/>
@@ -3204,11 +2560,9 @@
         </w:rPr>
         <w:t>image_dataset_from_directory</w:t>
       </w:r>
-      <w:proofErr w:type="spellEnd"/>
       <w:r>
         <w:t xml:space="preserve"> com </w:t>
       </w:r>
-      <w:proofErr w:type="spellStart"/>
       <w:r>
         <w:rPr>
           <w:i/>
@@ -3216,33 +2570,8 @@
         </w:rPr>
         <w:t>validation_split</w:t>
       </w:r>
-      <w:proofErr w:type="spellEnd"/>
-      <w:r>
-        <w:t xml:space="preserve"> no mesmo diretório raiz. Esse método assume que todas as classes estão perfeitamente balanceadas e distribuídas de forma aleatória no </w:t>
-      </w:r>
-      <w:proofErr w:type="spellStart"/>
-      <w:r>
-        <w:t>filesystem</w:t>
-      </w:r>
-      <w:proofErr w:type="spellEnd"/>
-      <w:r>
-        <w:t xml:space="preserve">, o que raramente é verdade em </w:t>
-      </w:r>
-      <w:proofErr w:type="spellStart"/>
-      <w:r>
-        <w:t>datasets</w:t>
-      </w:r>
-      <w:proofErr w:type="spellEnd"/>
-      <w:r>
-        <w:t xml:space="preserve"> reais. O split é feito por ordem interna do </w:t>
-      </w:r>
-      <w:proofErr w:type="spellStart"/>
-      <w:r>
-        <w:t>loader</w:t>
-      </w:r>
-      <w:proofErr w:type="spellEnd"/>
-      <w:r>
-        <w:t>, não por semântica da classe.</w:t>
+      <w:r>
+        <w:t xml:space="preserve"> no mesmo diretório raiz. Esse método assume que todas as classes estão perfeitamente balanceadas e distribuídas de forma aleatória no filesystem, o que raramente é verdade em datasets reais. O split é feito por ordem interna do loader, não por semântica da classe.</w:t>
       </w:r>
     </w:p>
     <w:p>
@@ -3267,47 +2596,13 @@
           <w:b/>
           <w:bCs/>
         </w:rPr>
-        <w:t>S</w:t>
-      </w:r>
-      <w:r>
-        <w:rPr>
-          <w:b/>
-          <w:bCs/>
-        </w:rPr>
-        <w:t>egundo ponto</w:t>
-      </w:r>
-      <w:r>
-        <w:rPr>
-          <w:b/>
-          <w:bCs/>
-        </w:rPr>
-        <w:t xml:space="preserve"> crítico</w:t>
+        <w:t>Segundo ponto crítico</w:t>
       </w:r>
       <w:r>
         <w:t>:</w:t>
       </w:r>
       <w:r>
-        <w:t xml:space="preserve"> </w:t>
-      </w:r>
-      <w:r>
-        <w:t>aplicação de</w:t>
-      </w:r>
-      <w:r>
-        <w:t xml:space="preserve"> </w:t>
-      </w:r>
-      <w:proofErr w:type="spellStart"/>
-      <w:r>
-        <w:t>augmentations</w:t>
-      </w:r>
-      <w:proofErr w:type="spellEnd"/>
-      <w:r>
-        <w:t xml:space="preserve"> pesadas apenas no treino, </w:t>
-      </w:r>
-      <w:r>
-        <w:t>enquanto</w:t>
-      </w:r>
-      <w:r>
-        <w:t xml:space="preserve"> a validação recebe imagens apenas redimensionadas e normalizadas. Isso em si é correto, </w:t>
+        <w:t xml:space="preserve"> aplicação de augmentations pesadas apenas no treino, enquanto a validação recebe imagens apenas redimensionadas e normalizadas. Isso em si é correto, </w:t>
       </w:r>
       <w:r>
         <w:rPr>
@@ -3317,54 +2612,11 @@
         <w:t>desde que</w:t>
       </w:r>
       <w:r>
-        <w:t xml:space="preserve"> o pré-processamento geométrico de treino e validação seja compatível. Na prática</w:t>
-      </w:r>
-      <w:r>
-        <w:t xml:space="preserve">, </w:t>
-      </w:r>
-      <w:r>
-        <w:t xml:space="preserve">o modelo </w:t>
-      </w:r>
-      <w:proofErr w:type="spellStart"/>
-      <w:proofErr w:type="gramStart"/>
-      <w:r>
-        <w:t>analisa</w:t>
-      </w:r>
-      <w:r>
-        <w:t>,sub</w:t>
-      </w:r>
-      <w:proofErr w:type="spellEnd"/>
-      <w:proofErr w:type="gramEnd"/>
-      <w:r>
-        <w:t>-regiões aleatórias das imagens</w:t>
-      </w:r>
-      <w:r>
-        <w:t xml:space="preserve"> no treino</w:t>
-      </w:r>
-      <w:r>
-        <w:t xml:space="preserve">, enquanto na validação ele vê a imagem inteira redimensionada. </w:t>
-      </w:r>
-      <w:r>
-        <w:t>I</w:t>
-      </w:r>
-      <w:r>
-        <w:t xml:space="preserve">sso frequentemente gera quebra </w:t>
+        <w:t xml:space="preserve"> o pré-processamento geométrico de treino e validação seja compatível. Na prática, o modelo analisa,sub-regiões aleatórias das imagens no treino, enquanto na validação ele vê a imagem inteira redimensionada. Isso frequentemente gera quebra </w:t>
       </w:r>
       <w:r>
         <w:lastRenderedPageBreak/>
-        <w:t xml:space="preserve">total de generalização, resultando exatamente no padrão que </w:t>
-      </w:r>
-      <w:r>
-        <w:t>foi</w:t>
-      </w:r>
-      <w:r>
-        <w:t xml:space="preserve"> observ</w:t>
-      </w:r>
-      <w:r>
-        <w:t>ado</w:t>
-      </w:r>
-      <w:r>
-        <w:t>: treino aprende algo, validação nunca acerta.</w:t>
+        <w:t>total de generalização, resultando exatamente no padrão que foi observado: treino aprende algo, validação nunca acerta.</w:t>
       </w:r>
     </w:p>
     <w:p>
@@ -3405,61 +2657,7 @@
         <w:t xml:space="preserve"> </w:t>
       </w:r>
       <w:r>
-        <w:t>fixação de</w:t>
-      </w:r>
-      <w:r>
-        <w:t xml:space="preserve"> </w:t>
-      </w:r>
-      <w:proofErr w:type="spellStart"/>
-      <w:r>
-        <w:t>steps_per_epoch</w:t>
-      </w:r>
-      <w:proofErr w:type="spellEnd"/>
-      <w:r>
-        <w:t xml:space="preserve"> e </w:t>
-      </w:r>
-      <w:proofErr w:type="spellStart"/>
-      <w:r>
-        <w:t>validation_steps</w:t>
-      </w:r>
-      <w:proofErr w:type="spellEnd"/>
-      <w:r>
-        <w:t xml:space="preserve"> manualmente no trainer, enquanto o </w:t>
-      </w:r>
-      <w:proofErr w:type="spellStart"/>
-      <w:r>
-        <w:t>DataLoader</w:t>
-      </w:r>
-      <w:proofErr w:type="spellEnd"/>
-      <w:r>
-        <w:t xml:space="preserve"> já entrega </w:t>
-      </w:r>
-      <w:proofErr w:type="spellStart"/>
-      <w:r>
-        <w:t>datasets</w:t>
-      </w:r>
-      <w:proofErr w:type="spellEnd"/>
-      <w:r>
-        <w:t xml:space="preserve"> com cardinalidade definida. Isso cria uma situação em que o </w:t>
-      </w:r>
-      <w:proofErr w:type="spellStart"/>
-      <w:r>
-        <w:t>Keras</w:t>
-      </w:r>
-      <w:proofErr w:type="spellEnd"/>
-      <w:r>
-        <w:t xml:space="preserve"> não está necessariamente avaliando todas as amostras de validação, e pode estar avaliando batches repetidos ou truncados. Em </w:t>
-      </w:r>
-      <w:proofErr w:type="spellStart"/>
-      <w:r>
-        <w:t>datasets</w:t>
-      </w:r>
-      <w:proofErr w:type="spellEnd"/>
-      <w:r>
-        <w:t xml:space="preserve"> pequenos, isso é devastador</w:t>
-      </w:r>
-      <w:r>
-        <w:t>.</w:t>
+        <w:t>fixação de steps_per_epoch e validation_steps manualmente no trainer, enquanto o DataLoader já entrega datasets com cardinalidade definida. Isso cria uma situação em que o Keras não está necessariamente avaliando todas as amostras de validação, e pode estar avaliando batches repetidos ou truncados. Em datasets pequenos, isso é devastador.</w:t>
       </w:r>
     </w:p>
     <w:p>
@@ -3495,47 +2693,16 @@
         <w:t xml:space="preserve">: </w:t>
       </w:r>
       <w:r>
-        <w:t xml:space="preserve">Os scripts de carregamento de dados foram reescritos, evitando os erros previamente discutidos. Adicionalmente, as funções definidas foram alocadas no arquivo ResNet50_Utils.py, separando-a do arquivo </w:t>
-      </w:r>
-      <w:proofErr w:type="spellStart"/>
-      <w:r>
+        <w:t xml:space="preserve">Os scripts de carregamento de dados foram reescritos, evitando os erros previamente discutidos. Adicionalmente, as funções definidas para divisão correta da base de dados foram alocadas no arquivo Utils.py, separando-a do arquivo </w:t>
+      </w:r>
+      <w:r>
+        <w:rPr>
+          <w:u w:val="single"/>
+        </w:rPr>
         <w:t>DataLoader</w:t>
       </w:r>
-      <w:proofErr w:type="spellEnd"/>
-      <w:r>
-        <w:t xml:space="preserve"> original, o qual servia para carregar a base tanto para a ViT quanto para a </w:t>
-      </w:r>
-      <w:proofErr w:type="spellStart"/>
-      <w:r>
-        <w:t>ResNet</w:t>
-      </w:r>
-      <w:proofErr w:type="spellEnd"/>
-    </w:p>
-    <w:p>
-      <w:pPr>
-        <w:pStyle w:val="PargrafodaLista"/>
-        <w:ind w:left="1488"/>
-        <w:jc w:val="both"/>
-        <w:rPr>
-          <w:b/>
-          <w:bCs/>
-        </w:rPr>
-      </w:pPr>
-    </w:p>
-    <w:p>
-      <w:pPr>
-        <w:pStyle w:val="PargrafodaLista"/>
-        <w:ind w:left="1488"/>
-        <w:jc w:val="both"/>
-      </w:pPr>
-      <w:r>
-        <w:t xml:space="preserve">Também </w:t>
-      </w:r>
-      <w:r>
-        <w:t xml:space="preserve">foi criado uma função para dividir a base de dados antes do treinamento entre treino e validação, permitindo manter a base consistente entre os diferentes treinos conduzidos. Agora, a estrutura esperada segue conforme ilustrado pela figura </w:t>
-      </w:r>
-      <w:r>
-        <w:t>7.</w:t>
+      <w:r>
+        <w:t xml:space="preserve"> específico da arquitetura. Agora, a estrutura esperada segue conforme ilustrado pela figura 7.</w:t>
       </w:r>
     </w:p>
     <w:p>
@@ -3551,6 +2718,7 @@
         <w:ind w:left="1440"/>
         <w:jc w:val="center"/>
       </w:pPr>
+      <w:bookmarkStart w:id="1" w:name="_Hlk219102795"/>
       <w:r>
         <w:rPr>
           <w:sz w:val="18"/>
@@ -3594,6 +2762,7 @@
         <w:rPr>
           <w:b/>
           <w:bCs/>
+          <w:noProof/>
         </w:rPr>
         <w:drawing>
           <wp:inline distT="0" distB="0" distL="0" distR="0" wp14:anchorId="30426B2B" wp14:editId="3CA77113">
@@ -3652,6 +2821,7 @@
         </w:rPr>
       </w:pPr>
     </w:p>
+    <w:bookmarkEnd w:id="1"/>
     <w:p>
       <w:pPr>
         <w:pStyle w:val="PargrafodaLista"/>
@@ -3666,21 +2836,7 @@
           <w:b/>
           <w:bCs/>
         </w:rPr>
-        <w:t>Resultados</w:t>
-      </w:r>
-      <w:r>
-        <w:rPr>
-          <w:b/>
-          <w:bCs/>
-        </w:rPr>
-        <w:t>:</w:t>
-      </w:r>
-      <w:r>
-        <w:rPr>
-          <w:b/>
-          <w:bCs/>
-        </w:rPr>
-        <w:t xml:space="preserve"> </w:t>
+        <w:t xml:space="preserve">Resultados: </w:t>
       </w:r>
       <w:r>
         <w:t>Os</w:t>
@@ -3698,31 +2854,29 @@
           <w:iCs/>
           <w:color w:val="000000" w:themeColor="text1"/>
         </w:rPr>
-        <w:t xml:space="preserve">Logs do </w:t>
-      </w:r>
-      <w:proofErr w:type="spellStart"/>
+        <w:t>Logs do Pycharm</w:t>
+      </w:r>
       <w:r>
         <w:rPr>
           <w:i/>
           <w:iCs/>
           <w:color w:val="000000" w:themeColor="text1"/>
         </w:rPr>
-        <w:t>Pycharm</w:t>
-      </w:r>
-      <w:proofErr w:type="spellEnd"/>
+        <w:t xml:space="preserve"> </w:t>
+      </w:r>
+      <w:r>
+        <w:rPr>
+          <w:color w:val="000000" w:themeColor="text1"/>
+        </w:rPr>
+        <w:t xml:space="preserve">estão </w:t>
+      </w:r>
       <w:r>
         <w:rPr>
           <w:i/>
           <w:iCs/>
           <w:color w:val="000000" w:themeColor="text1"/>
         </w:rPr>
-        <w:t xml:space="preserve"> </w:t>
-      </w:r>
-      <w:r>
-        <w:rPr>
-          <w:color w:val="000000" w:themeColor="text1"/>
-        </w:rPr>
-        <w:t xml:space="preserve">estão </w:t>
+        <w:t>localizados em "\Projeto-Classificadores\Documentation\</w:t>
       </w:r>
       <w:r>
         <w:rPr>
@@ -3730,108 +2884,16 @@
           <w:iCs/>
           <w:color w:val="000000" w:themeColor="text1"/>
         </w:rPr>
-        <w:t>localizados em "\Projeto-Classificadores\</w:t>
-      </w:r>
-      <w:proofErr w:type="spellStart"/>
+        <w:t>Pycharm LOGS\Main</w:t>
+      </w:r>
       <w:r>
         <w:rPr>
           <w:i/>
           <w:iCs/>
           <w:color w:val="000000" w:themeColor="text1"/>
         </w:rPr>
-        <w:t>Documentation</w:t>
-      </w:r>
-      <w:proofErr w:type="spellEnd"/>
-      <w:r>
-        <w:rPr>
-          <w:i/>
-          <w:iCs/>
-          <w:color w:val="000000" w:themeColor="text1"/>
-        </w:rPr>
-        <w:t>\</w:t>
-      </w:r>
-      <w:proofErr w:type="spellStart"/>
-      <w:r>
-        <w:rPr>
-          <w:i/>
-          <w:iCs/>
-          <w:color w:val="000000" w:themeColor="text1"/>
-        </w:rPr>
-        <w:t>Pycharm</w:t>
-      </w:r>
-      <w:proofErr w:type="spellEnd"/>
-      <w:r>
-        <w:rPr>
-          <w:i/>
-          <w:iCs/>
-          <w:color w:val="000000" w:themeColor="text1"/>
-        </w:rPr>
-        <w:t xml:space="preserve"> LOGS\</w:t>
-      </w:r>
-      <w:proofErr w:type="spellStart"/>
-      <w:r>
-        <w:rPr>
-          <w:i/>
-          <w:iCs/>
-          <w:color w:val="000000" w:themeColor="text1"/>
-        </w:rPr>
-        <w:t>Main</w:t>
-      </w:r>
-      <w:proofErr w:type="spellEnd"/>
-      <w:r>
-        <w:rPr>
-          <w:i/>
-          <w:iCs/>
-          <w:color w:val="000000" w:themeColor="text1"/>
-        </w:rPr>
-        <w:t xml:space="preserve"> </w:t>
-      </w:r>
-      <w:proofErr w:type="spellStart"/>
-      <w:r>
-        <w:rPr>
-          <w:i/>
-          <w:iCs/>
-          <w:color w:val="000000" w:themeColor="text1"/>
-        </w:rPr>
-        <w:t>ResNet</w:t>
-      </w:r>
-      <w:proofErr w:type="spellEnd"/>
-      <w:r>
-        <w:rPr>
-          <w:i/>
-          <w:iCs/>
-          <w:color w:val="000000" w:themeColor="text1"/>
-        </w:rPr>
-        <w:t xml:space="preserve"> </w:t>
-      </w:r>
-      <w:proofErr w:type="spellStart"/>
-      <w:r>
-        <w:rPr>
-          <w:i/>
-          <w:iCs/>
-          <w:color w:val="000000" w:themeColor="text1"/>
-        </w:rPr>
-        <w:t>Sanity</w:t>
-      </w:r>
-      <w:proofErr w:type="spellEnd"/>
-      <w:r>
-        <w:rPr>
-          <w:i/>
-          <w:iCs/>
-          <w:color w:val="000000" w:themeColor="text1"/>
-        </w:rPr>
-        <w:t xml:space="preserve"> </w:t>
-      </w:r>
-      <w:proofErr w:type="spellStart"/>
-      <w:r>
-        <w:rPr>
-          <w:i/>
-          <w:iCs/>
-          <w:color w:val="000000" w:themeColor="text1"/>
-        </w:rPr>
-        <w:t>Check</w:t>
-      </w:r>
-      <w:proofErr w:type="spellEnd"/>
+        <w:t xml:space="preserve"> ResNet Sanity Check</w:t>
+      </w:r>
       <w:r>
         <w:rPr>
           <w:i/>
@@ -3885,15 +2947,7 @@
         <w:t xml:space="preserve">o </w:t>
       </w:r>
       <w:r>
-        <w:t xml:space="preserve">carregamento de dados está correto e consistente. O </w:t>
-      </w:r>
-      <w:proofErr w:type="spellStart"/>
-      <w:r>
-        <w:t>TensorFlow</w:t>
-      </w:r>
-      <w:proofErr w:type="spellEnd"/>
-      <w:r>
-        <w:t xml:space="preserve"> detectou 11.074 imagens para treino e 2.767 para validação, distribuídas em três classes bem definidas</w:t>
+        <w:t>carregamento de dados está correto e consistente. O TensorFlow detectou 11.074 imagens para treino e 2.767 para validação, distribuídas em três classes bem definidas</w:t>
       </w:r>
       <w:r>
         <w:t xml:space="preserve">. </w:t>
@@ -3911,47 +2965,8 @@
     <w:p>
       <w:pPr>
         <w:pStyle w:val="PargrafodaLista"/>
-        <w:ind w:left="1488"/>
-        <w:jc w:val="both"/>
-      </w:pPr>
-    </w:p>
-    <w:p>
-      <w:pPr>
-        <w:pStyle w:val="PargrafodaLista"/>
-        <w:ind w:left="1488"/>
-        <w:jc w:val="both"/>
-      </w:pPr>
-    </w:p>
-    <w:p>
-      <w:pPr>
-        <w:pStyle w:val="PargrafodaLista"/>
-        <w:ind w:left="1488"/>
-        <w:jc w:val="both"/>
-      </w:pPr>
-    </w:p>
-    <w:p>
-      <w:pPr>
-        <w:pStyle w:val="PargrafodaLista"/>
-        <w:ind w:left="1488"/>
-        <w:jc w:val="both"/>
-      </w:pPr>
-    </w:p>
-    <w:p>
-      <w:pPr>
-        <w:pStyle w:val="PargrafodaLista"/>
-        <w:ind w:left="1488"/>
-        <w:jc w:val="both"/>
-      </w:pPr>
-    </w:p>
-    <w:p>
-      <w:pPr>
-        <w:pStyle w:val="PargrafodaLista"/>
-        <w:ind w:left="1488"/>
-        <w:jc w:val="both"/>
-        <w:rPr>
-          <w:b/>
-          <w:bCs/>
-        </w:rPr>
+        <w:ind w:left="1776"/>
+        <w:jc w:val="both"/>
       </w:pPr>
     </w:p>
     <w:p>
@@ -3972,27 +2987,20 @@
           <w:sz w:val="18"/>
           <w:szCs w:val="18"/>
         </w:rPr>
-        <w:t xml:space="preserve"> </w:t>
+        <w:t xml:space="preserve"> 8</w:t>
       </w:r>
       <w:r>
         <w:rPr>
           <w:sz w:val="18"/>
           <w:szCs w:val="18"/>
         </w:rPr>
-        <w:t>8</w:t>
+        <w:t xml:space="preserve">: </w:t>
       </w:r>
       <w:r>
         <w:rPr>
           <w:sz w:val="18"/>
           <w:szCs w:val="18"/>
         </w:rPr>
-        <w:t xml:space="preserve">: </w:t>
-      </w:r>
-      <w:r>
-        <w:rPr>
-          <w:sz w:val="18"/>
-          <w:szCs w:val="18"/>
-        </w:rPr>
         <w:t>Resultados de treinamento</w:t>
       </w:r>
     </w:p>
@@ -4000,13 +3008,16 @@
       <w:pPr>
         <w:pStyle w:val="PargrafodaLista"/>
         <w:ind w:left="1488"/>
-        <w:jc w:val="both"/>
-      </w:pPr>
-      <w:r>
+        <w:jc w:val="center"/>
+      </w:pPr>
+      <w:r>
+        <w:rPr>
+          <w:noProof/>
+        </w:rPr>
         <w:drawing>
-          <wp:inline distT="0" distB="0" distL="0" distR="0" wp14:anchorId="56F6F10F" wp14:editId="4BD87613">
-            <wp:extent cx="4235778" cy="1363980"/>
-            <wp:effectExtent l="0" t="0" r="0" b="7620"/>
+          <wp:inline distT="0" distB="0" distL="0" distR="0" wp14:anchorId="56F6F10F" wp14:editId="3BC16A41">
+            <wp:extent cx="3562184" cy="1147073"/>
+            <wp:effectExtent l="0" t="0" r="635" b="0"/>
             <wp:docPr id="1289902230" name="Imagem 1"/>
             <wp:cNvGraphicFramePr>
               <a:graphicFrameLocks xmlns:a="http://schemas.openxmlformats.org/drawingml/2006/main" noChangeAspect="1"/>
@@ -4028,7 +3039,7 @@
                   <pic:spPr bwMode="auto">
                     <a:xfrm>
                       <a:off x="0" y="0"/>
-                      <a:ext cx="4243921" cy="1366602"/>
+                      <a:ext cx="3581653" cy="1153342"/>
                     </a:xfrm>
                     <a:prstGeom prst="rect">
                       <a:avLst/>
@@ -4052,20 +3063,6 @@
     <w:p>
       <w:pPr>
         <w:pStyle w:val="PargrafodaLista"/>
-        <w:ind w:left="0"/>
-        <w:jc w:val="both"/>
-      </w:pPr>
-    </w:p>
-    <w:p>
-      <w:pPr>
-        <w:pStyle w:val="PargrafodaLista"/>
-        <w:ind w:left="0"/>
-        <w:jc w:val="both"/>
-      </w:pPr>
-    </w:p>
-    <w:p>
-      <w:pPr>
-        <w:pStyle w:val="PargrafodaLista"/>
         <w:numPr>
           <w:ilvl w:val="0"/>
           <w:numId w:val="21"/>
@@ -4074,41 +3071,17 @@
         <w:jc w:val="both"/>
       </w:pPr>
       <w:r>
-        <w:t xml:space="preserve">O comportamento da função de perda, demonstra uma queda consistente tanto no treino quanto na validação. O </w:t>
-      </w:r>
-      <w:proofErr w:type="spellStart"/>
-      <w:r>
-        <w:t>loss</w:t>
-      </w:r>
-      <w:proofErr w:type="spellEnd"/>
-      <w:r>
-        <w:t xml:space="preserve"> de treino diminui progressivamente de aproximadamente 2.72 para 1.99 ao longo das cinco épocas</w:t>
+        <w:lastRenderedPageBreak/>
+        <w:t>O comportamento da função de perda, demonstra uma queda consistente tanto no treino quanto na validação. O loss de treino diminui progressivamente de aproximadamente 2.72 para 1.99 ao longo das cinco épocas</w:t>
       </w:r>
       <w:r>
         <w:t xml:space="preserve"> (Figura 8)</w:t>
       </w:r>
       <w:r>
-        <w:t xml:space="preserve">, enquanto o </w:t>
-      </w:r>
-      <w:proofErr w:type="spellStart"/>
-      <w:r>
-        <w:t>loss</w:t>
-      </w:r>
-      <w:proofErr w:type="spellEnd"/>
-      <w:r>
-        <w:t xml:space="preserve"> de validação segue uma trajetória semelhante, caindo de cerca de 2.62 para 1.93</w:t>
-      </w:r>
-      <w:r>
-        <w:t xml:space="preserve"> </w:t>
-      </w:r>
-      <w:r>
-        <w:t xml:space="preserve">(Figura </w:t>
-      </w:r>
-      <w:r>
-        <w:t>9</w:t>
-      </w:r>
-      <w:r>
-        <w:t>)</w:t>
+        <w:t>, enquanto o loss de validação segue uma trajetória semelhante, caindo de cerca de 2.62 para 1.93</w:t>
+      </w:r>
+      <w:r>
+        <w:t xml:space="preserve"> (Figura 9)</w:t>
       </w:r>
       <w:r>
         <w:t>. Essa proximidade entre as curvas é um sinal claro de que o modelo está aprendendo padrões reais dos dados.</w:t>
@@ -4134,44 +3107,17 @@
         <w:t>A acurácia de treino se mantém em torno de 43–44%</w:t>
       </w:r>
       <w:r>
-        <w:t xml:space="preserve"> </w:t>
-      </w:r>
-      <w:r>
-        <w:t>(Figura 8)</w:t>
+        <w:t xml:space="preserve"> (Figura 8)</w:t>
       </w:r>
       <w:r>
         <w:t>, enquanto a acurácia de validação alcança cerca de 45%</w:t>
       </w:r>
       <w:r>
-        <w:t xml:space="preserve"> </w:t>
-      </w:r>
-      <w:r>
-        <w:t xml:space="preserve">(Figura </w:t>
-      </w:r>
-      <w:r>
-        <w:t>9</w:t>
-      </w:r>
-      <w:r>
-        <w:t>)</w:t>
-      </w:r>
-      <w:r>
-        <w:t xml:space="preserve">. É perfeitamente esperado que a validação fique ligeiramente melhor do que o treino nesse estágio, especialmente porque o conjunto de treino passa por </w:t>
-      </w:r>
-      <w:proofErr w:type="spellStart"/>
-      <w:r>
-        <w:t>augmentations</w:t>
-      </w:r>
-      <w:proofErr w:type="spellEnd"/>
-      <w:r>
-        <w:t xml:space="preserve"> mais agressivas.</w:t>
-      </w:r>
-    </w:p>
-    <w:p>
-      <w:pPr>
-        <w:pStyle w:val="PargrafodaLista"/>
-        <w:ind w:left="0"/>
-        <w:jc w:val="both"/>
-      </w:pPr>
+        <w:t xml:space="preserve"> (Figura 9)</w:t>
+      </w:r>
+      <w:r>
+        <w:t>. É perfeitamente esperado que a validação fique ligeiramente melhor do que o treino nesse estágio, especialmente porque o conjunto de treino passa por augmentations mais agressivas.</w:t>
+      </w:r>
     </w:p>
     <w:p>
       <w:pPr>
@@ -4198,35 +3144,21 @@
           <w:sz w:val="18"/>
           <w:szCs w:val="18"/>
         </w:rPr>
-        <w:t xml:space="preserve"> </w:t>
+        <w:t xml:space="preserve"> 9</w:t>
       </w:r>
       <w:r>
         <w:rPr>
           <w:sz w:val="18"/>
           <w:szCs w:val="18"/>
         </w:rPr>
-        <w:t>9</w:t>
+        <w:t xml:space="preserve">: </w:t>
       </w:r>
       <w:r>
         <w:rPr>
           <w:sz w:val="18"/>
           <w:szCs w:val="18"/>
         </w:rPr>
-        <w:t xml:space="preserve">: </w:t>
-      </w:r>
-      <w:r>
-        <w:rPr>
-          <w:sz w:val="18"/>
-          <w:szCs w:val="18"/>
-        </w:rPr>
-        <w:t xml:space="preserve">Resultados de </w:t>
-      </w:r>
-      <w:r>
-        <w:rPr>
-          <w:sz w:val="18"/>
-          <w:szCs w:val="18"/>
-        </w:rPr>
-        <w:t>validação</w:t>
+        <w:t>Resultados de validação</w:t>
       </w:r>
     </w:p>
     <w:p>
@@ -4236,6 +3168,9 @@
         <w:jc w:val="center"/>
       </w:pPr>
       <w:r>
+        <w:rPr>
+          <w:noProof/>
+        </w:rPr>
         <w:drawing>
           <wp:inline distT="0" distB="0" distL="0" distR="0" wp14:anchorId="24C71CB4" wp14:editId="4A6839FB">
             <wp:extent cx="2972844" cy="1417320"/>
@@ -4311,32 +3246,10 @@
           <w:b/>
           <w:bCs/>
         </w:rPr>
-        <w:t>Conclusões</w:t>
-      </w:r>
-      <w:r>
-        <w:rPr>
-          <w:b/>
-          <w:bCs/>
-        </w:rPr>
-        <w:t xml:space="preserve">: </w:t>
-      </w:r>
-      <w:r>
-        <w:t xml:space="preserve">Em termos </w:t>
-      </w:r>
-      <w:r>
-        <w:t>gerais,</w:t>
-      </w:r>
-      <w:r>
-        <w:t xml:space="preserve"> este experimento demonstra que o modelo aprende, que a perda diminui, que treino e validação são coerentes entre si e que não há falhas estruturais no pipeline</w:t>
-      </w:r>
-      <w:r>
-        <w:t>. É possível</w:t>
-      </w:r>
-      <w:r>
-        <w:t xml:space="preserve"> seguir com segurança para experimentos mais longos</w:t>
-      </w:r>
-      <w:r>
-        <w:t>.</w:t>
+        <w:t xml:space="preserve">Conclusões: </w:t>
+      </w:r>
+      <w:r>
+        <w:t>Em termos gerais, este experimento demonstra que o modelo aprende, que a perda diminui, que treino e validação são coerentes entre si e que não há falhas estruturais no pipeline. É possível seguir com segurança para experimentos mais longos.</w:t>
       </w:r>
     </w:p>
     <w:p>
@@ -4372,29 +3285,8 @@
         <w:t xml:space="preserve">Observação: </w:t>
       </w:r>
       <w:r>
-        <w:t xml:space="preserve">A mesma correção ao </w:t>
-      </w:r>
-      <w:proofErr w:type="spellStart"/>
-      <w:r>
-        <w:t>loader</w:t>
-      </w:r>
-      <w:proofErr w:type="spellEnd"/>
-      <w:r>
-        <w:t xml:space="preserve"> da </w:t>
-      </w:r>
-      <w:proofErr w:type="spellStart"/>
-      <w:r>
-        <w:t>ResNet</w:t>
-      </w:r>
-      <w:proofErr w:type="spellEnd"/>
-      <w:r>
-        <w:t xml:space="preserve"> será analisada e aplicada à implementação da </w:t>
-      </w:r>
-      <w:proofErr w:type="spellStart"/>
-      <w:r>
-        <w:t>ViT.</w:t>
-      </w:r>
-      <w:proofErr w:type="spellEnd"/>
+        <w:t>A mesma correção ao loader da ResNet será analisada e aplicada à implementação da ViT.</w:t>
+      </w:r>
     </w:p>
     <w:sectPr>
       <w:pgSz w:w="11906" w:h="16838"/>
@@ -7570,6 +6462,7 @@
   <w:style w:type="character" w:default="1" w:styleId="Fontepargpadro">
     <w:name w:val="Default Paragraph Font"/>
     <w:uiPriority w:val="1"/>
+    <w:semiHidden/>
     <w:unhideWhenUsed/>
   </w:style>
   <w:style w:type="table" w:default="1" w:styleId="Tabelanormal">

</xml_diff>

<commit_message>
Atualizações da documentação e correção de bugs
</commit_message>
<xml_diff>
--- a/Documentation/Experimentos com ResNet-50.docx
+++ b/Documentation/Experimentos com ResNet-50.docx
@@ -644,7 +644,7 @@
           <w:iCs/>
           <w:color w:val="000000" w:themeColor="text1"/>
         </w:rPr>
-        <w:t>localizados em "\Projeto-Classificadores\Documentation\</w:t>
+        <w:t>localizados em "</w:t>
       </w:r>
       <w:r>
         <w:rPr>
@@ -652,7 +652,7 @@
           <w:iCs/>
           <w:color w:val="000000" w:themeColor="text1"/>
         </w:rPr>
-        <w:t>Pycharm LOGS\</w:t>
+        <w:t>\Projetos do Mestrado (Git)\Projeto-Classificadores\Main_Validation\ResNet-50\Results\Experimento 1 - ResNet\</w:t>
       </w:r>
       <w:r>
         <w:rPr>
@@ -660,7 +660,7 @@
           <w:iCs/>
           <w:color w:val="000000" w:themeColor="text1"/>
         </w:rPr>
-        <w:t>Validation ResNet Sanity Check - LOG</w:t>
+        <w:t>Experimento 1 -RN- Sanity Check - LOG</w:t>
       </w:r>
       <w:r>
         <w:rPr>
@@ -668,7 +668,7 @@
           <w:iCs/>
           <w:color w:val="000000" w:themeColor="text1"/>
         </w:rPr>
-        <w:t>.txt"</w:t>
+        <w:t>"</w:t>
       </w:r>
     </w:p>
     <w:p>
@@ -1723,7 +1723,6 @@
       <w:pPr>
         <w:pStyle w:val="PargrafodaLista"/>
         <w:ind w:left="1440"/>
-        <w:jc w:val="both"/>
         <w:rPr>
           <w:i/>
           <w:iCs/>
@@ -1782,7 +1781,7 @@
           <w:iCs/>
           <w:color w:val="000000" w:themeColor="text1"/>
         </w:rPr>
-        <w:t>localizados em "\Projeto-Classificadores\Documentation\</w:t>
+        <w:t xml:space="preserve">localizados em </w:t>
       </w:r>
       <w:r>
         <w:rPr>
@@ -1790,7 +1789,7 @@
           <w:iCs/>
           <w:color w:val="000000" w:themeColor="text1"/>
         </w:rPr>
-        <w:t>Pycharm LOGS\</w:t>
+        <w:t>"\Projeto-Classificadores\Main_Project\ResNet50\Results\Experimento 2 - ResNet\Experimento 2</w:t>
       </w:r>
       <w:r>
         <w:rPr>
@@ -1798,7 +1797,7 @@
           <w:iCs/>
           <w:color w:val="000000" w:themeColor="text1"/>
         </w:rPr>
-        <w:t>Main</w:t>
+        <w:t xml:space="preserve"> -</w:t>
       </w:r>
       <w:r>
         <w:rPr>
@@ -1806,7 +1805,7 @@
           <w:iCs/>
           <w:color w:val="000000" w:themeColor="text1"/>
         </w:rPr>
-        <w:t xml:space="preserve"> ResNet Sanity Check - LOG</w:t>
+        <w:t>RN-</w:t>
       </w:r>
       <w:r>
         <w:rPr>
@@ -1814,7 +1813,7 @@
           <w:iCs/>
           <w:color w:val="000000" w:themeColor="text1"/>
         </w:rPr>
-        <w:t>.txt"</w:t>
+        <w:t xml:space="preserve"> Sanity Check - LOG.txt"</w:t>
       </w:r>
     </w:p>
     <w:p>
@@ -2407,28 +2406,35 @@
           <w:b/>
           <w:bCs/>
         </w:rPr>
-        <w:t xml:space="preserve">CORREÇÃO DO </w:t>
-      </w:r>
-      <w:r>
-        <w:rPr>
-          <w:b/>
-          <w:bCs/>
-        </w:rPr>
-        <w:t>EX</w:t>
-      </w:r>
-      <w:r>
-        <w:rPr>
-          <w:b/>
-          <w:bCs/>
-        </w:rPr>
-        <w:t xml:space="preserve">PERIMENTO </w:t>
-      </w:r>
-      <w:r>
-        <w:rPr>
-          <w:b/>
-          <w:bCs/>
-        </w:rPr>
-        <w:t>II – ANÁLISE DOS RÓTULOS DE VALIDAÇÃO:</w:t>
+        <w:t>EXPERIMENTO 3 – Correção do Experimento</w:t>
+      </w:r>
+      <w:r>
+        <w:rPr>
+          <w:b/>
+          <w:bCs/>
+        </w:rPr>
+        <w:t xml:space="preserve"> </w:t>
+      </w:r>
+      <w:r>
+        <w:rPr>
+          <w:b/>
+          <w:bCs/>
+        </w:rPr>
+        <w:t xml:space="preserve">II </w:t>
+      </w:r>
+      <w:r>
+        <w:rPr>
+          <w:b/>
+          <w:bCs/>
+        </w:rPr>
+        <w:t>(Análise dos rótulos de validação)</w:t>
+      </w:r>
+      <w:r>
+        <w:rPr>
+          <w:b/>
+          <w:bCs/>
+        </w:rPr>
+        <w:t>:</w:t>
       </w:r>
     </w:p>
     <w:p>
@@ -2829,7 +2835,6 @@
           <w:ilvl w:val="0"/>
           <w:numId w:val="20"/>
         </w:numPr>
-        <w:jc w:val="both"/>
       </w:pPr>
       <w:r>
         <w:rPr>
@@ -2876,7 +2881,7 @@
           <w:iCs/>
           <w:color w:val="000000" w:themeColor="text1"/>
         </w:rPr>
-        <w:t>localizados em "\Projeto-Classificadores\Documentation\</w:t>
+        <w:t xml:space="preserve">localizados em </w:t>
       </w:r>
       <w:r>
         <w:rPr>
@@ -2884,7 +2889,7 @@
           <w:iCs/>
           <w:color w:val="000000" w:themeColor="text1"/>
         </w:rPr>
-        <w:t>Pycharm LOGS\Main</w:t>
+        <w:t>"\Projeto-Classificadores\Main_Project\ResNet50\Results\Experimento 3 - ResNet\Experimento 3</w:t>
       </w:r>
       <w:r>
         <w:rPr>
@@ -2892,7 +2897,7 @@
           <w:iCs/>
           <w:color w:val="000000" w:themeColor="text1"/>
         </w:rPr>
-        <w:t xml:space="preserve"> ResNet Sanity Check</w:t>
+        <w:t xml:space="preserve"> </w:t>
       </w:r>
       <w:r>
         <w:rPr>
@@ -2900,7 +2905,7 @@
           <w:iCs/>
           <w:color w:val="000000" w:themeColor="text1"/>
         </w:rPr>
-        <w:t xml:space="preserve"> 2</w:t>
+        <w:t>-</w:t>
       </w:r>
       <w:r>
         <w:rPr>
@@ -2908,7 +2913,7 @@
           <w:iCs/>
           <w:color w:val="000000" w:themeColor="text1"/>
         </w:rPr>
-        <w:t xml:space="preserve"> - LOG</w:t>
+        <w:t>RN-</w:t>
       </w:r>
       <w:r>
         <w:rPr>
@@ -2916,7 +2921,15 @@
           <w:iCs/>
           <w:color w:val="000000" w:themeColor="text1"/>
         </w:rPr>
-        <w:t>.txt"</w:t>
+        <w:t xml:space="preserve"> </w:t>
+      </w:r>
+      <w:r>
+        <w:rPr>
+          <w:i/>
+          <w:iCs/>
+          <w:color w:val="000000" w:themeColor="text1"/>
+        </w:rPr>
+        <w:t>Sanity Check - LOG.txt"</w:t>
       </w:r>
     </w:p>
     <w:p>

</xml_diff>